<commit_message>
updated with other parameter during tuning
</commit_message>
<xml_diff>
--- a/g25ait1136_report.docx
+++ b/g25ait1136_report.docx
@@ -25,23 +25,7 @@
           <w:i/>
           <w:sz w:val="20"/>
         </w:rPr>
-        <w:t>Submission ID: g25ait</w:t>
-      </w:r>
-      <w:proofErr w:type="gramStart"/>
-      <w:r>
-        <w:rPr>
-          <w:i/>
-          <w:sz w:val="20"/>
-        </w:rPr>
-        <w:t>1136  |</w:t>
-      </w:r>
-      <w:proofErr w:type="gramEnd"/>
-      <w:r>
-        <w:rPr>
-          <w:i/>
-          <w:sz w:val="20"/>
-        </w:rPr>
-        <w:t xml:space="preserve">  Language pair: Sanskrit (san_Deva) -&gt; English (eng_Latn)</w:t>
+        <w:t>Submission ID: g25ait1136  |  Language pair: Sanskrit (san_Deva) -&gt; English (eng_Latn)</w:t>
       </w:r>
     </w:p>
     <w:p>
@@ -58,80 +42,19 @@
         </w:rPr>
         <w:t xml:space="preserve">Artifacts: g25ait1136.ipynb (code), </w:t>
       </w:r>
-      <w:proofErr w:type="spellStart"/>
       <w:r>
         <w:rPr>
           <w:i/>
           <w:sz w:val="20"/>
         </w:rPr>
-        <w:t>sanskrit_nmt_</w:t>
+        <w:t>sanskrit_nmt_assignment.ipynb</w:t>
       </w:r>
-      <w:proofErr w:type="gramStart"/>
       <w:r>
         <w:rPr>
           <w:i/>
           <w:sz w:val="20"/>
         </w:rPr>
-        <w:t>assignment.ipynb</w:t>
-      </w:r>
-      <w:proofErr w:type="spellEnd"/>
-      <w:proofErr w:type="gramEnd"/>
-      <w:r>
-        <w:rPr>
-          <w:i/>
-          <w:sz w:val="20"/>
-        </w:rPr>
-        <w:t xml:space="preserve"> (experiment – custom implementation), submission.csv, </w:t>
-      </w:r>
-      <w:proofErr w:type="spellStart"/>
-      <w:proofErr w:type="gramStart"/>
-      <w:r>
-        <w:rPr>
-          <w:i/>
-          <w:sz w:val="20"/>
-        </w:rPr>
-        <w:t>metric.json</w:t>
-      </w:r>
-      <w:proofErr w:type="spellEnd"/>
-      <w:proofErr w:type="gramEnd"/>
-      <w:r>
-        <w:rPr>
-          <w:i/>
-          <w:sz w:val="20"/>
-        </w:rPr>
-        <w:t xml:space="preserve"> (result), dev/test/</w:t>
-      </w:r>
-      <w:proofErr w:type="spellStart"/>
-      <w:r>
-        <w:rPr>
-          <w:i/>
-          <w:sz w:val="20"/>
-        </w:rPr>
-        <w:t>train_embeddings.npz</w:t>
-      </w:r>
-      <w:proofErr w:type="spellEnd"/>
-      <w:r>
-        <w:rPr>
-          <w:i/>
-          <w:sz w:val="20"/>
-        </w:rPr>
-        <w:t xml:space="preserve"> (embedding exports), </w:t>
-      </w:r>
-      <w:proofErr w:type="spellStart"/>
-      <w:r>
-        <w:rPr>
-          <w:i/>
-          <w:sz w:val="20"/>
-        </w:rPr>
-        <w:t>Github</w:t>
-      </w:r>
-      <w:proofErr w:type="spellEnd"/>
-      <w:r>
-        <w:rPr>
-          <w:i/>
-          <w:sz w:val="20"/>
-        </w:rPr>
-        <w:t xml:space="preserve"> Link: </w:t>
+        <w:t xml:space="preserve"> (experiment – custom implementation), submission.csv, metric.json (result), dev/test/train_embeddings.npz (embedding exports), Github Link: </w:t>
       </w:r>
       <w:hyperlink r:id="rId6" w:history="1">
         <w:r>
@@ -167,21 +90,19 @@
         <w:rPr>
           <w:sz w:val="20"/>
         </w:rPr>
-        <w:t>This report documents two complementary neural machine translation (NMT) systems built for the Sanskrit-to-English translation assignment: (1) the original submission (g25ait1136.ipynb), which uses a pretrained multilingual sequence-to-sequence transformer for zero-shot translation and evaluation, and (2) an experimental run (</w:t>
+        <w:t>This report presents two parallel neural machine translation (NMT) systems designed for the task of translating from Sanskrit into English: (1) the original submission (g25ait1136.ipynb)</w:t>
       </w:r>
-      <w:proofErr w:type="spellStart"/>
       <w:r>
         <w:rPr>
           <w:sz w:val="20"/>
         </w:rPr>
-        <w:t>sanskrit_nmt_assignment.ipynb</w:t>
+        <w:t>,</w:t>
       </w:r>
-      <w:proofErr w:type="spellEnd"/>
       <w:r>
         <w:rPr>
           <w:sz w:val="20"/>
         </w:rPr>
-        <w:t>) that implements a custom encoder-decoder architecture with additive attention, trained from scratch on the provided parallel corpus.</w:t>
+        <w:t xml:space="preserve"> which takes advantage of a pre-trained multilingual sequence-to-sequence transformer model for zero-shot translation and evaluation, and (2) an experimental run (sanskrit_nmt_assignment.ipynb) that uses a custom encoder-decoder-based architecture with additive attention trained from scratch on the provided parallel corpus.</w:t>
       </w:r>
     </w:p>
     <w:p>
@@ -189,7 +110,7 @@
         <w:rPr>
           <w:sz w:val="20"/>
         </w:rPr>
-        <w:t>The dataset consists of 10,000 training, 1,000 dev, and 1,000 test Sanskrit-English sentence pairs. Both systems are evaluated on BLEU, BERTScore F1, and inference efficiency, with the goal of comparing a large pretrained multilingual model against a lightweight custom-trained baseline.</w:t>
+        <w:t>It has 10,000 sentence pairs for training, 1,000 sentence pairs for dev and 1,000 sentence pairs for test data, namely Sanskrit-English sentences. In both systems, they are assessed using the BLEU, BERTScore F1 and inference efficiency metrics with the aim of comparing a large pretrained multilingual model with a lightweight custom-trained baseline.</w:t>
       </w:r>
     </w:p>
     <w:p>
@@ -208,7 +129,13 @@
         <w:rPr>
           <w:sz w:val="20"/>
         </w:rPr>
-        <w:t>Two distinct architectures were used across the two notebooks, described below.</w:t>
+        <w:t xml:space="preserve">Two different architectures were used in the two notebooks, as </w:t>
+      </w:r>
+      <w:r>
+        <w:rPr>
+          <w:sz w:val="20"/>
+        </w:rPr>
+        <w:t>outlined here.</w:t>
       </w:r>
     </w:p>
     <w:p>
@@ -227,7 +154,7 @@
         <w:rPr>
           <w:sz w:val="20"/>
         </w:rPr>
-        <w:t xml:space="preserve">The </w:t>
+        <w:t>The</w:t>
       </w:r>
       <w:r>
         <w:rPr>
@@ -235,7 +162,7 @@
           <w:bCs/>
           <w:sz w:val="20"/>
         </w:rPr>
-        <w:t>original submission</w:t>
+        <w:t xml:space="preserve"> original submission</w:t>
       </w:r>
       <w:r>
         <w:rPr>
@@ -255,7 +182,7 @@
         <w:rPr>
           <w:sz w:val="20"/>
         </w:rPr>
-        <w:t xml:space="preserve">, a distilled multilingual encoder-decoder transformer with roughly 615 million parameters and a 1024-dimensional hidden/embedding size, loaded via </w:t>
+        <w:t xml:space="preserve">, which is a distilled multilingual encoder-decoder transformer with a hidden/embedding size of 1024 dimensions and a total of about 615 million parameters, loaded using </w:t>
       </w:r>
       <w:r>
         <w:rPr>
@@ -263,13 +190,61 @@
           <w:bCs/>
           <w:sz w:val="20"/>
         </w:rPr>
-        <w:t>Hugging Face AutoModelForSeq2SeqLM</w:t>
+        <w:t>AutoModelForSeq2SeqLM from Hugging Face</w:t>
       </w:r>
       <w:r>
         <w:rPr>
           <w:sz w:val="20"/>
         </w:rPr>
-        <w:t>. Sanskrit input is tagged with the source-language token san_Deva and generation is forced to begin with the eng_Latn target-language token via forced_bos_token_id.</w:t>
+        <w:t xml:space="preserve">. The Sanskrit input is marked with </w:t>
+      </w:r>
+      <w:r>
+        <w:rPr>
+          <w:sz w:val="20"/>
+        </w:rPr>
+        <w:t>‘</w:t>
+      </w:r>
+      <w:r>
+        <w:rPr>
+          <w:sz w:val="20"/>
+        </w:rPr>
+        <w:t>san_Deva</w:t>
+      </w:r>
+      <w:r>
+        <w:rPr>
+          <w:sz w:val="20"/>
+        </w:rPr>
+        <w:t>’</w:t>
+      </w:r>
+      <w:r>
+        <w:rPr>
+          <w:sz w:val="20"/>
+        </w:rPr>
+        <w:t xml:space="preserve">, and the input must start with a token from the target language </w:t>
+      </w:r>
+      <w:r>
+        <w:rPr>
+          <w:sz w:val="20"/>
+        </w:rPr>
+        <w:t>‘</w:t>
+      </w:r>
+      <w:r>
+        <w:rPr>
+          <w:sz w:val="20"/>
+        </w:rPr>
+        <w:t>eng_Latn</w:t>
+      </w:r>
+      <w:r>
+        <w:rPr>
+          <w:sz w:val="20"/>
+        </w:rPr>
+        <w:t>’</w:t>
+      </w:r>
+      <w:r>
+        <w:rPr>
+          <w:sz w:val="20"/>
+        </w:rPr>
+        <w:t xml:space="preserve"> via forced_bos_token_id for generating.</w:t>
       </w:r>
     </w:p>
     <w:p>
@@ -283,29 +258,7 @@
         <w:rPr>
           <w:color w:val="000000"/>
         </w:rPr>
-        <w:t>2.2 Custom Encoder-Decoder (</w:t>
-      </w:r>
-      <w:proofErr w:type="spellStart"/>
-      <w:r>
-        <w:rPr>
-          <w:color w:val="000000"/>
-        </w:rPr>
-        <w:t>sanskrit_nmt_</w:t>
-      </w:r>
-      <w:proofErr w:type="gramStart"/>
-      <w:r>
-        <w:rPr>
-          <w:color w:val="000000"/>
-        </w:rPr>
-        <w:t>assignment.ipynb</w:t>
-      </w:r>
-      <w:proofErr w:type="spellEnd"/>
-      <w:proofErr w:type="gramEnd"/>
-      <w:r>
-        <w:rPr>
-          <w:color w:val="000000"/>
-        </w:rPr>
-        <w:t>)</w:t>
+        <w:t>2.2 Custom Encoder-Decoder (sanskrit_nmt_assignment.ipynb)</w:t>
       </w:r>
     </w:p>
     <w:p>
@@ -320,7 +273,13 @@
         <w:t>experimental submission</w:t>
       </w:r>
       <w:r>
-        <w:t xml:space="preserve"> uses:</w:t>
+        <w:t xml:space="preserve"> </w:t>
+      </w:r>
+      <w:r>
+        <w:t>makes use of</w:t>
+      </w:r>
+      <w:r>
+        <w:t>:</w:t>
       </w:r>
     </w:p>
     <w:p>
@@ -393,19 +352,25 @@
         <w:rPr>
           <w:sz w:val="20"/>
         </w:rPr>
-        <w:t xml:space="preserve">: A unidirectional GRU with </w:t>
+        <w:t xml:space="preserve">: </w:t>
       </w:r>
       <w:r>
         <w:rPr>
           <w:sz w:val="20"/>
         </w:rPr>
-        <w:t xml:space="preserve">a </w:t>
+        <w:t>A unidirectional GRU layer with a context vector, followed by a linear output layer (fc_out)</w:t>
       </w:r>
       <w:r>
         <w:rPr>
           <w:sz w:val="20"/>
         </w:rPr>
-        <w:t>context vector followed by a linear output layer (fc_out) that combines the decoder output, context vector, and input embedding to predict the next token distribution.</w:t>
+        <w:t>,</w:t>
+      </w:r>
+      <w:r>
+        <w:rPr>
+          <w:sz w:val="20"/>
+        </w:rPr>
+        <w:t xml:space="preserve"> which takes the decoder output, context vector, and input embedding as inputs to produce the next token distribution.</w:t>
       </w:r>
     </w:p>
     <w:p>
@@ -427,36 +392,34 @@
         <w:rPr>
           <w:sz w:val="20"/>
         </w:rPr>
-        <w:t xml:space="preserve">At each decoder step, an attention layer compares the hidden state with the encoder output via a feed-forward layer, followed by a </w:t>
-      </w:r>
-      <w:proofErr w:type="spellStart"/>
-      <w:r>
-        <w:rPr>
-          <w:sz w:val="20"/>
-        </w:rPr>
-        <w:t>tanh</w:t>
-      </w:r>
-      <w:proofErr w:type="spellEnd"/>
-      <w:r>
-        <w:rPr>
-          <w:sz w:val="20"/>
-        </w:rPr>
-        <w:t xml:space="preserve"> activation </w:t>
+        <w:t>At every decoder step, an attention layer is used to compare the hidden state to the encoder output through a feed-forward layer</w:t>
       </w:r>
       <w:r>
         <w:rPr>
           <w:sz w:val="20"/>
         </w:rPr>
-        <w:t>and a scalar scoring vector v.</w:t>
+        <w:t>,</w:t>
+      </w:r>
+      <w:r>
+        <w:rPr>
+          <w:sz w:val="20"/>
+        </w:rPr>
+        <w:t xml:space="preserve"> which is followed by a tanh activation and a scalar scoring vector v.</w:t>
       </w:r>
     </w:p>
     <w:p>
+      <w:pPr>
+        <w:rPr>
+          <w:sz w:val="20"/>
+        </w:rPr>
+      </w:pPr>
       <w:r>
         <w:rPr>
           <w:b/>
           <w:bCs/>
           <w:sz w:val="20"/>
         </w:rPr>
+        <w:lastRenderedPageBreak/>
         <w:t>Beam search:</w:t>
       </w:r>
       <w:r>
@@ -469,36 +432,22 @@
         <w:rPr>
           <w:sz w:val="20"/>
         </w:rPr>
-        <w:t>U</w:t>
+        <w:t>Instead of beam search, it performs greedy decoding (argmax at each step), because greedy_decode() selects the max probability token at each step. The pretrained NLLB model</w:t>
       </w:r>
       <w:r>
         <w:rPr>
           <w:sz w:val="20"/>
         </w:rPr>
-        <w:t>ses greedy decoding (argmax at each step) rather than beam search, since greedy_</w:t>
-      </w:r>
-      <w:proofErr w:type="gramStart"/>
-      <w:r>
-        <w:rPr>
-          <w:sz w:val="20"/>
-        </w:rPr>
-        <w:t>decode(</w:t>
-      </w:r>
-      <w:proofErr w:type="gramEnd"/>
-      <w:r>
-        <w:rPr>
-          <w:sz w:val="20"/>
-        </w:rPr>
-        <w:t xml:space="preserve">) always selects the highest-probability token per step. The pretrained NLLB model, in </w:t>
+        <w:t>, on the other hand, is implemented with beam search (num_beams=5) and early_stopping=True,</w:t>
       </w:r>
       <w:r>
         <w:rPr>
           <w:sz w:val="20"/>
         </w:rPr>
-        <w:lastRenderedPageBreak/>
-        <w:t>contrast, uses beam search with num_beams=5 and early_stopping=True, and forces the output language token at the first decoding step.</w:t>
+        <w:t xml:space="preserve"> and forces the output language token at the first decoding step.</w:t>
       </w:r>
     </w:p>
+    <w:p/>
     <w:p>
       <w:pPr>
         <w:pStyle w:val="Heading1"/>
@@ -522,23 +471,102 @@
       </w:r>
     </w:p>
     <w:p>
+      <w:pPr>
+        <w:rPr>
+          <w:sz w:val="20"/>
+        </w:rPr>
+      </w:pPr>
       <w:r>
         <w:rPr>
           <w:sz w:val="20"/>
         </w:rPr>
-        <w:t xml:space="preserve">Sanskrit and English sentences are loaded from paired CSV files </w:t>
+        <w:t xml:space="preserve">Given a pair of </w:t>
       </w:r>
       <w:r>
         <w:rPr>
           <w:sz w:val="20"/>
         </w:rPr>
-        <w:t>in given dataset</w:t>
+        <w:t>CSV files containing Sanskrit and English sentences</w:t>
       </w:r>
       <w:r>
         <w:rPr>
           <w:sz w:val="20"/>
         </w:rPr>
-        <w:t xml:space="preserve"> and merged on Source_id. Text is normalized by stripping whitespace and collapsing repeated spaces via regex. For the custom model, Sanskrit is tokenized by naive whitespace splitting, while English is lowercased, punctuation-spaced, and whitespace-tokenized. For the pretrained model, no manual tokenization is performed; raw normalized strings are passed directly to the NLLB tokenizer.</w:t>
+        <w:t xml:space="preserve">, these sentences are loaded and joined on Source_id. Normalizing text by removing whitespace and consolidating multiple whitespaces with regex. Naive whitespace splitting is used for Sanskrit, and lowercasing, punctuation spacing, and whitespace splitting are used for English for the custom model. </w:t>
+      </w:r>
+      <w:r>
+        <w:rPr>
+          <w:sz w:val="20"/>
+        </w:rPr>
+        <w:t>Given below is the Train Loss and BLUE Vs BERTScore plot for custom model development.</w:t>
+      </w:r>
+    </w:p>
+    <w:p>
+      <w:pPr>
+        <w:jc w:val="center"/>
+        <w:rPr>
+          <w:sz w:val="20"/>
+        </w:rPr>
+      </w:pPr>
+      <w:r>
+        <w:rPr>
+          <w:sz w:val="20"/>
+        </w:rPr>
+        <w:drawing>
+          <wp:inline distT="0" distB="0" distL="0" distR="0" wp14:anchorId="1240EC1E" wp14:editId="2008620D">
+            <wp:extent cx="4417255" cy="1740317"/>
+            <wp:effectExtent l="0" t="0" r="2540" b="0"/>
+            <wp:docPr id="1686576090" name="Picture 1"/>
+            <wp:cNvGraphicFramePr>
+              <a:graphicFrameLocks xmlns:a="http://schemas.openxmlformats.org/drawingml/2006/main" noChangeAspect="1"/>
+            </wp:cNvGraphicFramePr>
+            <a:graphic xmlns:a="http://schemas.openxmlformats.org/drawingml/2006/main">
+              <a:graphicData uri="http://schemas.openxmlformats.org/drawingml/2006/picture">
+                <pic:pic xmlns:pic="http://schemas.openxmlformats.org/drawingml/2006/picture">
+                  <pic:nvPicPr>
+                    <pic:cNvPr id="1686576090" name=""/>
+                    <pic:cNvPicPr/>
+                  </pic:nvPicPr>
+                  <pic:blipFill>
+                    <a:blip r:embed="rId7"/>
+                    <a:stretch>
+                      <a:fillRect/>
+                    </a:stretch>
+                  </pic:blipFill>
+                  <pic:spPr>
+                    <a:xfrm>
+                      <a:off x="0" y="0"/>
+                      <a:ext cx="4417255" cy="1740317"/>
+                    </a:xfrm>
+                    <a:prstGeom prst="rect">
+                      <a:avLst/>
+                    </a:prstGeom>
+                  </pic:spPr>
+                </pic:pic>
+              </a:graphicData>
+            </a:graphic>
+          </wp:inline>
+        </w:drawing>
+      </w:r>
+    </w:p>
+    <w:p>
+      <w:r>
+        <w:rPr>
+          <w:sz w:val="20"/>
+        </w:rPr>
+        <w:t xml:space="preserve">If using a pretrained model, there is no tokenization performed by the </w:t>
+      </w:r>
+      <w:r>
+        <w:rPr>
+          <w:sz w:val="20"/>
+        </w:rPr>
+        <w:t>code</w:t>
+      </w:r>
+      <w:r>
+        <w:rPr>
+          <w:sz w:val="20"/>
+        </w:rPr>
+        <w:t xml:space="preserve"> and only the string of normalized raw text is passed to the NLLB tokenizer.</w:t>
       </w:r>
     </w:p>
     <w:p>
@@ -557,35 +585,7 @@
         <w:rPr>
           <w:sz w:val="20"/>
         </w:rPr>
-        <w:t xml:space="preserve">The </w:t>
-      </w:r>
-      <w:r>
-        <w:rPr>
-          <w:b/>
-          <w:bCs/>
-          <w:sz w:val="20"/>
-        </w:rPr>
-        <w:t>custom model</w:t>
-      </w:r>
-      <w:r>
-        <w:rPr>
-          <w:sz w:val="20"/>
-        </w:rPr>
-        <w:t xml:space="preserve"> builds two independent word-level vocabularies from the training set only, using a minimum frequency threshold of 1, with special tokens &lt;pad&gt;, &lt;bos&gt;, &lt;eos&gt;, &lt;unk&gt;. This produced 33,278 Sanskrit tokens and 10,743 English tokens. The </w:t>
-      </w:r>
-      <w:r>
-        <w:rPr>
-          <w:b/>
-          <w:bCs/>
-          <w:sz w:val="20"/>
-        </w:rPr>
-        <w:t>pretrained model</w:t>
-      </w:r>
-      <w:r>
-        <w:rPr>
-          <w:sz w:val="20"/>
-        </w:rPr>
-        <w:t xml:space="preserve"> instead uses NLLB's built-in SentencePiece subword tokenizer (AutoTokenizer.from_pretrained), shared across 200 languages, with src_lang set to san_Deva.</w:t>
+        <w:t>The custom model creates two separate word-level vocabularies from the training set, with a minimum frequency threshold of 1, and with special tokens, &lt;bos&gt;, &lt;eos&gt;. This yielded 33278 Sanskrit tokens and 10743 English tokens. The pretrained model uses NLLB's built-in SentencePiece subword tokenizer (AutoTokenizer.from_pretrained), which supports 200 languages, with src_lang= san_Deva.</w:t>
       </w:r>
     </w:p>
     <w:p>
@@ -617,7 +617,7 @@
         <w:tc>
           <w:tcPr>
             <w:cnfStyle w:val="001000000000" w:firstRow="0" w:lastRow="0" w:firstColumn="1" w:lastColumn="0" w:oddVBand="0" w:evenVBand="0" w:oddHBand="0" w:evenHBand="0" w:firstRowFirstColumn="0" w:firstRowLastColumn="0" w:lastRowFirstColumn="0" w:lastRowLastColumn="0"/>
-            <w:tcW w:w="2880" w:type="dxa"/>
+            <w:tcW w:w="2874" w:type="dxa"/>
           </w:tcPr>
           <w:p>
             <w:r>
@@ -630,7 +630,7 @@
         </w:tc>
         <w:tc>
           <w:tcPr>
-            <w:tcW w:w="2880" w:type="dxa"/>
+            <w:tcW w:w="2873" w:type="dxa"/>
           </w:tcPr>
           <w:p>
             <w:pPr>
@@ -646,7 +646,7 @@
         </w:tc>
         <w:tc>
           <w:tcPr>
-            <w:tcW w:w="2880" w:type="dxa"/>
+            <w:tcW w:w="2873" w:type="dxa"/>
           </w:tcPr>
           <w:p>
             <w:pPr>
@@ -668,7 +668,7 @@
         <w:tc>
           <w:tcPr>
             <w:cnfStyle w:val="001000000000" w:firstRow="0" w:lastRow="0" w:firstColumn="1" w:lastColumn="0" w:oddVBand="0" w:evenVBand="0" w:oddHBand="0" w:evenHBand="0" w:firstRowFirstColumn="0" w:firstRowLastColumn="0" w:lastRowFirstColumn="0" w:lastRowLastColumn="0"/>
-            <w:tcW w:w="2880" w:type="dxa"/>
+            <w:tcW w:w="2874" w:type="dxa"/>
           </w:tcPr>
           <w:p>
             <w:r>
@@ -681,7 +681,7 @@
         </w:tc>
         <w:tc>
           <w:tcPr>
-            <w:tcW w:w="2880" w:type="dxa"/>
+            <w:tcW w:w="2873" w:type="dxa"/>
           </w:tcPr>
           <w:p>
             <w:pPr>
@@ -697,7 +697,7 @@
         </w:tc>
         <w:tc>
           <w:tcPr>
-            <w:tcW w:w="2880" w:type="dxa"/>
+            <w:tcW w:w="2873" w:type="dxa"/>
           </w:tcPr>
           <w:p>
             <w:pPr>
@@ -719,7 +719,7 @@
         <w:tc>
           <w:tcPr>
             <w:cnfStyle w:val="001000000000" w:firstRow="0" w:lastRow="0" w:firstColumn="1" w:lastColumn="0" w:oddVBand="0" w:evenVBand="0" w:oddHBand="0" w:evenHBand="0" w:firstRowFirstColumn="0" w:firstRowLastColumn="0" w:lastRowFirstColumn="0" w:lastRowLastColumn="0"/>
-            <w:tcW w:w="2880" w:type="dxa"/>
+            <w:tcW w:w="2874" w:type="dxa"/>
           </w:tcPr>
           <w:p>
             <w:r>
@@ -732,7 +732,7 @@
         </w:tc>
         <w:tc>
           <w:tcPr>
-            <w:tcW w:w="2880" w:type="dxa"/>
+            <w:tcW w:w="2873" w:type="dxa"/>
           </w:tcPr>
           <w:p>
             <w:pPr>
@@ -748,7 +748,7 @@
         </w:tc>
         <w:tc>
           <w:tcPr>
-            <w:tcW w:w="2880" w:type="dxa"/>
+            <w:tcW w:w="2873" w:type="dxa"/>
           </w:tcPr>
           <w:p>
             <w:pPr>
@@ -770,7 +770,7 @@
         <w:tc>
           <w:tcPr>
             <w:cnfStyle w:val="001000000000" w:firstRow="0" w:lastRow="0" w:firstColumn="1" w:lastColumn="0" w:oddVBand="0" w:evenVBand="0" w:oddHBand="0" w:evenHBand="0" w:firstRowFirstColumn="0" w:firstRowLastColumn="0" w:lastRowFirstColumn="0" w:lastRowLastColumn="0"/>
-            <w:tcW w:w="2880" w:type="dxa"/>
+            <w:tcW w:w="2874" w:type="dxa"/>
           </w:tcPr>
           <w:p>
             <w:r>
@@ -783,7 +783,7 @@
         </w:tc>
         <w:tc>
           <w:tcPr>
-            <w:tcW w:w="2880" w:type="dxa"/>
+            <w:tcW w:w="2873" w:type="dxa"/>
           </w:tcPr>
           <w:p>
             <w:pPr>
@@ -799,7 +799,7 @@
         </w:tc>
         <w:tc>
           <w:tcPr>
-            <w:tcW w:w="2880" w:type="dxa"/>
+            <w:tcW w:w="2873" w:type="dxa"/>
           </w:tcPr>
           <w:p>
             <w:pPr>
@@ -821,7 +821,7 @@
         <w:tc>
           <w:tcPr>
             <w:cnfStyle w:val="001000000000" w:firstRow="0" w:lastRow="0" w:firstColumn="1" w:lastColumn="0" w:oddVBand="0" w:evenVBand="0" w:oddHBand="0" w:evenHBand="0" w:firstRowFirstColumn="0" w:firstRowLastColumn="0" w:lastRowFirstColumn="0" w:lastRowLastColumn="0"/>
-            <w:tcW w:w="2880" w:type="dxa"/>
+            <w:tcW w:w="2874" w:type="dxa"/>
           </w:tcPr>
           <w:p>
             <w:r>
@@ -834,7 +834,7 @@
         </w:tc>
         <w:tc>
           <w:tcPr>
-            <w:tcW w:w="2880" w:type="dxa"/>
+            <w:tcW w:w="2873" w:type="dxa"/>
           </w:tcPr>
           <w:p>
             <w:pPr>
@@ -850,7 +850,7 @@
         </w:tc>
         <w:tc>
           <w:tcPr>
-            <w:tcW w:w="2880" w:type="dxa"/>
+            <w:tcW w:w="2873" w:type="dxa"/>
           </w:tcPr>
           <w:p>
             <w:pPr>
@@ -872,7 +872,7 @@
         <w:tc>
           <w:tcPr>
             <w:cnfStyle w:val="001000000000" w:firstRow="0" w:lastRow="0" w:firstColumn="1" w:lastColumn="0" w:oddVBand="0" w:evenVBand="0" w:oddHBand="0" w:evenHBand="0" w:firstRowFirstColumn="0" w:firstRowLastColumn="0" w:lastRowFirstColumn="0" w:lastRowLastColumn="0"/>
-            <w:tcW w:w="2880" w:type="dxa"/>
+            <w:tcW w:w="2874" w:type="dxa"/>
           </w:tcPr>
           <w:p>
             <w:r>
@@ -885,7 +885,7 @@
         </w:tc>
         <w:tc>
           <w:tcPr>
-            <w:tcW w:w="2880" w:type="dxa"/>
+            <w:tcW w:w="2873" w:type="dxa"/>
           </w:tcPr>
           <w:p>
             <w:pPr>
@@ -901,7 +901,7 @@
         </w:tc>
         <w:tc>
           <w:tcPr>
-            <w:tcW w:w="2880" w:type="dxa"/>
+            <w:tcW w:w="2873" w:type="dxa"/>
           </w:tcPr>
           <w:p>
             <w:pPr>
@@ -923,7 +923,7 @@
         <w:tc>
           <w:tcPr>
             <w:cnfStyle w:val="001000000000" w:firstRow="0" w:lastRow="0" w:firstColumn="1" w:lastColumn="0" w:oddVBand="0" w:evenVBand="0" w:oddHBand="0" w:evenHBand="0" w:firstRowFirstColumn="0" w:firstRowLastColumn="0" w:lastRowFirstColumn="0" w:lastRowLastColumn="0"/>
-            <w:tcW w:w="2880" w:type="dxa"/>
+            <w:tcW w:w="2874" w:type="dxa"/>
           </w:tcPr>
           <w:p>
             <w:r>
@@ -936,7 +936,7 @@
         </w:tc>
         <w:tc>
           <w:tcPr>
-            <w:tcW w:w="2880" w:type="dxa"/>
+            <w:tcW w:w="2873" w:type="dxa"/>
           </w:tcPr>
           <w:p>
             <w:pPr>
@@ -952,7 +952,7 @@
         </w:tc>
         <w:tc>
           <w:tcPr>
-            <w:tcW w:w="2880" w:type="dxa"/>
+            <w:tcW w:w="2873" w:type="dxa"/>
           </w:tcPr>
           <w:p>
             <w:pPr>
@@ -974,7 +974,7 @@
         <w:tc>
           <w:tcPr>
             <w:cnfStyle w:val="001000000000" w:firstRow="0" w:lastRow="0" w:firstColumn="1" w:lastColumn="0" w:oddVBand="0" w:evenVBand="0" w:oddHBand="0" w:evenHBand="0" w:firstRowFirstColumn="0" w:firstRowLastColumn="0" w:lastRowFirstColumn="0" w:lastRowLastColumn="0"/>
-            <w:tcW w:w="2880" w:type="dxa"/>
+            <w:tcW w:w="2874" w:type="dxa"/>
           </w:tcPr>
           <w:p>
             <w:r>
@@ -987,7 +987,7 @@
         </w:tc>
         <w:tc>
           <w:tcPr>
-            <w:tcW w:w="2880" w:type="dxa"/>
+            <w:tcW w:w="2873" w:type="dxa"/>
           </w:tcPr>
           <w:p>
             <w:pPr>
@@ -1003,7 +1003,7 @@
         </w:tc>
         <w:tc>
           <w:tcPr>
-            <w:tcW w:w="2880" w:type="dxa"/>
+            <w:tcW w:w="2873" w:type="dxa"/>
           </w:tcPr>
           <w:p>
             <w:pPr>
@@ -1025,20 +1025,21 @@
         <w:tc>
           <w:tcPr>
             <w:cnfStyle w:val="001000000000" w:firstRow="0" w:lastRow="0" w:firstColumn="1" w:lastColumn="0" w:oddVBand="0" w:evenVBand="0" w:oddHBand="0" w:evenHBand="0" w:firstRowFirstColumn="0" w:firstRowLastColumn="0" w:lastRowFirstColumn="0" w:lastRowLastColumn="0"/>
-            <w:tcW w:w="2880" w:type="dxa"/>
+            <w:tcW w:w="2874" w:type="dxa"/>
           </w:tcPr>
           <w:p>
             <w:r>
               <w:rPr>
                 <w:sz w:val="20"/>
               </w:rPr>
+              <w:lastRenderedPageBreak/>
               <w:t>Gradient clipping</w:t>
             </w:r>
           </w:p>
         </w:tc>
         <w:tc>
           <w:tcPr>
-            <w:tcW w:w="2880" w:type="dxa"/>
+            <w:tcW w:w="2873" w:type="dxa"/>
           </w:tcPr>
           <w:p>
             <w:pPr>
@@ -1054,7 +1055,7 @@
         </w:tc>
         <w:tc>
           <w:tcPr>
-            <w:tcW w:w="2880" w:type="dxa"/>
+            <w:tcW w:w="2873" w:type="dxa"/>
           </w:tcPr>
           <w:p>
             <w:pPr>
@@ -1076,7 +1077,7 @@
         <w:tc>
           <w:tcPr>
             <w:cnfStyle w:val="001000000000" w:firstRow="0" w:lastRow="0" w:firstColumn="1" w:lastColumn="0" w:oddVBand="0" w:evenVBand="0" w:oddHBand="0" w:evenHBand="0" w:firstRowFirstColumn="0" w:firstRowLastColumn="0" w:lastRowFirstColumn="0" w:lastRowLastColumn="0"/>
-            <w:tcW w:w="2880" w:type="dxa"/>
+            <w:tcW w:w="2874" w:type="dxa"/>
           </w:tcPr>
           <w:p>
             <w:r>
@@ -1089,7 +1090,7 @@
         </w:tc>
         <w:tc>
           <w:tcPr>
-            <w:tcW w:w="2880" w:type="dxa"/>
+            <w:tcW w:w="2873" w:type="dxa"/>
           </w:tcPr>
           <w:p>
             <w:pPr>
@@ -1105,7 +1106,7 @@
         </w:tc>
         <w:tc>
           <w:tcPr>
-            <w:tcW w:w="2880" w:type="dxa"/>
+            <w:tcW w:w="2873" w:type="dxa"/>
           </w:tcPr>
           <w:p>
             <w:pPr>
@@ -1127,46 +1128,57 @@
         <w:tc>
           <w:tcPr>
             <w:cnfStyle w:val="001000000000" w:firstRow="0" w:lastRow="0" w:firstColumn="1" w:lastColumn="0" w:oddVBand="0" w:evenVBand="0" w:oddHBand="0" w:evenHBand="0" w:firstRowFirstColumn="0" w:firstRowLastColumn="0" w:lastRowFirstColumn="0" w:lastRowLastColumn="0"/>
-            <w:tcW w:w="2880" w:type="dxa"/>
+            <w:tcW w:w="2874" w:type="dxa"/>
           </w:tcPr>
           <w:p>
-            <w:r>
+            <w:pPr>
               <w:rPr>
                 <w:sz w:val="20"/>
               </w:rPr>
-              <w:t>Max sequence length</w:t>
+            </w:pPr>
+            <w:r>
+              <w:rPr>
+                <w:sz w:val="20"/>
+              </w:rPr>
+              <w:t>Length Penalty</w:t>
             </w:r>
           </w:p>
         </w:tc>
         <w:tc>
           <w:tcPr>
-            <w:tcW w:w="2880" w:type="dxa"/>
+            <w:tcW w:w="2873" w:type="dxa"/>
           </w:tcPr>
           <w:p>
             <w:pPr>
               <w:cnfStyle w:val="000000010000" w:firstRow="0" w:lastRow="0" w:firstColumn="0" w:lastColumn="0" w:oddVBand="0" w:evenVBand="0" w:oddHBand="0" w:evenHBand="1" w:firstRowFirstColumn="0" w:firstRowLastColumn="0" w:lastRowFirstColumn="0" w:lastRowLastColumn="0"/>
+              <w:rPr>
+                <w:sz w:val="20"/>
+              </w:rPr>
             </w:pPr>
             <w:r>
               <w:rPr>
                 <w:sz w:val="20"/>
               </w:rPr>
-              <w:t>60 (decode cap)</w:t>
+              <w:t>N/A</w:t>
             </w:r>
           </w:p>
         </w:tc>
         <w:tc>
           <w:tcPr>
-            <w:tcW w:w="2880" w:type="dxa"/>
+            <w:tcW w:w="2873" w:type="dxa"/>
           </w:tcPr>
           <w:p>
             <w:pPr>
               <w:cnfStyle w:val="000000010000" w:firstRow="0" w:lastRow="0" w:firstColumn="0" w:lastColumn="0" w:oddVBand="0" w:evenVBand="0" w:oddHBand="0" w:evenHBand="1" w:firstRowFirstColumn="0" w:firstRowLastColumn="0" w:lastRowFirstColumn="0" w:lastRowLastColumn="0"/>
+              <w:rPr>
+                <w:sz w:val="20"/>
+              </w:rPr>
             </w:pPr>
             <w:r>
               <w:rPr>
                 <w:sz w:val="20"/>
               </w:rPr>
-              <w:t>128 tokens</w:t>
+              <w:t>1.0</w:t>
             </w:r>
           </w:p>
         </w:tc>
@@ -1178,20 +1190,144 @@
         <w:tc>
           <w:tcPr>
             <w:cnfStyle w:val="001000000000" w:firstRow="0" w:lastRow="0" w:firstColumn="1" w:lastColumn="0" w:oddVBand="0" w:evenVBand="0" w:oddHBand="0" w:evenHBand="0" w:firstRowFirstColumn="0" w:firstRowLastColumn="0" w:lastRowFirstColumn="0" w:lastRowLastColumn="0"/>
-            <w:tcW w:w="2880" w:type="dxa"/>
+            <w:tcW w:w="2874" w:type="dxa"/>
           </w:tcPr>
           <w:p>
-            <w:r>
+            <w:pPr>
               <w:rPr>
                 <w:sz w:val="20"/>
               </w:rPr>
-              <w:t>Trainable parameters</w:t>
+            </w:pPr>
+            <w:r>
+              <w:rPr>
+                <w:sz w:val="20"/>
+              </w:rPr>
+              <w:t>No Repeat N-Gram Size</w:t>
             </w:r>
           </w:p>
         </w:tc>
         <w:tc>
           <w:tcPr>
-            <w:tcW w:w="2880" w:type="dxa"/>
+            <w:tcW w:w="2873" w:type="dxa"/>
+          </w:tcPr>
+          <w:p>
+            <w:pPr>
+              <w:cnfStyle w:val="000000100000" w:firstRow="0" w:lastRow="0" w:firstColumn="0" w:lastColumn="0" w:oddVBand="0" w:evenVBand="0" w:oddHBand="1" w:evenHBand="0" w:firstRowFirstColumn="0" w:firstRowLastColumn="0" w:lastRowFirstColumn="0" w:lastRowLastColumn="0"/>
+              <w:rPr>
+                <w:sz w:val="20"/>
+              </w:rPr>
+            </w:pPr>
+            <w:r>
+              <w:rPr>
+                <w:sz w:val="20"/>
+              </w:rPr>
+              <w:t>N/A</w:t>
+            </w:r>
+          </w:p>
+        </w:tc>
+        <w:tc>
+          <w:tcPr>
+            <w:tcW w:w="2873" w:type="dxa"/>
+          </w:tcPr>
+          <w:p>
+            <w:pPr>
+              <w:cnfStyle w:val="000000100000" w:firstRow="0" w:lastRow="0" w:firstColumn="0" w:lastColumn="0" w:oddVBand="0" w:evenVBand="0" w:oddHBand="1" w:evenHBand="0" w:firstRowFirstColumn="0" w:firstRowLastColumn="0" w:lastRowFirstColumn="0" w:lastRowLastColumn="0"/>
+              <w:rPr>
+                <w:sz w:val="20"/>
+              </w:rPr>
+            </w:pPr>
+            <w:r>
+              <w:rPr>
+                <w:sz w:val="20"/>
+              </w:rPr>
+              <w:t>3</w:t>
+            </w:r>
+          </w:p>
+        </w:tc>
+      </w:tr>
+      <w:tr>
+        <w:trPr>
+          <w:cnfStyle w:val="000000010000" w:firstRow="0" w:lastRow="0" w:firstColumn="0" w:lastColumn="0" w:oddVBand="0" w:evenVBand="0" w:oddHBand="0" w:evenHBand="1" w:firstRowFirstColumn="0" w:firstRowLastColumn="0" w:lastRowFirstColumn="0" w:lastRowLastColumn="0"/>
+        </w:trPr>
+        <w:tc>
+          <w:tcPr>
+            <w:cnfStyle w:val="001000000000" w:firstRow="0" w:lastRow="0" w:firstColumn="1" w:lastColumn="0" w:oddVBand="0" w:evenVBand="0" w:oddHBand="0" w:evenHBand="0" w:firstRowFirstColumn="0" w:firstRowLastColumn="0" w:lastRowFirstColumn="0" w:lastRowLastColumn="0"/>
+            <w:tcW w:w="2874" w:type="dxa"/>
+          </w:tcPr>
+          <w:p>
+            <w:pPr>
+              <w:rPr>
+                <w:sz w:val="20"/>
+              </w:rPr>
+            </w:pPr>
+            <w:r>
+              <w:rPr>
+                <w:sz w:val="20"/>
+              </w:rPr>
+              <w:t>Repetition Penalty</w:t>
+            </w:r>
+          </w:p>
+        </w:tc>
+        <w:tc>
+          <w:tcPr>
+            <w:tcW w:w="2873" w:type="dxa"/>
+          </w:tcPr>
+          <w:p>
+            <w:pPr>
+              <w:cnfStyle w:val="000000010000" w:firstRow="0" w:lastRow="0" w:firstColumn="0" w:lastColumn="0" w:oddVBand="0" w:evenVBand="0" w:oddHBand="0" w:evenHBand="1" w:firstRowFirstColumn="0" w:firstRowLastColumn="0" w:lastRowFirstColumn="0" w:lastRowLastColumn="0"/>
+              <w:rPr>
+                <w:sz w:val="20"/>
+              </w:rPr>
+            </w:pPr>
+            <w:r>
+              <w:rPr>
+                <w:sz w:val="20"/>
+              </w:rPr>
+              <w:t>N/A</w:t>
+            </w:r>
+          </w:p>
+        </w:tc>
+        <w:tc>
+          <w:tcPr>
+            <w:tcW w:w="2873" w:type="dxa"/>
+          </w:tcPr>
+          <w:p>
+            <w:pPr>
+              <w:cnfStyle w:val="000000010000" w:firstRow="0" w:lastRow="0" w:firstColumn="0" w:lastColumn="0" w:oddVBand="0" w:evenVBand="0" w:oddHBand="0" w:evenHBand="1" w:firstRowFirstColumn="0" w:firstRowLastColumn="0" w:lastRowFirstColumn="0" w:lastRowLastColumn="0"/>
+              <w:rPr>
+                <w:sz w:val="20"/>
+              </w:rPr>
+            </w:pPr>
+            <w:r>
+              <w:rPr>
+                <w:sz w:val="20"/>
+              </w:rPr>
+              <w:t>1.2</w:t>
+            </w:r>
+          </w:p>
+        </w:tc>
+      </w:tr>
+      <w:tr>
+        <w:trPr>
+          <w:cnfStyle w:val="000000100000" w:firstRow="0" w:lastRow="0" w:firstColumn="0" w:lastColumn="0" w:oddVBand="0" w:evenVBand="0" w:oddHBand="1" w:evenHBand="0" w:firstRowFirstColumn="0" w:firstRowLastColumn="0" w:lastRowFirstColumn="0" w:lastRowLastColumn="0"/>
+        </w:trPr>
+        <w:tc>
+          <w:tcPr>
+            <w:cnfStyle w:val="001000000000" w:firstRow="0" w:lastRow="0" w:firstColumn="1" w:lastColumn="0" w:oddVBand="0" w:evenVBand="0" w:oddHBand="0" w:evenHBand="0" w:firstRowFirstColumn="0" w:firstRowLastColumn="0" w:lastRowFirstColumn="0" w:lastRowLastColumn="0"/>
+            <w:tcW w:w="2874" w:type="dxa"/>
+          </w:tcPr>
+          <w:p>
+            <w:r>
+              <w:rPr>
+                <w:sz w:val="20"/>
+              </w:rPr>
+              <w:t>Max sequence length</w:t>
+            </w:r>
+          </w:p>
+        </w:tc>
+        <w:tc>
+          <w:tcPr>
+            <w:tcW w:w="2873" w:type="dxa"/>
           </w:tcPr>
           <w:p>
             <w:pPr>
@@ -1201,17 +1337,68 @@
               <w:rPr>
                 <w:sz w:val="20"/>
               </w:rPr>
-              <w:t>36,964,855</w:t>
+              <w:t>60 (decode cap)</w:t>
             </w:r>
           </w:p>
         </w:tc>
         <w:tc>
           <w:tcPr>
-            <w:tcW w:w="2880" w:type="dxa"/>
+            <w:tcW w:w="2873" w:type="dxa"/>
           </w:tcPr>
           <w:p>
             <w:pPr>
               <w:cnfStyle w:val="000000100000" w:firstRow="0" w:lastRow="0" w:firstColumn="0" w:lastColumn="0" w:oddVBand="0" w:evenVBand="0" w:oddHBand="1" w:evenHBand="0" w:firstRowFirstColumn="0" w:firstRowLastColumn="0" w:lastRowFirstColumn="0" w:lastRowLastColumn="0"/>
+            </w:pPr>
+            <w:r>
+              <w:rPr>
+                <w:sz w:val="20"/>
+              </w:rPr>
+              <w:t>128 tokens</w:t>
+            </w:r>
+          </w:p>
+        </w:tc>
+      </w:tr>
+      <w:tr>
+        <w:trPr>
+          <w:cnfStyle w:val="000000010000" w:firstRow="0" w:lastRow="0" w:firstColumn="0" w:lastColumn="0" w:oddVBand="0" w:evenVBand="0" w:oddHBand="0" w:evenHBand="1" w:firstRowFirstColumn="0" w:firstRowLastColumn="0" w:lastRowFirstColumn="0" w:lastRowLastColumn="0"/>
+        </w:trPr>
+        <w:tc>
+          <w:tcPr>
+            <w:cnfStyle w:val="001000000000" w:firstRow="0" w:lastRow="0" w:firstColumn="1" w:lastColumn="0" w:oddVBand="0" w:evenVBand="0" w:oddHBand="0" w:evenHBand="0" w:firstRowFirstColumn="0" w:firstRowLastColumn="0" w:lastRowFirstColumn="0" w:lastRowLastColumn="0"/>
+            <w:tcW w:w="2874" w:type="dxa"/>
+          </w:tcPr>
+          <w:p>
+            <w:r>
+              <w:rPr>
+                <w:sz w:val="20"/>
+              </w:rPr>
+              <w:t>Trainable parameters</w:t>
+            </w:r>
+          </w:p>
+        </w:tc>
+        <w:tc>
+          <w:tcPr>
+            <w:tcW w:w="2873" w:type="dxa"/>
+          </w:tcPr>
+          <w:p>
+            <w:pPr>
+              <w:cnfStyle w:val="000000010000" w:firstRow="0" w:lastRow="0" w:firstColumn="0" w:lastColumn="0" w:oddVBand="0" w:evenVBand="0" w:oddHBand="0" w:evenHBand="1" w:firstRowFirstColumn="0" w:firstRowLastColumn="0" w:lastRowFirstColumn="0" w:lastRowLastColumn="0"/>
+            </w:pPr>
+            <w:r>
+              <w:rPr>
+                <w:sz w:val="20"/>
+              </w:rPr>
+              <w:t>36,964,855</w:t>
+            </w:r>
+          </w:p>
+        </w:tc>
+        <w:tc>
+          <w:tcPr>
+            <w:tcW w:w="2873" w:type="dxa"/>
+          </w:tcPr>
+          <w:p>
+            <w:pPr>
+              <w:cnfStyle w:val="000000010000" w:firstRow="0" w:lastRow="0" w:firstColumn="0" w:lastColumn="0" w:oddVBand="0" w:evenVBand="0" w:oddHBand="0" w:evenHBand="1" w:firstRowFirstColumn="0" w:firstRowLastColumn="0" w:lastRowFirstColumn="0" w:lastRowLastColumn="0"/>
             </w:pPr>
             <w:r>
               <w:rPr>
@@ -1256,22 +1443,25 @@
     <w:tbl>
       <w:tblPr>
         <w:tblStyle w:val="LightGrid-Accent1"/>
-        <w:tblW w:w="0" w:type="auto"/>
+        <w:tblW w:w="7525" w:type="dxa"/>
+        <w:jc w:val="center"/>
         <w:tblLook w:val="04A0" w:firstRow="1" w:lastRow="0" w:firstColumn="1" w:lastColumn="0" w:noHBand="0" w:noVBand="1"/>
       </w:tblPr>
       <w:tblGrid>
-        <w:gridCol w:w="2872"/>
-        <w:gridCol w:w="2873"/>
-        <w:gridCol w:w="2875"/>
+        <w:gridCol w:w="1691"/>
+        <w:gridCol w:w="1843"/>
+        <w:gridCol w:w="2126"/>
+        <w:gridCol w:w="1865"/>
       </w:tblGrid>
       <w:tr>
         <w:trPr>
           <w:cnfStyle w:val="100000000000" w:firstRow="1" w:lastRow="0" w:firstColumn="0" w:lastColumn="0" w:oddVBand="0" w:evenVBand="0" w:oddHBand="0" w:evenHBand="0" w:firstRowFirstColumn="0" w:firstRowLastColumn="0" w:lastRowFirstColumn="0" w:lastRowLastColumn="0"/>
+          <w:jc w:val="center"/>
         </w:trPr>
         <w:tc>
           <w:tcPr>
             <w:cnfStyle w:val="001000000000" w:firstRow="0" w:lastRow="0" w:firstColumn="1" w:lastColumn="0" w:oddVBand="0" w:evenVBand="0" w:oddHBand="0" w:evenHBand="0" w:firstRowFirstColumn="0" w:firstRowLastColumn="0" w:lastRowFirstColumn="0" w:lastRowLastColumn="0"/>
-            <w:tcW w:w="2880" w:type="dxa"/>
+            <w:tcW w:w="1691" w:type="dxa"/>
           </w:tcPr>
           <w:p>
             <w:r>
@@ -1284,7 +1474,7 @@
         </w:tc>
         <w:tc>
           <w:tcPr>
-            <w:tcW w:w="2880" w:type="dxa"/>
+            <w:tcW w:w="1843" w:type="dxa"/>
           </w:tcPr>
           <w:p>
             <w:pPr>
@@ -1294,35 +1484,52 @@
               <w:rPr>
                 <w:sz w:val="20"/>
               </w:rPr>
-              <w:t>Pretrained NLLB-200-600M (dev/test)</w:t>
+              <w:t>Custom Seq2Seq+Attention (dev)</w:t>
             </w:r>
           </w:p>
         </w:tc>
         <w:tc>
           <w:tcPr>
-            <w:tcW w:w="2880" w:type="dxa"/>
+            <w:tcW w:w="2126" w:type="dxa"/>
           </w:tcPr>
           <w:p>
             <w:pPr>
               <w:cnfStyle w:val="100000000000" w:firstRow="1" w:lastRow="0" w:firstColumn="0" w:lastColumn="0" w:oddVBand="0" w:evenVBand="0" w:oddHBand="0" w:evenHBand="0" w:firstRowFirstColumn="0" w:firstRowLastColumn="0" w:lastRowFirstColumn="0" w:lastRowLastColumn="0"/>
+              <w:rPr>
+                <w:sz w:val="20"/>
+              </w:rPr>
             </w:pPr>
             <w:r>
               <w:rPr>
                 <w:sz w:val="20"/>
               </w:rPr>
-              <w:t>Custom Seq2Seq+Attention (dev)</w:t>
-            </w:r>
+              <w:t>Pretrained NLLB-200-600M (dev/test)</w:t>
+            </w:r>
+          </w:p>
+        </w:tc>
+        <w:tc>
+          <w:tcPr>
+            <w:tcW w:w="1865" w:type="dxa"/>
+          </w:tcPr>
+          <w:p>
+            <w:pPr>
+              <w:cnfStyle w:val="100000000000" w:firstRow="1" w:lastRow="0" w:firstColumn="0" w:lastColumn="0" w:oddVBand="0" w:evenVBand="0" w:oddHBand="0" w:evenHBand="0" w:firstRowFirstColumn="0" w:firstRowLastColumn="0" w:lastRowFirstColumn="0" w:lastRowLastColumn="0"/>
+              <w:rPr>
+                <w:sz w:val="20"/>
+              </w:rPr>
+            </w:pPr>
           </w:p>
         </w:tc>
       </w:tr>
       <w:tr>
         <w:trPr>
           <w:cnfStyle w:val="000000100000" w:firstRow="0" w:lastRow="0" w:firstColumn="0" w:lastColumn="0" w:oddVBand="0" w:evenVBand="0" w:oddHBand="1" w:evenHBand="0" w:firstRowFirstColumn="0" w:firstRowLastColumn="0" w:lastRowFirstColumn="0" w:lastRowLastColumn="0"/>
+          <w:jc w:val="center"/>
         </w:trPr>
         <w:tc>
           <w:tcPr>
             <w:cnfStyle w:val="001000000000" w:firstRow="0" w:lastRow="0" w:firstColumn="1" w:lastColumn="0" w:oddVBand="0" w:evenVBand="0" w:oddHBand="0" w:evenHBand="0" w:firstRowFirstColumn="0" w:firstRowLastColumn="0" w:lastRowFirstColumn="0" w:lastRowLastColumn="0"/>
-            <w:tcW w:w="2880" w:type="dxa"/>
+            <w:tcW w:w="1691" w:type="dxa"/>
           </w:tcPr>
           <w:p>
             <w:r>
@@ -1335,7 +1542,7 @@
         </w:tc>
         <w:tc>
           <w:tcPr>
-            <w:tcW w:w="2880" w:type="dxa"/>
+            <w:tcW w:w="1843" w:type="dxa"/>
           </w:tcPr>
           <w:p>
             <w:pPr>
@@ -1345,35 +1552,52 @@
               <w:rPr>
                 <w:sz w:val="20"/>
               </w:rPr>
-              <w:t>0.1269</w:t>
+              <w:t>0.0767 (final epoch)</w:t>
             </w:r>
           </w:p>
         </w:tc>
         <w:tc>
           <w:tcPr>
-            <w:tcW w:w="2880" w:type="dxa"/>
+            <w:tcW w:w="2126" w:type="dxa"/>
           </w:tcPr>
           <w:p>
             <w:pPr>
               <w:cnfStyle w:val="000000100000" w:firstRow="0" w:lastRow="0" w:firstColumn="0" w:lastColumn="0" w:oddVBand="0" w:evenVBand="0" w:oddHBand="1" w:evenHBand="0" w:firstRowFirstColumn="0" w:firstRowLastColumn="0" w:lastRowFirstColumn="0" w:lastRowLastColumn="0"/>
+              <w:rPr>
+                <w:sz w:val="20"/>
+              </w:rPr>
             </w:pPr>
             <w:r>
               <w:rPr>
                 <w:sz w:val="20"/>
               </w:rPr>
-              <w:t>0.0767 (final epoch)</w:t>
-            </w:r>
+              <w:t>0.1269</w:t>
+            </w:r>
+          </w:p>
+        </w:tc>
+        <w:tc>
+          <w:tcPr>
+            <w:tcW w:w="1865" w:type="dxa"/>
+          </w:tcPr>
+          <w:p>
+            <w:pPr>
+              <w:cnfStyle w:val="000000100000" w:firstRow="0" w:lastRow="0" w:firstColumn="0" w:lastColumn="0" w:oddVBand="0" w:evenVBand="0" w:oddHBand="1" w:evenHBand="0" w:firstRowFirstColumn="0" w:firstRowLastColumn="0" w:lastRowFirstColumn="0" w:lastRowLastColumn="0"/>
+              <w:rPr>
+                <w:sz w:val="20"/>
+              </w:rPr>
+            </w:pPr>
           </w:p>
         </w:tc>
       </w:tr>
       <w:tr>
         <w:trPr>
           <w:cnfStyle w:val="000000010000" w:firstRow="0" w:lastRow="0" w:firstColumn="0" w:lastColumn="0" w:oddVBand="0" w:evenVBand="0" w:oddHBand="0" w:evenHBand="1" w:firstRowFirstColumn="0" w:firstRowLastColumn="0" w:lastRowFirstColumn="0" w:lastRowLastColumn="0"/>
+          <w:jc w:val="center"/>
         </w:trPr>
         <w:tc>
           <w:tcPr>
             <w:cnfStyle w:val="001000000000" w:firstRow="0" w:lastRow="0" w:firstColumn="1" w:lastColumn="0" w:oddVBand="0" w:evenVBand="0" w:oddHBand="0" w:evenHBand="0" w:firstRowFirstColumn="0" w:firstRowLastColumn="0" w:lastRowFirstColumn="0" w:lastRowLastColumn="0"/>
-            <w:tcW w:w="2880" w:type="dxa"/>
+            <w:tcW w:w="1691" w:type="dxa"/>
           </w:tcPr>
           <w:p>
             <w:r>
@@ -1386,7 +1610,7 @@
         </w:tc>
         <w:tc>
           <w:tcPr>
-            <w:tcW w:w="2880" w:type="dxa"/>
+            <w:tcW w:w="1843" w:type="dxa"/>
           </w:tcPr>
           <w:p>
             <w:pPr>
@@ -1396,84 +1620,111 @@
               <w:rPr>
                 <w:sz w:val="20"/>
               </w:rPr>
-              <w:t>0.4884</w:t>
+              <w:t>0.1202 (final epoch)</w:t>
             </w:r>
           </w:p>
         </w:tc>
         <w:tc>
           <w:tcPr>
-            <w:tcW w:w="2880" w:type="dxa"/>
+            <w:tcW w:w="2126" w:type="dxa"/>
           </w:tcPr>
           <w:p>
             <w:pPr>
               <w:cnfStyle w:val="000000010000" w:firstRow="0" w:lastRow="0" w:firstColumn="0" w:lastColumn="0" w:oddVBand="0" w:evenVBand="0" w:oddHBand="0" w:evenHBand="1" w:firstRowFirstColumn="0" w:firstRowLastColumn="0" w:lastRowFirstColumn="0" w:lastRowLastColumn="0"/>
+              <w:rPr>
+                <w:sz w:val="20"/>
+              </w:rPr>
             </w:pPr>
             <w:r>
               <w:rPr>
                 <w:sz w:val="20"/>
               </w:rPr>
-              <w:t>0.1202 (final epoch)</w:t>
-            </w:r>
+              <w:t>0.4884</w:t>
+            </w:r>
+          </w:p>
+        </w:tc>
+        <w:tc>
+          <w:tcPr>
+            <w:tcW w:w="1865" w:type="dxa"/>
+          </w:tcPr>
+          <w:p>
+            <w:pPr>
+              <w:cnfStyle w:val="000000010000" w:firstRow="0" w:lastRow="0" w:firstColumn="0" w:lastColumn="0" w:oddVBand="0" w:evenVBand="0" w:oddHBand="0" w:evenHBand="1" w:firstRowFirstColumn="0" w:firstRowLastColumn="0" w:lastRowFirstColumn="0" w:lastRowLastColumn="0"/>
+              <w:rPr>
+                <w:sz w:val="20"/>
+              </w:rPr>
+            </w:pPr>
           </w:p>
         </w:tc>
       </w:tr>
       <w:tr>
         <w:trPr>
           <w:cnfStyle w:val="000000100000" w:firstRow="0" w:lastRow="0" w:firstColumn="0" w:lastColumn="0" w:oddVBand="0" w:evenVBand="0" w:oddHBand="1" w:evenHBand="0" w:firstRowFirstColumn="0" w:firstRowLastColumn="0" w:lastRowFirstColumn="0" w:lastRowLastColumn="0"/>
+          <w:jc w:val="center"/>
         </w:trPr>
         <w:tc>
           <w:tcPr>
             <w:cnfStyle w:val="001000000000" w:firstRow="0" w:lastRow="0" w:firstColumn="1" w:lastColumn="0" w:oddVBand="0" w:evenVBand="0" w:oddHBand="0" w:evenHBand="0" w:firstRowFirstColumn="0" w:firstRowLastColumn="0" w:lastRowFirstColumn="0" w:lastRowLastColumn="0"/>
-            <w:tcW w:w="2880" w:type="dxa"/>
+            <w:tcW w:w="1691" w:type="dxa"/>
           </w:tcPr>
           <w:p>
             <w:r>
               <w:rPr>
                 <w:sz w:val="20"/>
               </w:rPr>
-              <w:lastRenderedPageBreak/>
               <w:t>Dev inference time (s)</w:t>
             </w:r>
           </w:p>
         </w:tc>
         <w:tc>
           <w:tcPr>
-            <w:tcW w:w="2880" w:type="dxa"/>
+            <w:tcW w:w="1843" w:type="dxa"/>
           </w:tcPr>
           <w:p>
             <w:pPr>
               <w:cnfStyle w:val="000000100000" w:firstRow="0" w:lastRow="0" w:firstColumn="0" w:lastColumn="0" w:oddVBand="0" w:evenVBand="0" w:oddHBand="1" w:evenHBand="0" w:firstRowFirstColumn="0" w:firstRowLastColumn="0" w:lastRowFirstColumn="0" w:lastRowLastColumn="0"/>
             </w:pPr>
             <w:r>
-              <w:rPr>
-                <w:sz w:val="20"/>
-              </w:rPr>
-              <w:t>168.45</w:t>
+              <w:t>N/A</w:t>
             </w:r>
           </w:p>
         </w:tc>
         <w:tc>
           <w:tcPr>
-            <w:tcW w:w="2880" w:type="dxa"/>
+            <w:tcW w:w="2126" w:type="dxa"/>
           </w:tcPr>
           <w:p>
             <w:pPr>
               <w:cnfStyle w:val="000000100000" w:firstRow="0" w:lastRow="0" w:firstColumn="0" w:lastColumn="0" w:oddVBand="0" w:evenVBand="0" w:oddHBand="1" w:evenHBand="0" w:firstRowFirstColumn="0" w:firstRowLastColumn="0" w:lastRowFirstColumn="0" w:lastRowLastColumn="0"/>
             </w:pPr>
             <w:r>
-              <w:t>N/A</w:t>
-            </w:r>
+              <w:rPr>
+                <w:sz w:val="20"/>
+              </w:rPr>
+              <w:t>168.45</w:t>
+            </w:r>
+          </w:p>
+        </w:tc>
+        <w:tc>
+          <w:tcPr>
+            <w:tcW w:w="1865" w:type="dxa"/>
+          </w:tcPr>
+          <w:p>
+            <w:pPr>
+              <w:cnfStyle w:val="000000100000" w:firstRow="0" w:lastRow="0" w:firstColumn="0" w:lastColumn="0" w:oddVBand="0" w:evenVBand="0" w:oddHBand="1" w:evenHBand="0" w:firstRowFirstColumn="0" w:firstRowLastColumn="0" w:lastRowFirstColumn="0" w:lastRowLastColumn="0"/>
+            </w:pPr>
           </w:p>
         </w:tc>
       </w:tr>
       <w:tr>
         <w:trPr>
           <w:cnfStyle w:val="000000010000" w:firstRow="0" w:lastRow="0" w:firstColumn="0" w:lastColumn="0" w:oddVBand="0" w:evenVBand="0" w:oddHBand="0" w:evenHBand="1" w:firstRowFirstColumn="0" w:firstRowLastColumn="0" w:lastRowFirstColumn="0" w:lastRowLastColumn="0"/>
+          <w:jc w:val="center"/>
         </w:trPr>
         <w:tc>
           <w:tcPr>
             <w:cnfStyle w:val="001000000000" w:firstRow="0" w:lastRow="0" w:firstColumn="1" w:lastColumn="0" w:oddVBand="0" w:evenVBand="0" w:oddHBand="0" w:evenHBand="0" w:firstRowFirstColumn="0" w:firstRowLastColumn="0" w:lastRowFirstColumn="0" w:lastRowLastColumn="0"/>
-            <w:tcW w:w="2880" w:type="dxa"/>
+            <w:tcW w:w="1691" w:type="dxa"/>
           </w:tcPr>
           <w:p>
             <w:r>
@@ -1486,7 +1737,7 @@
         </w:tc>
         <w:tc>
           <w:tcPr>
-            <w:tcW w:w="2880" w:type="dxa"/>
+            <w:tcW w:w="1843" w:type="dxa"/>
           </w:tcPr>
           <w:p>
             <w:pPr>
@@ -1496,35 +1747,52 @@
               <w:rPr>
                 <w:sz w:val="20"/>
               </w:rPr>
-              <w:t>165.90</w:t>
+              <w:t>1.47</w:t>
             </w:r>
           </w:p>
         </w:tc>
         <w:tc>
           <w:tcPr>
-            <w:tcW w:w="2880" w:type="dxa"/>
+            <w:tcW w:w="2126" w:type="dxa"/>
           </w:tcPr>
           <w:p>
             <w:pPr>
               <w:cnfStyle w:val="000000010000" w:firstRow="0" w:lastRow="0" w:firstColumn="0" w:lastColumn="0" w:oddVBand="0" w:evenVBand="0" w:oddHBand="0" w:evenHBand="1" w:firstRowFirstColumn="0" w:firstRowLastColumn="0" w:lastRowFirstColumn="0" w:lastRowLastColumn="0"/>
+              <w:rPr>
+                <w:sz w:val="20"/>
+              </w:rPr>
             </w:pPr>
             <w:r>
               <w:rPr>
                 <w:sz w:val="20"/>
               </w:rPr>
-              <w:t>1.47</w:t>
-            </w:r>
+              <w:t>165.90</w:t>
+            </w:r>
+          </w:p>
+        </w:tc>
+        <w:tc>
+          <w:tcPr>
+            <w:tcW w:w="1865" w:type="dxa"/>
+          </w:tcPr>
+          <w:p>
+            <w:pPr>
+              <w:cnfStyle w:val="000000010000" w:firstRow="0" w:lastRow="0" w:firstColumn="0" w:lastColumn="0" w:oddVBand="0" w:evenVBand="0" w:oddHBand="0" w:evenHBand="1" w:firstRowFirstColumn="0" w:firstRowLastColumn="0" w:lastRowFirstColumn="0" w:lastRowLastColumn="0"/>
+              <w:rPr>
+                <w:sz w:val="20"/>
+              </w:rPr>
+            </w:pPr>
           </w:p>
         </w:tc>
       </w:tr>
       <w:tr>
         <w:trPr>
           <w:cnfStyle w:val="000000100000" w:firstRow="0" w:lastRow="0" w:firstColumn="0" w:lastColumn="0" w:oddVBand="0" w:evenVBand="0" w:oddHBand="1" w:evenHBand="0" w:firstRowFirstColumn="0" w:firstRowLastColumn="0" w:lastRowFirstColumn="0" w:lastRowLastColumn="0"/>
+          <w:jc w:val="center"/>
         </w:trPr>
         <w:tc>
           <w:tcPr>
             <w:cnfStyle w:val="001000000000" w:firstRow="0" w:lastRow="0" w:firstColumn="1" w:lastColumn="0" w:oddVBand="0" w:evenVBand="0" w:oddHBand="0" w:evenHBand="0" w:firstRowFirstColumn="0" w:firstRowLastColumn="0" w:lastRowFirstColumn="0" w:lastRowLastColumn="0"/>
-            <w:tcW w:w="2880" w:type="dxa"/>
+            <w:tcW w:w="1691" w:type="dxa"/>
           </w:tcPr>
           <w:p>
             <w:r>
@@ -1537,7 +1805,7 @@
         </w:tc>
         <w:tc>
           <w:tcPr>
-            <w:tcW w:w="2880" w:type="dxa"/>
+            <w:tcW w:w="1843" w:type="dxa"/>
           </w:tcPr>
           <w:p>
             <w:pPr>
@@ -1547,24 +1815,40 @@
               <w:rPr>
                 <w:sz w:val="20"/>
               </w:rPr>
-              <w:t>615,073,792 (all frozen)</w:t>
+              <w:t>36,964,855 (all trainable)</w:t>
             </w:r>
           </w:p>
         </w:tc>
         <w:tc>
           <w:tcPr>
-            <w:tcW w:w="2880" w:type="dxa"/>
+            <w:tcW w:w="2126" w:type="dxa"/>
           </w:tcPr>
           <w:p>
             <w:pPr>
               <w:cnfStyle w:val="000000100000" w:firstRow="0" w:lastRow="0" w:firstColumn="0" w:lastColumn="0" w:oddVBand="0" w:evenVBand="0" w:oddHBand="1" w:evenHBand="0" w:firstRowFirstColumn="0" w:firstRowLastColumn="0" w:lastRowFirstColumn="0" w:lastRowLastColumn="0"/>
+              <w:rPr>
+                <w:sz w:val="20"/>
+              </w:rPr>
             </w:pPr>
             <w:r>
               <w:rPr>
                 <w:sz w:val="20"/>
               </w:rPr>
-              <w:t>36,964,855 (all trainable)</w:t>
-            </w:r>
+              <w:t>615,073,792 (all frozen)</w:t>
+            </w:r>
+          </w:p>
+        </w:tc>
+        <w:tc>
+          <w:tcPr>
+            <w:tcW w:w="1865" w:type="dxa"/>
+          </w:tcPr>
+          <w:p>
+            <w:pPr>
+              <w:cnfStyle w:val="000000100000" w:firstRow="0" w:lastRow="0" w:firstColumn="0" w:lastColumn="0" w:oddVBand="0" w:evenVBand="0" w:oddHBand="1" w:evenHBand="0" w:firstRowFirstColumn="0" w:firstRowLastColumn="0" w:lastRowFirstColumn="0" w:lastRowLastColumn="0"/>
+              <w:rPr>
+                <w:sz w:val="20"/>
+              </w:rPr>
+            </w:pPr>
           </w:p>
         </w:tc>
       </w:tr>
@@ -1601,7 +1885,7 @@
                     <pic:cNvPicPr/>
                   </pic:nvPicPr>
                   <pic:blipFill>
-                    <a:blip r:embed="rId7"/>
+                    <a:blip r:embed="rId8"/>
                     <a:stretch>
                       <a:fillRect/>
                     </a:stretch>
@@ -1645,6 +1929,7 @@
         <w:rPr>
           <w:color w:val="000000"/>
         </w:rPr>
+        <w:lastRenderedPageBreak/>
         <w:t>5. Translation Examples and Error Analysis</w:t>
       </w:r>
     </w:p>
@@ -1681,29 +1966,7 @@
         <w:rPr>
           <w:sz w:val="20"/>
         </w:rPr>
-        <w:t>dev-set predictions (</w:t>
-      </w:r>
-      <w:proofErr w:type="spellStart"/>
-      <w:r>
-        <w:rPr>
-          <w:sz w:val="20"/>
-        </w:rPr>
-        <w:t>sanskrit_nmt_</w:t>
-      </w:r>
-      <w:proofErr w:type="gramStart"/>
-      <w:r>
-        <w:rPr>
-          <w:sz w:val="20"/>
-        </w:rPr>
-        <w:t>assignment.ipynb</w:t>
-      </w:r>
-      <w:proofErr w:type="spellEnd"/>
-      <w:proofErr w:type="gramEnd"/>
-      <w:r>
-        <w:rPr>
-          <w:sz w:val="20"/>
-        </w:rPr>
-        <w:t>), each showing the Sanskrit source, human reference, model prediction, and an error-type annotation.</w:t>
+        <w:t>dev-set predictions (sanskrit_nmt_assignment.ipynb), each showing the Sanskrit source, human reference, model prediction, and an error-type annotation.</w:t>
       </w:r>
     </w:p>
     <w:tbl>
@@ -1831,16 +2094,8 @@
               <w:rPr>
                 <w:sz w:val="16"/>
               </w:rPr>
-              <w:t xml:space="preserve">those are </w:t>
-            </w:r>
-            <w:proofErr w:type="gramStart"/>
-            <w:r>
-              <w:rPr>
-                <w:sz w:val="16"/>
-              </w:rPr>
-              <w:t>two .</w:t>
-            </w:r>
-            <w:proofErr w:type="gramEnd"/>
+              <w:t>those are two .</w:t>
+            </w:r>
           </w:p>
         </w:tc>
         <w:tc>
@@ -2241,7 +2496,6 @@
             <w:tcW w:w="2160" w:type="dxa"/>
           </w:tcPr>
           <w:p>
-            <w:proofErr w:type="spellStart"/>
             <w:r>
               <w:rPr>
                 <w:sz w:val="16"/>
@@ -2255,14 +2509,12 @@
               </w:rPr>
               <w:t>इति</w:t>
             </w:r>
-            <w:proofErr w:type="spellEnd"/>
             <w:r>
               <w:rPr>
                 <w:sz w:val="16"/>
               </w:rPr>
               <w:t xml:space="preserve"> </w:t>
             </w:r>
-            <w:proofErr w:type="spellStart"/>
             <w:r>
               <w:rPr>
                 <w:rFonts w:ascii="Nirmala UI" w:hAnsi="Nirmala UI" w:cs="Nirmala UI"/>
@@ -2270,14 +2522,12 @@
               </w:rPr>
               <w:t>मेथड्</w:t>
             </w:r>
-            <w:proofErr w:type="spellEnd"/>
             <w:r>
               <w:rPr>
                 <w:sz w:val="16"/>
               </w:rPr>
               <w:t xml:space="preserve"> </w:t>
             </w:r>
-            <w:proofErr w:type="spellStart"/>
             <w:r>
               <w:rPr>
                 <w:rFonts w:ascii="Nirmala UI" w:hAnsi="Nirmala UI" w:cs="Nirmala UI"/>
@@ -2285,14 +2535,12 @@
               </w:rPr>
               <w:t>नाम</w:t>
             </w:r>
-            <w:proofErr w:type="spellEnd"/>
             <w:r>
               <w:rPr>
                 <w:sz w:val="16"/>
               </w:rPr>
               <w:t xml:space="preserve"> </w:t>
             </w:r>
-            <w:proofErr w:type="spellStart"/>
             <w:r>
               <w:rPr>
                 <w:rFonts w:ascii="Nirmala UI" w:hAnsi="Nirmala UI" w:cs="Nirmala UI"/>
@@ -2300,7 +2548,6 @@
               </w:rPr>
               <w:t>टङ्कयतु</w:t>
             </w:r>
-            <w:proofErr w:type="spellEnd"/>
             <w:r>
               <w:rPr>
                 <w:sz w:val="16"/>
@@ -2375,7 +2622,6 @@
             <w:tcW w:w="2160" w:type="dxa"/>
           </w:tcPr>
           <w:p>
-            <w:proofErr w:type="spellStart"/>
             <w:r>
               <w:rPr>
                 <w:rFonts w:ascii="Nirmala UI" w:hAnsi="Nirmala UI" w:cs="Nirmala UI"/>
@@ -2383,14 +2629,12 @@
               </w:rPr>
               <w:t>पाठेऽस्मिन्</w:t>
             </w:r>
-            <w:proofErr w:type="spellEnd"/>
             <w:r>
               <w:rPr>
                 <w:sz w:val="16"/>
               </w:rPr>
               <w:t xml:space="preserve"> </w:t>
             </w:r>
-            <w:proofErr w:type="spellStart"/>
             <w:r>
               <w:rPr>
                 <w:rFonts w:ascii="Nirmala UI" w:hAnsi="Nirmala UI" w:cs="Nirmala UI"/>
@@ -2398,14 +2642,12 @@
               </w:rPr>
               <w:t>वयम्</w:t>
             </w:r>
-            <w:proofErr w:type="spellEnd"/>
             <w:r>
               <w:rPr>
                 <w:sz w:val="16"/>
               </w:rPr>
               <w:t xml:space="preserve">, awk </w:t>
             </w:r>
-            <w:proofErr w:type="spellStart"/>
             <w:r>
               <w:rPr>
                 <w:rFonts w:ascii="Nirmala UI" w:hAnsi="Nirmala UI" w:cs="Nirmala UI"/>
@@ -2413,26 +2655,11 @@
               </w:rPr>
               <w:t>इत्यस्मिन्</w:t>
             </w:r>
-            <w:proofErr w:type="spellEnd"/>
-            <w:r>
-              <w:rPr>
-                <w:sz w:val="16"/>
-              </w:rPr>
-              <w:t xml:space="preserve"> if, else, </w:t>
-            </w:r>
-            <w:proofErr w:type="spellStart"/>
-            <w:r>
-              <w:rPr>
-                <w:sz w:val="16"/>
-              </w:rPr>
-              <w:t>els</w:t>
-            </w:r>
-            <w:proofErr w:type="spellEnd"/>
-            <w:r>
-              <w:rPr>
-                <w:sz w:val="16"/>
-              </w:rPr>
-              <w:t>...</w:t>
+            <w:r>
+              <w:rPr>
+                <w:sz w:val="16"/>
+              </w:rPr>
+              <w:t xml:space="preserve"> if, else, els...</w:t>
             </w:r>
           </w:p>
         </w:tc>
@@ -2499,7 +2726,6 @@
               <w:rPr>
                 <w:sz w:val="16"/>
               </w:rPr>
-              <w:lastRenderedPageBreak/>
               <w:t>नूनम् ईषत् 'S' इति वक्रं तस्य उपरि स्थापयतु ।...</w:t>
             </w:r>
           </w:p>
@@ -2583,21 +2809,7 @@
               <w:rPr>
                 <w:sz w:val="16"/>
               </w:rPr>
-              <w:t xml:space="preserve">Come back to </w:t>
-            </w:r>
-            <w:proofErr w:type="spellStart"/>
-            <w:r>
-              <w:rPr>
-                <w:sz w:val="16"/>
-              </w:rPr>
-              <w:t>Sthiti</w:t>
-            </w:r>
-            <w:proofErr w:type="spellEnd"/>
-            <w:r>
-              <w:rPr>
-                <w:sz w:val="16"/>
-              </w:rPr>
-              <w:t>.</w:t>
+              <w:t>Come back to Sthiti.</w:t>
             </w:r>
           </w:p>
         </w:tc>
@@ -2713,19 +2925,7 @@
         <w:rPr>
           <w:sz w:val="20"/>
         </w:rPr>
-        <w:t>test</w:t>
-      </w:r>
-      <w:r>
-        <w:rPr>
-          <w:sz w:val="20"/>
-        </w:rPr>
-        <w:t>-set predictions</w:t>
-      </w:r>
-      <w:r>
-        <w:rPr>
-          <w:sz w:val="20"/>
-        </w:rPr>
-        <w:t xml:space="preserve">. </w:t>
+        <w:t xml:space="preserve">test-set predictions. </w:t>
       </w:r>
     </w:p>
     <w:tbl>
@@ -2817,7 +3017,6 @@
             <w:tcW w:w="2160" w:type="dxa"/>
           </w:tcPr>
           <w:p>
-            <w:proofErr w:type="spellStart"/>
             <w:r>
               <w:rPr>
                 <w:rFonts w:ascii="Nirmala UI" w:hAnsi="Nirmala UI" w:cs="Nirmala UI" w:hint="cs"/>
@@ -2825,7 +3024,6 @@
               </w:rPr>
               <w:t>एक्लिप्स्</w:t>
             </w:r>
-            <w:proofErr w:type="spellEnd"/>
             <w:r>
               <w:rPr>
                 <w:rFonts w:ascii="Nirmala UI" w:hAnsi="Nirmala UI" w:cs="Nirmala UI"/>
@@ -2833,7 +3031,6 @@
               </w:rPr>
               <w:t xml:space="preserve"> </w:t>
             </w:r>
-            <w:proofErr w:type="spellStart"/>
             <w:r>
               <w:rPr>
                 <w:rFonts w:ascii="Nirmala UI" w:hAnsi="Nirmala UI" w:cs="Nirmala UI" w:hint="cs"/>
@@ -2841,7 +3038,6 @@
               </w:rPr>
               <w:t>इति</w:t>
             </w:r>
-            <w:proofErr w:type="spellEnd"/>
             <w:r>
               <w:rPr>
                 <w:rFonts w:ascii="Nirmala UI" w:hAnsi="Nirmala UI" w:cs="Nirmala UI"/>
@@ -2849,7 +3045,6 @@
               </w:rPr>
               <w:t xml:space="preserve"> </w:t>
             </w:r>
-            <w:proofErr w:type="spellStart"/>
             <w:r>
               <w:rPr>
                 <w:rFonts w:ascii="Nirmala UI" w:hAnsi="Nirmala UI" w:cs="Nirmala UI" w:hint="cs"/>
@@ -2857,7 +3052,6 @@
               </w:rPr>
               <w:t>प्रोग्रामर्</w:t>
             </w:r>
-            <w:proofErr w:type="spellEnd"/>
             <w:r>
               <w:rPr>
                 <w:rFonts w:ascii="Nirmala UI" w:hAnsi="Nirmala UI" w:cs="Nirmala UI"/>
@@ -2865,7 +3059,6 @@
               </w:rPr>
               <w:t xml:space="preserve"> </w:t>
             </w:r>
-            <w:proofErr w:type="spellStart"/>
             <w:r>
               <w:rPr>
                 <w:rFonts w:ascii="Nirmala UI" w:hAnsi="Nirmala UI" w:cs="Nirmala UI" w:hint="cs"/>
@@ -2873,7 +3066,6 @@
               </w:rPr>
               <w:t>कृते</w:t>
             </w:r>
-            <w:proofErr w:type="spellEnd"/>
             <w:r>
               <w:rPr>
                 <w:rFonts w:ascii="Nirmala UI" w:hAnsi="Nirmala UI" w:cs="Nirmala UI"/>
@@ -2881,7 +3073,6 @@
               </w:rPr>
               <w:t xml:space="preserve"> </w:t>
             </w:r>
-            <w:proofErr w:type="spellStart"/>
             <w:r>
               <w:rPr>
                 <w:rFonts w:ascii="Nirmala UI" w:hAnsi="Nirmala UI" w:cs="Nirmala UI" w:hint="cs"/>
@@ -2889,7 +3080,6 @@
               </w:rPr>
               <w:t>दोषान्वेषणे</w:t>
             </w:r>
-            <w:proofErr w:type="spellEnd"/>
             <w:r>
               <w:rPr>
                 <w:rFonts w:ascii="Nirmala UI" w:hAnsi="Nirmala UI" w:cs="Nirmala UI"/>
@@ -2897,7 +3087,6 @@
               </w:rPr>
               <w:t xml:space="preserve"> </w:t>
             </w:r>
-            <w:proofErr w:type="spellStart"/>
             <w:r>
               <w:rPr>
                 <w:rFonts w:ascii="Nirmala UI" w:hAnsi="Nirmala UI" w:cs="Nirmala UI" w:hint="cs"/>
@@ -2905,7 +3094,6 @@
               </w:rPr>
               <w:t>अपि</w:t>
             </w:r>
-            <w:proofErr w:type="spellEnd"/>
             <w:r>
               <w:rPr>
                 <w:rFonts w:ascii="Nirmala UI" w:hAnsi="Nirmala UI" w:cs="Nirmala UI"/>
@@ -2913,7 +3101,6 @@
               </w:rPr>
               <w:t xml:space="preserve"> </w:t>
             </w:r>
-            <w:proofErr w:type="spellStart"/>
             <w:r>
               <w:rPr>
                 <w:rFonts w:ascii="Nirmala UI" w:hAnsi="Nirmala UI" w:cs="Nirmala UI" w:hint="cs"/>
@@ -2921,7 +3108,6 @@
               </w:rPr>
               <w:t>साहाय्यं</w:t>
             </w:r>
-            <w:proofErr w:type="spellEnd"/>
             <w:r>
               <w:rPr>
                 <w:rFonts w:ascii="Nirmala UI" w:hAnsi="Nirmala UI" w:cs="Nirmala UI"/>
@@ -2929,21 +3115,12 @@
               </w:rPr>
               <w:t xml:space="preserve"> </w:t>
             </w:r>
-            <w:proofErr w:type="spellStart"/>
             <w:r>
               <w:rPr>
                 <w:rFonts w:ascii="Nirmala UI" w:hAnsi="Nirmala UI" w:cs="Nirmala UI" w:hint="cs"/>
                 <w:sz w:val="16"/>
               </w:rPr>
-              <w:t>करोति</w:t>
-            </w:r>
-            <w:proofErr w:type="spellEnd"/>
-            <w:r>
-              <w:rPr>
-                <w:rFonts w:ascii="Nirmala UI" w:hAnsi="Nirmala UI" w:cs="Nirmala UI" w:hint="cs"/>
-                <w:sz w:val="16"/>
-              </w:rPr>
-              <w:t>।</w:t>
+              <w:t>करोति।</w:t>
             </w:r>
           </w:p>
         </w:tc>
@@ -3003,13 +3180,7 @@
               <w:rPr>
                 <w:sz w:val="16"/>
               </w:rPr>
-              <w:t>inor lexical</w:t>
-            </w:r>
-            <w:r>
-              <w:rPr>
-                <w:sz w:val="16"/>
-              </w:rPr>
-              <w:t xml:space="preserve"> error, meaning preserved.</w:t>
+              <w:t>inor lexical error, meaning preserved.</w:t>
             </w:r>
           </w:p>
         </w:tc>
@@ -3024,7 +3195,6 @@
             <w:tcW w:w="2160" w:type="dxa"/>
           </w:tcPr>
           <w:p>
-            <w:proofErr w:type="spellStart"/>
             <w:r>
               <w:rPr>
                 <w:rFonts w:ascii="Nirmala UI" w:hAnsi="Nirmala UI" w:cs="Nirmala UI"/>
@@ -3032,14 +3202,12 @@
               </w:rPr>
               <w:t>विश्वासकारणादेव</w:t>
             </w:r>
-            <w:proofErr w:type="spellEnd"/>
             <w:r>
               <w:rPr>
                 <w:sz w:val="16"/>
               </w:rPr>
               <w:t xml:space="preserve"> </w:t>
             </w:r>
-            <w:proofErr w:type="spellStart"/>
             <w:r>
               <w:rPr>
                 <w:rFonts w:ascii="Nirmala UI" w:hAnsi="Nirmala UI" w:cs="Nirmala UI"/>
@@ -3047,14 +3215,12 @@
               </w:rPr>
               <w:t>समभाषि</w:t>
             </w:r>
-            <w:proofErr w:type="spellEnd"/>
             <w:r>
               <w:rPr>
                 <w:sz w:val="16"/>
               </w:rPr>
               <w:t xml:space="preserve"> </w:t>
             </w:r>
-            <w:proofErr w:type="spellStart"/>
             <w:r>
               <w:rPr>
                 <w:rFonts w:ascii="Nirmala UI" w:hAnsi="Nirmala UI" w:cs="Nirmala UI"/>
@@ -3062,28 +3228,31 @@
               </w:rPr>
               <w:t>मया</w:t>
             </w:r>
-            <w:proofErr w:type="spellEnd"/>
             <w:r>
               <w:rPr>
                 <w:sz w:val="16"/>
               </w:rPr>
               <w:t xml:space="preserve"> </w:t>
             </w:r>
-            <w:proofErr w:type="spellStart"/>
             <w:r>
               <w:rPr>
                 <w:rFonts w:ascii="Nirmala UI" w:hAnsi="Nirmala UI" w:cs="Nirmala UI"/>
                 <w:sz w:val="16"/>
               </w:rPr>
-              <w:t>वचः</w:t>
-            </w:r>
-            <w:proofErr w:type="spellEnd"/>
+              <w:t>वचः।</w:t>
+            </w:r>
+            <w:r>
+              <w:rPr>
+                <w:sz w:val="16"/>
+              </w:rPr>
+              <w:t xml:space="preserve"> </w:t>
+            </w:r>
             <w:r>
               <w:rPr>
                 <w:rFonts w:ascii="Nirmala UI" w:hAnsi="Nirmala UI" w:cs="Nirmala UI"/>
                 <w:sz w:val="16"/>
               </w:rPr>
-              <w:t>।</w:t>
+              <w:t>इति</w:t>
             </w:r>
             <w:r>
               <w:rPr>
@@ -3091,201 +3260,155 @@
               </w:rPr>
               <w:t xml:space="preserve"> </w:t>
             </w:r>
-            <w:proofErr w:type="spellStart"/>
             <w:r>
               <w:rPr>
                 <w:rFonts w:ascii="Nirmala UI" w:hAnsi="Nirmala UI" w:cs="Nirmala UI"/>
                 <w:sz w:val="16"/>
               </w:rPr>
-              <w:t>इति</w:t>
-            </w:r>
-            <w:proofErr w:type="spellEnd"/>
+              <w:t>यथा</w:t>
+            </w:r>
             <w:r>
               <w:rPr>
                 <w:sz w:val="16"/>
               </w:rPr>
               <w:t xml:space="preserve"> </w:t>
             </w:r>
-            <w:proofErr w:type="spellStart"/>
             <w:r>
               <w:rPr>
                 <w:rFonts w:ascii="Nirmala UI" w:hAnsi="Nirmala UI" w:cs="Nirmala UI"/>
                 <w:sz w:val="16"/>
               </w:rPr>
-              <w:t>यथा</w:t>
-            </w:r>
-            <w:proofErr w:type="spellEnd"/>
+              <w:t>शास्त्रे</w:t>
+            </w:r>
             <w:r>
               <w:rPr>
                 <w:sz w:val="16"/>
               </w:rPr>
               <w:t xml:space="preserve"> </w:t>
             </w:r>
-            <w:proofErr w:type="spellStart"/>
             <w:r>
               <w:rPr>
                 <w:rFonts w:ascii="Nirmala UI" w:hAnsi="Nirmala UI" w:cs="Nirmala UI"/>
                 <w:sz w:val="16"/>
               </w:rPr>
-              <w:t>शास्त्रे</w:t>
-            </w:r>
-            <w:proofErr w:type="spellEnd"/>
+              <w:t>लिखितं</w:t>
+            </w:r>
             <w:r>
               <w:rPr>
                 <w:sz w:val="16"/>
               </w:rPr>
               <w:t xml:space="preserve"> </w:t>
             </w:r>
-            <w:proofErr w:type="spellStart"/>
             <w:r>
               <w:rPr>
                 <w:rFonts w:ascii="Nirmala UI" w:hAnsi="Nirmala UI" w:cs="Nirmala UI"/>
                 <w:sz w:val="16"/>
               </w:rPr>
-              <w:t>लिखितं</w:t>
-            </w:r>
-            <w:proofErr w:type="spellEnd"/>
+              <w:t>तथैवास्माभिरपि</w:t>
+            </w:r>
             <w:r>
               <w:rPr>
                 <w:sz w:val="16"/>
               </w:rPr>
               <w:t xml:space="preserve"> </w:t>
             </w:r>
-            <w:proofErr w:type="spellStart"/>
             <w:r>
               <w:rPr>
                 <w:rFonts w:ascii="Nirmala UI" w:hAnsi="Nirmala UI" w:cs="Nirmala UI"/>
                 <w:sz w:val="16"/>
               </w:rPr>
-              <w:t>तथैवास्माभिरपि</w:t>
-            </w:r>
-            <w:proofErr w:type="spellEnd"/>
+              <w:t>विश्वासजनकम्</w:t>
+            </w:r>
             <w:r>
               <w:rPr>
                 <w:sz w:val="16"/>
               </w:rPr>
               <w:t xml:space="preserve"> </w:t>
             </w:r>
-            <w:proofErr w:type="spellStart"/>
             <w:r>
               <w:rPr>
                 <w:rFonts w:ascii="Nirmala UI" w:hAnsi="Nirmala UI" w:cs="Nirmala UI"/>
                 <w:sz w:val="16"/>
               </w:rPr>
-              <w:t>विश्वासजनकम्</w:t>
-            </w:r>
-            <w:proofErr w:type="spellEnd"/>
+              <w:t>आत्मानं</w:t>
+            </w:r>
             <w:r>
               <w:rPr>
                 <w:sz w:val="16"/>
               </w:rPr>
               <w:t xml:space="preserve"> </w:t>
             </w:r>
-            <w:proofErr w:type="spellStart"/>
             <w:r>
               <w:rPr>
                 <w:rFonts w:ascii="Nirmala UI" w:hAnsi="Nirmala UI" w:cs="Nirmala UI"/>
                 <w:sz w:val="16"/>
               </w:rPr>
-              <w:t>आत्मानं</w:t>
-            </w:r>
-            <w:proofErr w:type="spellEnd"/>
+              <w:t>प्राप्य</w:t>
+            </w:r>
             <w:r>
               <w:rPr>
                 <w:sz w:val="16"/>
               </w:rPr>
               <w:t xml:space="preserve"> </w:t>
             </w:r>
-            <w:proofErr w:type="spellStart"/>
             <w:r>
               <w:rPr>
                 <w:rFonts w:ascii="Nirmala UI" w:hAnsi="Nirmala UI" w:cs="Nirmala UI"/>
                 <w:sz w:val="16"/>
               </w:rPr>
-              <w:t>प्राप्य</w:t>
-            </w:r>
-            <w:proofErr w:type="spellEnd"/>
+              <w:t>विश्वासः</w:t>
+            </w:r>
             <w:r>
               <w:rPr>
                 <w:sz w:val="16"/>
               </w:rPr>
               <w:t xml:space="preserve"> </w:t>
             </w:r>
-            <w:proofErr w:type="spellStart"/>
             <w:r>
               <w:rPr>
                 <w:rFonts w:ascii="Nirmala UI" w:hAnsi="Nirmala UI" w:cs="Nirmala UI"/>
                 <w:sz w:val="16"/>
               </w:rPr>
-              <w:t>विश्वासः</w:t>
-            </w:r>
-            <w:proofErr w:type="spellEnd"/>
+              <w:t>क्रियते</w:t>
+            </w:r>
             <w:r>
               <w:rPr>
                 <w:sz w:val="16"/>
               </w:rPr>
               <w:t xml:space="preserve"> </w:t>
             </w:r>
-            <w:proofErr w:type="spellStart"/>
             <w:r>
               <w:rPr>
                 <w:rFonts w:ascii="Nirmala UI" w:hAnsi="Nirmala UI" w:cs="Nirmala UI"/>
                 <w:sz w:val="16"/>
               </w:rPr>
-              <w:t>क्रियते</w:t>
-            </w:r>
-            <w:proofErr w:type="spellEnd"/>
+              <w:t>तस्माच्च</w:t>
+            </w:r>
             <w:r>
               <w:rPr>
                 <w:sz w:val="16"/>
               </w:rPr>
               <w:t xml:space="preserve"> </w:t>
             </w:r>
-            <w:proofErr w:type="spellStart"/>
             <w:r>
               <w:rPr>
                 <w:rFonts w:ascii="Nirmala UI" w:hAnsi="Nirmala UI" w:cs="Nirmala UI"/>
                 <w:sz w:val="16"/>
               </w:rPr>
-              <w:t>तस्माच्च</w:t>
-            </w:r>
-            <w:proofErr w:type="spellEnd"/>
+              <w:t>वचांसि</w:t>
+            </w:r>
             <w:r>
               <w:rPr>
                 <w:sz w:val="16"/>
               </w:rPr>
               <w:t xml:space="preserve"> </w:t>
             </w:r>
-            <w:proofErr w:type="spellStart"/>
             <w:r>
               <w:rPr>
                 <w:rFonts w:ascii="Nirmala UI" w:hAnsi="Nirmala UI" w:cs="Nirmala UI"/>
                 <w:sz w:val="16"/>
               </w:rPr>
-              <w:t>वचांसि</w:t>
-            </w:r>
-            <w:proofErr w:type="spellEnd"/>
-            <w:r>
-              <w:rPr>
-                <w:sz w:val="16"/>
-              </w:rPr>
-              <w:t xml:space="preserve"> </w:t>
-            </w:r>
-            <w:proofErr w:type="spellStart"/>
-            <w:r>
-              <w:rPr>
-                <w:rFonts w:ascii="Nirmala UI" w:hAnsi="Nirmala UI" w:cs="Nirmala UI"/>
-                <w:sz w:val="16"/>
-              </w:rPr>
-              <w:t>भाष्यन्ते</w:t>
-            </w:r>
-            <w:proofErr w:type="spellEnd"/>
-            <w:r>
-              <w:rPr>
-                <w:rFonts w:ascii="Nirmala UI" w:hAnsi="Nirmala UI" w:cs="Nirmala UI"/>
-                <w:sz w:val="16"/>
-              </w:rPr>
-              <w:t>।</w:t>
+              <w:t>भाष्यन्ते।</w:t>
             </w:r>
           </w:p>
         </w:tc>
@@ -3364,7 +3487,6 @@
               </w:rPr>
               <w:t>"</w:t>
             </w:r>
-            <w:proofErr w:type="spellStart"/>
             <w:r>
               <w:rPr>
                 <w:rFonts w:ascii="Nirmala UI" w:hAnsi="Nirmala UI" w:cs="Nirmala UI" w:hint="cs"/>
@@ -3372,7 +3494,6 @@
               </w:rPr>
               <w:t>तदा</w:t>
             </w:r>
-            <w:proofErr w:type="spellEnd"/>
             <w:r>
               <w:rPr>
                 <w:rFonts w:ascii="Nirmala UI" w:hAnsi="Nirmala UI" w:cs="Nirmala UI"/>
@@ -3380,7 +3501,6 @@
               </w:rPr>
               <w:t xml:space="preserve">, </w:t>
             </w:r>
-            <w:proofErr w:type="spellStart"/>
             <w:r>
               <w:rPr>
                 <w:rFonts w:ascii="Nirmala UI" w:hAnsi="Nirmala UI" w:cs="Nirmala UI" w:hint="cs"/>
@@ -3388,7 +3508,6 @@
               </w:rPr>
               <w:t>तत्स्वयं</w:t>
             </w:r>
-            <w:proofErr w:type="spellEnd"/>
             <w:r>
               <w:rPr>
                 <w:rFonts w:ascii="Nirmala UI" w:hAnsi="Nirmala UI" w:cs="Nirmala UI"/>
@@ -3396,7 +3515,6 @@
               </w:rPr>
               <w:t xml:space="preserve"> </w:t>
             </w:r>
-            <w:proofErr w:type="spellStart"/>
             <w:r>
               <w:rPr>
                 <w:rFonts w:ascii="Nirmala UI" w:hAnsi="Nirmala UI" w:cs="Nirmala UI" w:hint="cs"/>
@@ -3404,7 +3522,6 @@
               </w:rPr>
               <w:t>ड्रैवर</w:t>
             </w:r>
-            <w:proofErr w:type="spellEnd"/>
             <w:r>
               <w:rPr>
                 <w:rFonts w:ascii="Nirmala UI" w:hAnsi="Nirmala UI" w:cs="Nirmala UI"/>
@@ -3412,7 +3529,6 @@
               </w:rPr>
               <w:t xml:space="preserve"> </w:t>
             </w:r>
-            <w:proofErr w:type="spellStart"/>
             <w:r>
               <w:rPr>
                 <w:rFonts w:ascii="Nirmala UI" w:hAnsi="Nirmala UI" w:cs="Nirmala UI" w:hint="cs"/>
@@ -3420,7 +3536,6 @@
               </w:rPr>
               <w:t>निमित्तम्</w:t>
             </w:r>
-            <w:proofErr w:type="spellEnd"/>
             <w:r>
               <w:rPr>
                 <w:rFonts w:ascii="Nirmala UI" w:hAnsi="Nirmala UI" w:cs="Nirmala UI"/>
@@ -3428,76 +3543,54 @@
               </w:rPr>
               <w:t xml:space="preserve"> </w:t>
             </w:r>
-            <w:proofErr w:type="spellStart"/>
             <w:r>
               <w:rPr>
                 <w:rFonts w:ascii="Nirmala UI" w:hAnsi="Nirmala UI" w:cs="Nirmala UI" w:hint="cs"/>
                 <w:sz w:val="16"/>
               </w:rPr>
-              <w:t>अन्वेष्यति</w:t>
-            </w:r>
-            <w:proofErr w:type="spellEnd"/>
+              <w:t>अन्वेष्यति।</w:t>
+            </w:r>
+            <w:r>
+              <w:rPr>
+                <w:rFonts w:ascii="Nirmala UI" w:hAnsi="Nirmala UI" w:cs="Nirmala UI"/>
+                <w:sz w:val="16"/>
+              </w:rPr>
+              <w:t xml:space="preserve"> </w:t>
+            </w:r>
             <w:r>
               <w:rPr>
                 <w:rFonts w:ascii="Nirmala UI" w:hAnsi="Nirmala UI" w:cs="Nirmala UI" w:hint="cs"/>
                 <w:sz w:val="16"/>
               </w:rPr>
-              <w:t>।</w:t>
+              <w:t>अहं</w:t>
             </w:r>
             <w:r>
               <w:rPr>
                 <w:rFonts w:ascii="Nirmala UI" w:hAnsi="Nirmala UI" w:cs="Nirmala UI"/>
                 <w:sz w:val="16"/>
               </w:rPr>
+              <w:t xml:space="preserve"> 'Cancel' </w:t>
+            </w:r>
+            <w:r>
+              <w:rPr>
+                <w:rFonts w:ascii="Nirmala UI" w:hAnsi="Nirmala UI" w:cs="Nirmala UI" w:hint="cs"/>
+                <w:sz w:val="16"/>
+              </w:rPr>
+              <w:t>इत्यस्योपरि</w:t>
+            </w:r>
+            <w:r>
+              <w:rPr>
+                <w:rFonts w:ascii="Nirmala UI" w:hAnsi="Nirmala UI" w:cs="Nirmala UI"/>
+                <w:sz w:val="16"/>
+              </w:rPr>
               <w:t xml:space="preserve"> </w:t>
             </w:r>
-            <w:proofErr w:type="spellStart"/>
             <w:r>
               <w:rPr>
                 <w:rFonts w:ascii="Nirmala UI" w:hAnsi="Nirmala UI" w:cs="Nirmala UI" w:hint="cs"/>
                 <w:sz w:val="16"/>
               </w:rPr>
-              <w:t>अहं</w:t>
-            </w:r>
-            <w:proofErr w:type="spellEnd"/>
-            <w:r>
-              <w:rPr>
-                <w:rFonts w:ascii="Nirmala UI" w:hAnsi="Nirmala UI" w:cs="Nirmala UI"/>
-                <w:sz w:val="16"/>
-              </w:rPr>
-              <w:t xml:space="preserve"> 'Cancel' </w:t>
-            </w:r>
-            <w:proofErr w:type="spellStart"/>
-            <w:r>
-              <w:rPr>
-                <w:rFonts w:ascii="Nirmala UI" w:hAnsi="Nirmala UI" w:cs="Nirmala UI" w:hint="cs"/>
-                <w:sz w:val="16"/>
-              </w:rPr>
-              <w:t>इत्यस्योपरि</w:t>
-            </w:r>
-            <w:proofErr w:type="spellEnd"/>
-            <w:r>
-              <w:rPr>
-                <w:rFonts w:ascii="Nirmala UI" w:hAnsi="Nirmala UI" w:cs="Nirmala UI"/>
-                <w:sz w:val="16"/>
-              </w:rPr>
-              <w:t xml:space="preserve"> </w:t>
-            </w:r>
-            <w:proofErr w:type="spellStart"/>
-            <w:r>
-              <w:rPr>
-                <w:rFonts w:ascii="Nirmala UI" w:hAnsi="Nirmala UI" w:cs="Nirmala UI" w:hint="cs"/>
-                <w:sz w:val="16"/>
-              </w:rPr>
-              <w:t>नुदामि</w:t>
-            </w:r>
-            <w:proofErr w:type="spellEnd"/>
-            <w:r>
-              <w:rPr>
-                <w:rFonts w:ascii="Nirmala UI" w:hAnsi="Nirmala UI" w:cs="Nirmala UI" w:hint="cs"/>
-                <w:sz w:val="16"/>
-              </w:rPr>
-              <w:t>।</w:t>
+              <w:t>नुदामि।</w:t>
             </w:r>
             <w:r>
               <w:rPr>
@@ -3589,7 +3682,6 @@
               </w:rPr>
               <w:t>"</w:t>
             </w:r>
-            <w:proofErr w:type="spellStart"/>
             <w:r>
               <w:rPr>
                 <w:rFonts w:ascii="Nirmala UI" w:hAnsi="Nirmala UI" w:cs="Nirmala UI" w:hint="cs"/>
@@ -3597,7 +3689,6 @@
               </w:rPr>
               <w:t>सर्वेभ्यः</w:t>
             </w:r>
-            <w:proofErr w:type="spellEnd"/>
             <w:r>
               <w:rPr>
                 <w:rFonts w:ascii="Nirmala UI" w:hAnsi="Nirmala UI" w:cs="Nirmala UI"/>
@@ -3605,7 +3696,6 @@
               </w:rPr>
               <w:t xml:space="preserve"> </w:t>
             </w:r>
-            <w:proofErr w:type="spellStart"/>
             <w:r>
               <w:rPr>
                 <w:rFonts w:ascii="Nirmala UI" w:hAnsi="Nirmala UI" w:cs="Nirmala UI" w:hint="cs"/>
@@ -3627,7 +3717,6 @@
               </w:rPr>
               <w:t>अर्थम्</w:t>
             </w:r>
-            <w:proofErr w:type="spellEnd"/>
             <w:r>
               <w:rPr>
                 <w:rFonts w:ascii="Nirmala UI" w:hAnsi="Nirmala UI" w:cs="Nirmala UI"/>
@@ -3635,7 +3724,6 @@
               </w:rPr>
               <w:t xml:space="preserve">, iterator </w:t>
             </w:r>
-            <w:proofErr w:type="spellStart"/>
             <w:r>
               <w:rPr>
                 <w:rFonts w:ascii="Nirmala UI" w:hAnsi="Nirmala UI" w:cs="Nirmala UI" w:hint="cs"/>
@@ -3643,7 +3731,6 @@
               </w:rPr>
               <w:t>इतीदं</w:t>
             </w:r>
-            <w:proofErr w:type="spellEnd"/>
             <w:r>
               <w:rPr>
                 <w:rFonts w:ascii="Nirmala UI" w:hAnsi="Nirmala UI" w:cs="Nirmala UI"/>
@@ -3651,7 +3738,6 @@
               </w:rPr>
               <w:t xml:space="preserve"> </w:t>
             </w:r>
-            <w:proofErr w:type="spellStart"/>
             <w:r>
               <w:rPr>
                 <w:rFonts w:ascii="Nirmala UI" w:hAnsi="Nirmala UI" w:cs="Nirmala UI" w:hint="cs"/>
@@ -3659,7 +3745,6 @@
               </w:rPr>
               <w:t>प्रत्येकस्मै</w:t>
             </w:r>
-            <w:proofErr w:type="spellEnd"/>
             <w:r>
               <w:rPr>
                 <w:rFonts w:ascii="Nirmala UI" w:hAnsi="Nirmala UI" w:cs="Nirmala UI"/>
@@ -3667,7 +3752,6 @@
               </w:rPr>
               <w:t xml:space="preserve"> </w:t>
             </w:r>
-            <w:proofErr w:type="spellStart"/>
             <w:r>
               <w:rPr>
                 <w:rFonts w:ascii="Nirmala UI" w:hAnsi="Nirmala UI" w:cs="Nirmala UI" w:hint="cs"/>
@@ -3703,7 +3787,6 @@
               </w:rPr>
               <w:t>इत्यस्मै</w:t>
             </w:r>
-            <w:proofErr w:type="spellEnd"/>
             <w:r>
               <w:rPr>
                 <w:rFonts w:ascii="Nirmala UI" w:hAnsi="Nirmala UI" w:cs="Nirmala UI"/>
@@ -3711,7 +3794,6 @@
               </w:rPr>
               <w:t xml:space="preserve"> </w:t>
             </w:r>
-            <w:proofErr w:type="spellStart"/>
             <w:r>
               <w:rPr>
                 <w:rFonts w:ascii="Nirmala UI" w:hAnsi="Nirmala UI" w:cs="Nirmala UI" w:hint="cs"/>
@@ -3719,7 +3801,6 @@
               </w:rPr>
               <w:t>सेट्</w:t>
             </w:r>
-            <w:proofErr w:type="spellEnd"/>
             <w:r>
               <w:rPr>
                 <w:rFonts w:ascii="Nirmala UI" w:hAnsi="Nirmala UI" w:cs="Nirmala UI"/>
@@ -3727,15 +3808,14 @@
               </w:rPr>
               <w:t xml:space="preserve"> </w:t>
             </w:r>
-            <w:proofErr w:type="spellStart"/>
             <w:r>
               <w:rPr>
                 <w:rFonts w:ascii="Nirmala UI" w:hAnsi="Nirmala UI" w:cs="Nirmala UI" w:hint="cs"/>
                 <w:sz w:val="16"/>
               </w:rPr>
+              <w:lastRenderedPageBreak/>
               <w:t>क्रियते</w:t>
             </w:r>
-            <w:proofErr w:type="spellEnd"/>
             <w:r>
               <w:rPr>
                 <w:rFonts w:ascii="Nirmala UI" w:hAnsi="Nirmala UI" w:cs="Nirmala UI"/>
@@ -3757,7 +3837,6 @@
               </w:rPr>
               <w:t xml:space="preserve"> 1,1 </w:t>
             </w:r>
-            <w:proofErr w:type="spellStart"/>
             <w:r>
               <w:rPr>
                 <w:rFonts w:ascii="Nirmala UI" w:hAnsi="Nirmala UI" w:cs="Nirmala UI" w:hint="cs"/>
@@ -3765,23 +3844,13 @@
               </w:rPr>
               <w:t>पश्चात्</w:t>
             </w:r>
-            <w:proofErr w:type="spellEnd"/>
             <w:r>
               <w:rPr>
                 <w:rFonts w:ascii="Nirmala UI" w:hAnsi="Nirmala UI" w:cs="Nirmala UI"/>
                 <w:sz w:val="16"/>
               </w:rPr>
-              <w:t xml:space="preserve"> 1,</w:t>
-            </w:r>
-            <w:proofErr w:type="gramStart"/>
-            <w:r>
-              <w:rPr>
-                <w:rFonts w:ascii="Nirmala UI" w:hAnsi="Nirmala UI" w:cs="Nirmala UI"/>
-                <w:sz w:val="16"/>
-              </w:rPr>
-              <w:t xml:space="preserve">2  </w:t>
-            </w:r>
-            <w:proofErr w:type="spellStart"/>
+              <w:t xml:space="preserve"> 1,2  </w:t>
+            </w:r>
             <w:r>
               <w:rPr>
                 <w:rFonts w:ascii="Nirmala UI" w:hAnsi="Nirmala UI" w:cs="Nirmala UI" w:hint="cs"/>
@@ -3789,8 +3858,6 @@
               </w:rPr>
               <w:t>एवम्</w:t>
             </w:r>
-            <w:proofErr w:type="spellEnd"/>
-            <w:proofErr w:type="gramEnd"/>
             <w:r>
               <w:rPr>
                 <w:rFonts w:ascii="Nirmala UI" w:hAnsi="Nirmala UI" w:cs="Nirmala UI" w:hint="eastAsia"/>
@@ -3822,21 +3889,15 @@
               <w:rPr>
                 <w:sz w:val="16"/>
               </w:rPr>
-              <w:t xml:space="preserve">"The iterator will be set to each of the </w:t>
-            </w:r>
-            <w:proofErr w:type="gramStart"/>
-            <w:r>
-              <w:rPr>
-                <w:sz w:val="16"/>
-              </w:rPr>
-              <w:t>indices</w:t>
-            </w:r>
-            <w:proofErr w:type="gramEnd"/>
-            <w:r>
-              <w:rPr>
-                <w:sz w:val="16"/>
-              </w:rPr>
-              <w:t xml:space="preserve"> values for each iteration- say, 1 comma 1, then 1 comma 2 and so on."</w:t>
+              <w:lastRenderedPageBreak/>
+              <w:t xml:space="preserve">"The iterator will be set to each of the indices values for each iteration- say, 1 comma </w:t>
+            </w:r>
+            <w:r>
+              <w:rPr>
+                <w:sz w:val="16"/>
+              </w:rPr>
+              <w:lastRenderedPageBreak/>
+              <w:t>1, then 1 comma 2 and so on."</w:t>
             </w:r>
           </w:p>
         </w:tc>
@@ -3855,6 +3916,7 @@
               <w:rPr>
                 <w:sz w:val="16"/>
               </w:rPr>
+              <w:lastRenderedPageBreak/>
               <w:t>"For all iterations, the iterator is set to an index value for each of them."</w:t>
             </w:r>
           </w:p>
@@ -3889,7 +3951,6 @@
             <w:tcW w:w="2160" w:type="dxa"/>
           </w:tcPr>
           <w:p>
-            <w:proofErr w:type="spellStart"/>
             <w:r>
               <w:rPr>
                 <w:rFonts w:ascii="Nirmala UI" w:hAnsi="Nirmala UI" w:cs="Nirmala UI"/>
@@ -3897,14 +3958,12 @@
               </w:rPr>
               <w:t>अपरं</w:t>
             </w:r>
-            <w:proofErr w:type="spellEnd"/>
             <w:r>
               <w:rPr>
                 <w:sz w:val="16"/>
               </w:rPr>
               <w:t xml:space="preserve"> </w:t>
             </w:r>
-            <w:proofErr w:type="spellStart"/>
             <w:r>
               <w:rPr>
                 <w:rFonts w:ascii="Nirmala UI" w:hAnsi="Nirmala UI" w:cs="Nirmala UI"/>
@@ -3912,14 +3971,12 @@
               </w:rPr>
               <w:t>द्वितीयमुद्रायां</w:t>
             </w:r>
-            <w:proofErr w:type="spellEnd"/>
             <w:r>
               <w:rPr>
                 <w:sz w:val="16"/>
               </w:rPr>
               <w:t xml:space="preserve"> </w:t>
             </w:r>
-            <w:proofErr w:type="spellStart"/>
             <w:r>
               <w:rPr>
                 <w:rFonts w:ascii="Nirmala UI" w:hAnsi="Nirmala UI" w:cs="Nirmala UI"/>
@@ -3927,14 +3984,12 @@
               </w:rPr>
               <w:t>तेन</w:t>
             </w:r>
-            <w:proofErr w:type="spellEnd"/>
             <w:r>
               <w:rPr>
                 <w:sz w:val="16"/>
               </w:rPr>
               <w:t xml:space="preserve"> </w:t>
             </w:r>
-            <w:proofErr w:type="spellStart"/>
             <w:r>
               <w:rPr>
                 <w:rFonts w:ascii="Nirmala UI" w:hAnsi="Nirmala UI" w:cs="Nirmala UI"/>
@@ -3942,14 +3997,12 @@
               </w:rPr>
               <w:t>मोचितायां</w:t>
             </w:r>
-            <w:proofErr w:type="spellEnd"/>
             <w:r>
               <w:rPr>
                 <w:sz w:val="16"/>
               </w:rPr>
               <w:t xml:space="preserve"> </w:t>
             </w:r>
-            <w:proofErr w:type="spellStart"/>
             <w:r>
               <w:rPr>
                 <w:rFonts w:ascii="Nirmala UI" w:hAnsi="Nirmala UI" w:cs="Nirmala UI"/>
@@ -3957,14 +4010,12 @@
               </w:rPr>
               <w:t>द्वितीयस्य</w:t>
             </w:r>
-            <w:proofErr w:type="spellEnd"/>
             <w:r>
               <w:rPr>
                 <w:sz w:val="16"/>
               </w:rPr>
               <w:t xml:space="preserve"> </w:t>
             </w:r>
-            <w:proofErr w:type="spellStart"/>
             <w:r>
               <w:rPr>
                 <w:rFonts w:ascii="Nirmala UI" w:hAnsi="Nirmala UI" w:cs="Nirmala UI"/>
@@ -3972,14 +4023,12 @@
               </w:rPr>
               <w:t>प्राणिन</w:t>
             </w:r>
-            <w:proofErr w:type="spellEnd"/>
             <w:r>
               <w:rPr>
                 <w:sz w:val="16"/>
               </w:rPr>
               <w:t xml:space="preserve"> </w:t>
             </w:r>
-            <w:proofErr w:type="spellStart"/>
             <w:r>
               <w:rPr>
                 <w:rFonts w:ascii="Nirmala UI" w:hAnsi="Nirmala UI" w:cs="Nirmala UI"/>
@@ -3987,14 +4036,12 @@
               </w:rPr>
               <w:t>आगत्य</w:t>
             </w:r>
-            <w:proofErr w:type="spellEnd"/>
             <w:r>
               <w:rPr>
                 <w:sz w:val="16"/>
               </w:rPr>
               <w:t xml:space="preserve"> </w:t>
             </w:r>
-            <w:proofErr w:type="spellStart"/>
             <w:r>
               <w:rPr>
                 <w:rFonts w:ascii="Nirmala UI" w:hAnsi="Nirmala UI" w:cs="Nirmala UI"/>
@@ -4002,14 +4049,12 @@
               </w:rPr>
               <w:t>पश्येति</w:t>
             </w:r>
-            <w:proofErr w:type="spellEnd"/>
             <w:r>
               <w:rPr>
                 <w:sz w:val="16"/>
               </w:rPr>
               <w:t xml:space="preserve"> </w:t>
             </w:r>
-            <w:proofErr w:type="spellStart"/>
             <w:r>
               <w:rPr>
                 <w:rFonts w:ascii="Nirmala UI" w:hAnsi="Nirmala UI" w:cs="Nirmala UI"/>
@@ -4017,14 +4062,12 @@
               </w:rPr>
               <w:t>वाक्</w:t>
             </w:r>
-            <w:proofErr w:type="spellEnd"/>
             <w:r>
               <w:rPr>
                 <w:sz w:val="16"/>
               </w:rPr>
               <w:t xml:space="preserve"> </w:t>
             </w:r>
-            <w:proofErr w:type="spellStart"/>
             <w:r>
               <w:rPr>
                 <w:rFonts w:ascii="Nirmala UI" w:hAnsi="Nirmala UI" w:cs="Nirmala UI"/>
@@ -4032,28 +4075,18 @@
               </w:rPr>
               <w:t>मया</w:t>
             </w:r>
-            <w:proofErr w:type="spellEnd"/>
             <w:r>
               <w:rPr>
                 <w:sz w:val="16"/>
               </w:rPr>
               <w:t xml:space="preserve"> </w:t>
             </w:r>
-            <w:proofErr w:type="spellStart"/>
             <w:r>
               <w:rPr>
                 <w:rFonts w:ascii="Nirmala UI" w:hAnsi="Nirmala UI" w:cs="Nirmala UI"/>
                 <w:sz w:val="16"/>
               </w:rPr>
-              <w:t>श्रुता</w:t>
-            </w:r>
-            <w:proofErr w:type="spellEnd"/>
-            <w:r>
-              <w:rPr>
-                <w:rFonts w:ascii="Nirmala UI" w:hAnsi="Nirmala UI" w:cs="Nirmala UI"/>
-                <w:sz w:val="16"/>
-              </w:rPr>
-              <w:t>।</w:t>
+              <w:t>श्रुता।</w:t>
             </w:r>
           </w:p>
         </w:tc>
@@ -4132,7 +4165,6 @@
               </w:rPr>
               <w:t>"</w:t>
             </w:r>
-            <w:proofErr w:type="spellStart"/>
             <w:r>
               <w:rPr>
                 <w:rFonts w:ascii="Nirmala UI" w:hAnsi="Nirmala UI" w:cs="Nirmala UI" w:hint="cs"/>
@@ -4140,7 +4172,6 @@
               </w:rPr>
               <w:t>वयम्</w:t>
             </w:r>
-            <w:proofErr w:type="spellEnd"/>
             <w:r>
               <w:rPr>
                 <w:rFonts w:ascii="Nirmala UI" w:hAnsi="Nirmala UI" w:cs="Nirmala UI"/>
@@ -4148,7 +4179,6 @@
               </w:rPr>
               <w:t xml:space="preserve">, </w:t>
             </w:r>
-            <w:proofErr w:type="spellStart"/>
             <w:r>
               <w:rPr>
                 <w:rFonts w:ascii="Nirmala UI" w:hAnsi="Nirmala UI" w:cs="Nirmala UI" w:hint="cs"/>
@@ -4156,7 +4186,6 @@
               </w:rPr>
               <w:t>ओब्जेक्ट्स्</w:t>
             </w:r>
-            <w:proofErr w:type="spellEnd"/>
             <w:r>
               <w:rPr>
                 <w:rFonts w:ascii="Nirmala UI" w:hAnsi="Nirmala UI" w:cs="Nirmala UI"/>
@@ -4164,7 +4193,6 @@
               </w:rPr>
               <w:t xml:space="preserve"> </w:t>
             </w:r>
-            <w:proofErr w:type="spellStart"/>
             <w:r>
               <w:rPr>
                 <w:rFonts w:ascii="Nirmala UI" w:hAnsi="Nirmala UI" w:cs="Nirmala UI" w:hint="cs"/>
@@ -4172,7 +4200,6 @@
               </w:rPr>
               <w:t>स्वकीयान्</w:t>
             </w:r>
-            <w:proofErr w:type="spellEnd"/>
             <w:r>
               <w:rPr>
                 <w:rFonts w:ascii="Nirmala UI" w:hAnsi="Nirmala UI" w:cs="Nirmala UI"/>
@@ -4180,8 +4207,6 @@
               </w:rPr>
               <w:t xml:space="preserve"> </w:t>
             </w:r>
-            <w:proofErr w:type="spellStart"/>
-            <w:proofErr w:type="gramStart"/>
             <w:r>
               <w:rPr>
                 <w:rFonts w:ascii="Nirmala UI" w:hAnsi="Nirmala UI" w:cs="Nirmala UI" w:hint="cs"/>
@@ -4189,7 +4214,6 @@
               </w:rPr>
               <w:t>स्थितीन्</w:t>
             </w:r>
-            <w:proofErr w:type="spellEnd"/>
             <w:r>
               <w:rPr>
                 <w:rFonts w:ascii="Nirmala UI" w:hAnsi="Nirmala UI" w:cs="Nirmala UI"/>
@@ -4197,7 +4221,6 @@
               </w:rPr>
               <w:t xml:space="preserve">  </w:t>
             </w:r>
-            <w:proofErr w:type="spellStart"/>
             <w:r>
               <w:rPr>
                 <w:rFonts w:ascii="Nirmala UI" w:hAnsi="Nirmala UI" w:cs="Nirmala UI" w:hint="cs"/>
@@ -4205,8 +4228,6 @@
               </w:rPr>
               <w:t>फील्ड्स्</w:t>
             </w:r>
-            <w:proofErr w:type="spellEnd"/>
-            <w:proofErr w:type="gramEnd"/>
             <w:r>
               <w:rPr>
                 <w:rFonts w:ascii="Nirmala UI" w:hAnsi="Nirmala UI" w:cs="Nirmala UI"/>
@@ -4214,7 +4235,6 @@
               </w:rPr>
               <w:t xml:space="preserve"> </w:t>
             </w:r>
-            <w:proofErr w:type="spellStart"/>
             <w:r>
               <w:rPr>
                 <w:rFonts w:ascii="Nirmala UI" w:hAnsi="Nirmala UI" w:cs="Nirmala UI" w:hint="cs"/>
@@ -4222,7 +4242,6 @@
               </w:rPr>
               <w:t>मध्ये</w:t>
             </w:r>
-            <w:proofErr w:type="spellEnd"/>
             <w:r>
               <w:rPr>
                 <w:rFonts w:ascii="Nirmala UI" w:hAnsi="Nirmala UI" w:cs="Nirmala UI"/>
@@ -4230,7 +4249,6 @@
               </w:rPr>
               <w:t xml:space="preserve"> </w:t>
             </w:r>
-            <w:proofErr w:type="spellStart"/>
             <w:r>
               <w:rPr>
                 <w:rFonts w:ascii="Nirmala UI" w:hAnsi="Nirmala UI" w:cs="Nirmala UI" w:hint="cs"/>
@@ -4238,7 +4256,6 @@
               </w:rPr>
               <w:t>स्टोर्</w:t>
             </w:r>
-            <w:proofErr w:type="spellEnd"/>
             <w:r>
               <w:rPr>
                 <w:rFonts w:ascii="Nirmala UI" w:hAnsi="Nirmala UI" w:cs="Nirmala UI"/>
@@ -4246,7 +4263,6 @@
               </w:rPr>
               <w:t xml:space="preserve"> </w:t>
             </w:r>
-            <w:proofErr w:type="spellStart"/>
             <w:r>
               <w:rPr>
                 <w:rFonts w:ascii="Nirmala UI" w:hAnsi="Nirmala UI" w:cs="Nirmala UI" w:hint="cs"/>
@@ -4254,7 +4270,6 @@
               </w:rPr>
               <w:t>कुर्वन्तीति</w:t>
             </w:r>
-            <w:proofErr w:type="spellEnd"/>
             <w:r>
               <w:rPr>
                 <w:rFonts w:ascii="Nirmala UI" w:hAnsi="Nirmala UI" w:cs="Nirmala UI"/>
@@ -4262,7 +4277,6 @@
               </w:rPr>
               <w:t xml:space="preserve"> </w:t>
             </w:r>
-            <w:proofErr w:type="spellStart"/>
             <w:r>
               <w:rPr>
                 <w:rFonts w:ascii="Nirmala UI" w:hAnsi="Nirmala UI" w:cs="Nirmala UI" w:hint="cs"/>
@@ -4270,7 +4284,6 @@
               </w:rPr>
               <w:t>ज्ञातवन्तः</w:t>
             </w:r>
-            <w:proofErr w:type="spellEnd"/>
             <w:r>
               <w:rPr>
                 <w:rFonts w:ascii="Nirmala UI" w:hAnsi="Nirmala UI" w:cs="Nirmala UI"/>
@@ -4362,7 +4375,6 @@
             <w:tcW w:w="2160" w:type="dxa"/>
           </w:tcPr>
           <w:p>
-            <w:proofErr w:type="spellStart"/>
             <w:r>
               <w:rPr>
                 <w:rFonts w:ascii="Nirmala UI" w:hAnsi="Nirmala UI" w:cs="Nirmala UI"/>
@@ -4370,14 +4382,12 @@
               </w:rPr>
               <w:t>बाल</w:t>
             </w:r>
-            <w:proofErr w:type="spellEnd"/>
             <w:r>
               <w:rPr>
                 <w:sz w:val="16"/>
               </w:rPr>
               <w:t xml:space="preserve">: </w:t>
             </w:r>
-            <w:proofErr w:type="spellStart"/>
             <w:r>
               <w:rPr>
                 <w:rFonts w:ascii="Nirmala UI" w:hAnsi="Nirmala UI" w:cs="Nirmala UI"/>
@@ -4385,14 +4395,12 @@
               </w:rPr>
               <w:t>युष्मासु</w:t>
             </w:r>
-            <w:proofErr w:type="spellEnd"/>
             <w:r>
               <w:rPr>
                 <w:sz w:val="16"/>
               </w:rPr>
               <w:t xml:space="preserve"> </w:t>
             </w:r>
-            <w:proofErr w:type="spellStart"/>
             <w:r>
               <w:rPr>
                 <w:rFonts w:ascii="Nirmala UI" w:hAnsi="Nirmala UI" w:cs="Nirmala UI"/>
@@ -4400,14 +4408,12 @@
               </w:rPr>
               <w:t>विश्वासं</w:t>
             </w:r>
-            <w:proofErr w:type="spellEnd"/>
             <w:r>
               <w:rPr>
                 <w:sz w:val="16"/>
               </w:rPr>
               <w:t xml:space="preserve"> </w:t>
             </w:r>
-            <w:proofErr w:type="spellStart"/>
             <w:r>
               <w:rPr>
                 <w:rFonts w:ascii="Nirmala UI" w:hAnsi="Nirmala UI" w:cs="Nirmala UI"/>
@@ -4415,7 +4421,6 @@
               </w:rPr>
               <w:t>करोति</w:t>
             </w:r>
-            <w:proofErr w:type="spellEnd"/>
             <w:r>
               <w:rPr>
                 <w:sz w:val="16"/>
@@ -4499,7 +4504,6 @@
             <w:tcW w:w="2160" w:type="dxa"/>
           </w:tcPr>
           <w:p>
-            <w:proofErr w:type="spellStart"/>
             <w:r>
               <w:rPr>
                 <w:rFonts w:ascii="Nirmala UI" w:hAnsi="Nirmala UI" w:cs="Nirmala UI" w:hint="cs"/>
@@ -4507,7 +4511,6 @@
               </w:rPr>
               <w:t>प्रकृति</w:t>
             </w:r>
-            <w:proofErr w:type="spellEnd"/>
             <w:r>
               <w:rPr>
                 <w:rFonts w:ascii="Nirmala UI" w:hAnsi="Nirmala UI" w:cs="Nirmala UI"/>
@@ -4515,7 +4518,6 @@
               </w:rPr>
               <w:t xml:space="preserve"> </w:t>
             </w:r>
-            <w:proofErr w:type="spellStart"/>
             <w:r>
               <w:rPr>
                 <w:rFonts w:ascii="Nirmala UI" w:hAnsi="Nirmala UI" w:cs="Nirmala UI" w:hint="cs"/>
@@ -4523,7 +4525,6 @@
               </w:rPr>
               <w:t>का</w:t>
             </w:r>
-            <w:proofErr w:type="spellEnd"/>
             <w:r>
               <w:rPr>
                 <w:rFonts w:ascii="Nirmala UI" w:hAnsi="Nirmala UI" w:cs="Nirmala UI"/>
@@ -4531,7 +4532,6 @@
               </w:rPr>
               <w:t xml:space="preserve"> </w:t>
             </w:r>
-            <w:proofErr w:type="spellStart"/>
             <w:r>
               <w:rPr>
                 <w:rFonts w:ascii="Nirmala UI" w:hAnsi="Nirmala UI" w:cs="Nirmala UI" w:hint="cs"/>
@@ -4539,7 +4539,6 @@
               </w:rPr>
               <w:t>अवलोकन</w:t>
             </w:r>
-            <w:proofErr w:type="spellEnd"/>
             <w:r>
               <w:rPr>
                 <w:rFonts w:ascii="Nirmala UI" w:hAnsi="Nirmala UI" w:cs="Nirmala UI"/>
@@ -4547,7 +4546,6 @@
               </w:rPr>
               <w:t xml:space="preserve"> </w:t>
             </w:r>
-            <w:proofErr w:type="spellStart"/>
             <w:r>
               <w:rPr>
                 <w:rFonts w:ascii="Nirmala UI" w:hAnsi="Nirmala UI" w:cs="Nirmala UI" w:hint="cs"/>
@@ -4555,7 +4553,6 @@
               </w:rPr>
               <w:t>करने</w:t>
             </w:r>
-            <w:proofErr w:type="spellEnd"/>
             <w:r>
               <w:rPr>
                 <w:rFonts w:ascii="Nirmala UI" w:hAnsi="Nirmala UI" w:cs="Nirmala UI"/>
@@ -4563,7 +4560,6 @@
               </w:rPr>
               <w:t xml:space="preserve"> </w:t>
             </w:r>
-            <w:proofErr w:type="spellStart"/>
             <w:r>
               <w:rPr>
                 <w:rFonts w:ascii="Nirmala UI" w:hAnsi="Nirmala UI" w:cs="Nirmala UI" w:hint="cs"/>
@@ -4571,7 +4567,6 @@
               </w:rPr>
               <w:t>से</w:t>
             </w:r>
-            <w:proofErr w:type="spellEnd"/>
             <w:r>
               <w:rPr>
                 <w:rFonts w:ascii="Nirmala UI" w:hAnsi="Nirmala UI" w:cs="Nirmala UI"/>
@@ -4579,7 +4574,6 @@
               </w:rPr>
               <w:t xml:space="preserve"> </w:t>
             </w:r>
-            <w:proofErr w:type="spellStart"/>
             <w:r>
               <w:rPr>
                 <w:rFonts w:ascii="Nirmala UI" w:hAnsi="Nirmala UI" w:cs="Nirmala UI" w:hint="cs"/>
@@ -4587,7 +4581,6 @@
               </w:rPr>
               <w:t>आप</w:t>
             </w:r>
-            <w:proofErr w:type="spellEnd"/>
             <w:r>
               <w:rPr>
                 <w:rFonts w:ascii="Nirmala UI" w:hAnsi="Nirmala UI" w:cs="Nirmala UI"/>
@@ -4595,7 +4588,6 @@
               </w:rPr>
               <w:t xml:space="preserve"> </w:t>
             </w:r>
-            <w:proofErr w:type="spellStart"/>
             <w:r>
               <w:rPr>
                 <w:rFonts w:ascii="Nirmala UI" w:hAnsi="Nirmala UI" w:cs="Nirmala UI" w:hint="cs"/>
@@ -4603,7 +4595,6 @@
               </w:rPr>
               <w:t>आश्चर्य</w:t>
             </w:r>
-            <w:proofErr w:type="spellEnd"/>
             <w:r>
               <w:rPr>
                 <w:rFonts w:ascii="Nirmala UI" w:hAnsi="Nirmala UI" w:cs="Nirmala UI"/>
@@ -4611,7 +4602,6 @@
               </w:rPr>
               <w:t xml:space="preserve"> </w:t>
             </w:r>
-            <w:proofErr w:type="spellStart"/>
             <w:r>
               <w:rPr>
                 <w:rFonts w:ascii="Nirmala UI" w:hAnsi="Nirmala UI" w:cs="Nirmala UI" w:hint="cs"/>
@@ -4619,7 +4609,6 @@
               </w:rPr>
               <w:t>चकित</w:t>
             </w:r>
-            <w:proofErr w:type="spellEnd"/>
             <w:r>
               <w:rPr>
                 <w:rFonts w:ascii="Nirmala UI" w:hAnsi="Nirmala UI" w:cs="Nirmala UI"/>
@@ -4627,7 +4616,6 @@
               </w:rPr>
               <w:t xml:space="preserve"> </w:t>
             </w:r>
-            <w:proofErr w:type="spellStart"/>
             <w:r>
               <w:rPr>
                 <w:rFonts w:ascii="Nirmala UI" w:hAnsi="Nirmala UI" w:cs="Nirmala UI" w:hint="cs"/>
@@ -4635,7 +4623,6 @@
               </w:rPr>
               <w:t>हो</w:t>
             </w:r>
-            <w:proofErr w:type="spellEnd"/>
             <w:r>
               <w:rPr>
                 <w:rFonts w:ascii="Nirmala UI" w:hAnsi="Nirmala UI" w:cs="Nirmala UI"/>
@@ -4643,7 +4630,6 @@
               </w:rPr>
               <w:t xml:space="preserve"> </w:t>
             </w:r>
-            <w:proofErr w:type="spellStart"/>
             <w:r>
               <w:rPr>
                 <w:rFonts w:ascii="Nirmala UI" w:hAnsi="Nirmala UI" w:cs="Nirmala UI" w:hint="cs"/>
@@ -4651,7 +4637,6 @@
               </w:rPr>
               <w:t>सकते</w:t>
             </w:r>
-            <w:proofErr w:type="spellEnd"/>
             <w:r>
               <w:rPr>
                 <w:rFonts w:ascii="Nirmala UI" w:hAnsi="Nirmala UI" w:cs="Nirmala UI"/>
@@ -4659,7 +4644,6 @@
               </w:rPr>
               <w:t xml:space="preserve"> </w:t>
             </w:r>
-            <w:proofErr w:type="spellStart"/>
             <w:r>
               <w:rPr>
                 <w:rFonts w:ascii="Nirmala UI" w:hAnsi="Nirmala UI" w:cs="Nirmala UI" w:hint="cs"/>
@@ -4667,7 +4651,6 @@
               </w:rPr>
               <w:t>है</w:t>
             </w:r>
-            <w:proofErr w:type="spellEnd"/>
             <w:r>
               <w:rPr>
                 <w:rFonts w:ascii="Nirmala UI" w:hAnsi="Nirmala UI" w:cs="Nirmala UI"/>
@@ -4752,7 +4735,6 @@
             <w:tcW w:w="2160" w:type="dxa"/>
           </w:tcPr>
           <w:p>
-            <w:proofErr w:type="spellStart"/>
             <w:r>
               <w:rPr>
                 <w:rFonts w:ascii="Nirmala UI" w:hAnsi="Nirmala UI" w:cs="Nirmala UI" w:hint="cs"/>
@@ -4760,7 +4742,6 @@
               </w:rPr>
               <w:t>यूयं</w:t>
             </w:r>
-            <w:proofErr w:type="spellEnd"/>
             <w:r>
               <w:rPr>
                 <w:rFonts w:ascii="Nirmala UI" w:hAnsi="Nirmala UI" w:cs="Nirmala UI"/>
@@ -4768,7 +4749,6 @@
               </w:rPr>
               <w:t xml:space="preserve"> </w:t>
             </w:r>
-            <w:proofErr w:type="spellStart"/>
             <w:r>
               <w:rPr>
                 <w:rFonts w:ascii="Nirmala UI" w:hAnsi="Nirmala UI" w:cs="Nirmala UI" w:hint="cs"/>
@@ -4776,7 +4756,6 @@
               </w:rPr>
               <w:t>कीदृक्</w:t>
             </w:r>
-            <w:proofErr w:type="spellEnd"/>
             <w:r>
               <w:rPr>
                 <w:rFonts w:ascii="Nirmala UI" w:hAnsi="Nirmala UI" w:cs="Nirmala UI"/>
@@ -4784,7 +4763,6 @@
               </w:rPr>
               <w:t xml:space="preserve"> </w:t>
             </w:r>
-            <w:proofErr w:type="spellStart"/>
             <w:r>
               <w:rPr>
                 <w:rFonts w:ascii="Nirmala UI" w:hAnsi="Nirmala UI" w:cs="Nirmala UI" w:hint="cs"/>
@@ -4792,7 +4770,6 @@
               </w:rPr>
               <w:t>तस्याज्ञा</w:t>
             </w:r>
-            <w:proofErr w:type="spellEnd"/>
             <w:r>
               <w:rPr>
                 <w:rFonts w:ascii="Nirmala UI" w:hAnsi="Nirmala UI" w:cs="Nirmala UI"/>
@@ -4800,7 +4777,6 @@
               </w:rPr>
               <w:t xml:space="preserve"> </w:t>
             </w:r>
-            <w:proofErr w:type="spellStart"/>
             <w:r>
               <w:rPr>
                 <w:rFonts w:ascii="Nirmala UI" w:hAnsi="Nirmala UI" w:cs="Nirmala UI" w:hint="cs"/>
@@ -4808,7 +4784,6 @@
               </w:rPr>
               <w:t>अपालयत</w:t>
             </w:r>
-            <w:proofErr w:type="spellEnd"/>
             <w:r>
               <w:rPr>
                 <w:rFonts w:ascii="Nirmala UI" w:hAnsi="Nirmala UI" w:cs="Nirmala UI"/>
@@ -4816,7 +4791,6 @@
               </w:rPr>
               <w:t xml:space="preserve"> </w:t>
             </w:r>
-            <w:proofErr w:type="spellStart"/>
             <w:r>
               <w:rPr>
                 <w:rFonts w:ascii="Nirmala UI" w:hAnsi="Nirmala UI" w:cs="Nirmala UI" w:hint="cs"/>
@@ -4824,7 +4798,6 @@
               </w:rPr>
               <w:t>भयकम्पाभ्यां</w:t>
             </w:r>
-            <w:proofErr w:type="spellEnd"/>
             <w:r>
               <w:rPr>
                 <w:rFonts w:ascii="Nirmala UI" w:hAnsi="Nirmala UI" w:cs="Nirmala UI"/>
@@ -4832,7 +4805,6 @@
               </w:rPr>
               <w:t xml:space="preserve"> </w:t>
             </w:r>
-            <w:proofErr w:type="spellStart"/>
             <w:r>
               <w:rPr>
                 <w:rFonts w:ascii="Nirmala UI" w:hAnsi="Nirmala UI" w:cs="Nirmala UI" w:hint="cs"/>
@@ -4840,7 +4812,6 @@
               </w:rPr>
               <w:t>तं</w:t>
             </w:r>
-            <w:proofErr w:type="spellEnd"/>
             <w:r>
               <w:rPr>
                 <w:rFonts w:ascii="Nirmala UI" w:hAnsi="Nirmala UI" w:cs="Nirmala UI"/>
@@ -4848,7 +4819,6 @@
               </w:rPr>
               <w:t xml:space="preserve"> </w:t>
             </w:r>
-            <w:proofErr w:type="spellStart"/>
             <w:r>
               <w:rPr>
                 <w:rFonts w:ascii="Nirmala UI" w:hAnsi="Nirmala UI" w:cs="Nirmala UI" w:hint="cs"/>
@@ -4856,7 +4826,6 @@
               </w:rPr>
               <w:t>गृहीतवन्तश्चैतस्य</w:t>
             </w:r>
-            <w:proofErr w:type="spellEnd"/>
             <w:r>
               <w:rPr>
                 <w:rFonts w:ascii="Nirmala UI" w:hAnsi="Nirmala UI" w:cs="Nirmala UI"/>
@@ -4864,7 +4833,6 @@
               </w:rPr>
               <w:t xml:space="preserve"> </w:t>
             </w:r>
-            <w:proofErr w:type="spellStart"/>
             <w:r>
               <w:rPr>
                 <w:rFonts w:ascii="Nirmala UI" w:hAnsi="Nirmala UI" w:cs="Nirmala UI" w:hint="cs"/>
@@ -4872,7 +4840,6 @@
               </w:rPr>
               <w:t>स्मरणाद्</w:t>
             </w:r>
-            <w:proofErr w:type="spellEnd"/>
             <w:r>
               <w:rPr>
                 <w:rFonts w:ascii="Nirmala UI" w:hAnsi="Nirmala UI" w:cs="Nirmala UI"/>
@@ -4880,7 +4847,6 @@
               </w:rPr>
               <w:t xml:space="preserve"> </w:t>
             </w:r>
-            <w:proofErr w:type="spellStart"/>
             <w:r>
               <w:rPr>
                 <w:rFonts w:ascii="Nirmala UI" w:hAnsi="Nirmala UI" w:cs="Nirmala UI" w:hint="cs"/>
@@ -4888,7 +4854,6 @@
               </w:rPr>
               <w:t>युष्मासु</w:t>
             </w:r>
-            <w:proofErr w:type="spellEnd"/>
             <w:r>
               <w:rPr>
                 <w:rFonts w:ascii="Nirmala UI" w:hAnsi="Nirmala UI" w:cs="Nirmala UI"/>
@@ -4896,7 +4861,6 @@
               </w:rPr>
               <w:t xml:space="preserve"> </w:t>
             </w:r>
-            <w:proofErr w:type="spellStart"/>
             <w:r>
               <w:rPr>
                 <w:rFonts w:ascii="Nirmala UI" w:hAnsi="Nirmala UI" w:cs="Nirmala UI" w:hint="cs"/>
@@ -4904,7 +4868,6 @@
               </w:rPr>
               <w:t>तस्य</w:t>
             </w:r>
-            <w:proofErr w:type="spellEnd"/>
             <w:r>
               <w:rPr>
                 <w:rFonts w:ascii="Nirmala UI" w:hAnsi="Nirmala UI" w:cs="Nirmala UI"/>
@@ -4912,7 +4875,6 @@
               </w:rPr>
               <w:t xml:space="preserve"> </w:t>
             </w:r>
-            <w:proofErr w:type="spellStart"/>
             <w:r>
               <w:rPr>
                 <w:rFonts w:ascii="Nirmala UI" w:hAnsi="Nirmala UI" w:cs="Nirmala UI" w:hint="cs"/>
@@ -4920,7 +4882,6 @@
               </w:rPr>
               <w:t>स्नेहो</w:t>
             </w:r>
-            <w:proofErr w:type="spellEnd"/>
             <w:r>
               <w:rPr>
                 <w:rFonts w:ascii="Nirmala UI" w:hAnsi="Nirmala UI" w:cs="Nirmala UI"/>
@@ -4928,7 +4889,6 @@
               </w:rPr>
               <w:t xml:space="preserve"> </w:t>
             </w:r>
-            <w:proofErr w:type="spellStart"/>
             <w:r>
               <w:rPr>
                 <w:rFonts w:ascii="Nirmala UI" w:hAnsi="Nirmala UI" w:cs="Nirmala UI" w:hint="cs"/>
@@ -4936,7 +4896,6 @@
               </w:rPr>
               <w:t>बाहुल्येन</w:t>
             </w:r>
-            <w:proofErr w:type="spellEnd"/>
             <w:r>
               <w:rPr>
                 <w:rFonts w:ascii="Nirmala UI" w:hAnsi="Nirmala UI" w:cs="Nirmala UI"/>
@@ -4944,21 +4903,12 @@
               </w:rPr>
               <w:t xml:space="preserve"> </w:t>
             </w:r>
-            <w:proofErr w:type="spellStart"/>
             <w:r>
               <w:rPr>
                 <w:rFonts w:ascii="Nirmala UI" w:hAnsi="Nirmala UI" w:cs="Nirmala UI" w:hint="cs"/>
                 <w:sz w:val="16"/>
               </w:rPr>
-              <w:t>वर्त्तते</w:t>
-            </w:r>
-            <w:proofErr w:type="spellEnd"/>
-            <w:r>
-              <w:rPr>
-                <w:rFonts w:ascii="Nirmala UI" w:hAnsi="Nirmala UI" w:cs="Nirmala UI" w:hint="cs"/>
-                <w:sz w:val="16"/>
-              </w:rPr>
-              <w:t>।</w:t>
+              <w:t>वर्त्तते।</w:t>
             </w:r>
           </w:p>
         </w:tc>
@@ -4977,21 +4927,7 @@
               <w:rPr>
                 <w:sz w:val="16"/>
               </w:rPr>
-              <w:t xml:space="preserve">"""And his inward affection is more abundant toward you, whilst he </w:t>
-            </w:r>
-            <w:proofErr w:type="spellStart"/>
-            <w:r>
-              <w:rPr>
-                <w:sz w:val="16"/>
-              </w:rPr>
-              <w:t>remembereth</w:t>
-            </w:r>
-            <w:proofErr w:type="spellEnd"/>
-            <w:r>
-              <w:rPr>
-                <w:sz w:val="16"/>
-              </w:rPr>
-              <w:t xml:space="preserve"> the obedience of you all, how with fear and trembling ye received him."""</w:t>
+              <w:t>"""And his inward affection is more abundant toward you, whilst he remembereth the obedience of you all, how with fear and trembling ye received him."""</w:t>
             </w:r>
           </w:p>
         </w:tc>
@@ -5051,7 +4987,6 @@
               </w:rPr>
               <w:t>"""</w:t>
             </w:r>
-            <w:proofErr w:type="spellStart"/>
             <w:r>
               <w:rPr>
                 <w:rFonts w:ascii="Nirmala UI" w:hAnsi="Nirmala UI" w:cs="Nirmala UI" w:hint="cs"/>
@@ -5059,7 +4994,6 @@
               </w:rPr>
               <w:t>वर्षाया</w:t>
             </w:r>
-            <w:proofErr w:type="spellEnd"/>
             <w:r>
               <w:rPr>
                 <w:rFonts w:ascii="Nirmala UI" w:hAnsi="Nirmala UI" w:cs="Nirmala UI"/>
@@ -5067,7 +5001,6 @@
               </w:rPr>
               <w:t xml:space="preserve">: </w:t>
             </w:r>
-            <w:proofErr w:type="spellStart"/>
             <w:r>
               <w:rPr>
                 <w:rFonts w:ascii="Nirmala UI" w:hAnsi="Nirmala UI" w:cs="Nirmala UI" w:hint="cs"/>
@@ -5075,7 +5008,6 @@
               </w:rPr>
               <w:t>जलस्य</w:t>
             </w:r>
-            <w:proofErr w:type="spellEnd"/>
             <w:r>
               <w:rPr>
                 <w:rFonts w:ascii="Nirmala UI" w:hAnsi="Nirmala UI" w:cs="Nirmala UI"/>
@@ -5083,7 +5015,6 @@
               </w:rPr>
               <w:t xml:space="preserve"> </w:t>
             </w:r>
-            <w:proofErr w:type="spellStart"/>
             <w:r>
               <w:rPr>
                 <w:rFonts w:ascii="Nirmala UI" w:hAnsi="Nirmala UI" w:cs="Nirmala UI" w:hint="cs"/>
@@ -5091,7 +5022,6 @@
               </w:rPr>
               <w:t>कश्चन</w:t>
             </w:r>
-            <w:proofErr w:type="spellEnd"/>
             <w:r>
               <w:rPr>
                 <w:rFonts w:ascii="Nirmala UI" w:hAnsi="Nirmala UI" w:cs="Nirmala UI"/>
@@ -5099,7 +5029,6 @@
               </w:rPr>
               <w:t xml:space="preserve"> </w:t>
             </w:r>
-            <w:proofErr w:type="spellStart"/>
             <w:r>
               <w:rPr>
                 <w:rFonts w:ascii="Nirmala UI" w:hAnsi="Nirmala UI" w:cs="Nirmala UI" w:hint="cs"/>
@@ -5107,7 +5036,6 @@
               </w:rPr>
               <w:t>अंश</w:t>
             </w:r>
-            <w:proofErr w:type="spellEnd"/>
             <w:r>
               <w:rPr>
                 <w:rFonts w:ascii="Nirmala UI" w:hAnsi="Nirmala UI" w:cs="Nirmala UI"/>
@@ -5115,7 +5043,6 @@
               </w:rPr>
               <w:t xml:space="preserve">: </w:t>
             </w:r>
-            <w:proofErr w:type="spellStart"/>
             <w:r>
               <w:rPr>
                 <w:rFonts w:ascii="Nirmala UI" w:hAnsi="Nirmala UI" w:cs="Nirmala UI" w:hint="cs"/>
@@ -5123,7 +5050,6 @@
               </w:rPr>
               <w:t>भूमौ</w:t>
             </w:r>
-            <w:proofErr w:type="spellEnd"/>
             <w:r>
               <w:rPr>
                 <w:rFonts w:ascii="Nirmala UI" w:hAnsi="Nirmala UI" w:cs="Nirmala UI"/>
@@ -5131,7 +5057,6 @@
               </w:rPr>
               <w:t xml:space="preserve"> </w:t>
             </w:r>
-            <w:proofErr w:type="spellStart"/>
             <w:r>
               <w:rPr>
                 <w:rFonts w:ascii="Nirmala UI" w:hAnsi="Nirmala UI" w:cs="Nirmala UI" w:hint="cs"/>
@@ -5139,7 +5064,6 @@
               </w:rPr>
               <w:t>शुष्को</w:t>
             </w:r>
-            <w:proofErr w:type="spellEnd"/>
             <w:r>
               <w:rPr>
                 <w:rFonts w:ascii="Nirmala UI" w:hAnsi="Nirmala UI" w:cs="Nirmala UI"/>
@@ -5147,7 +5071,6 @@
               </w:rPr>
               <w:t xml:space="preserve"> </w:t>
             </w:r>
-            <w:proofErr w:type="spellStart"/>
             <w:r>
               <w:rPr>
                 <w:rFonts w:ascii="Nirmala UI" w:hAnsi="Nirmala UI" w:cs="Nirmala UI" w:hint="cs"/>
@@ -5155,7 +5078,6 @@
               </w:rPr>
               <w:t>भूत्वा</w:t>
             </w:r>
-            <w:proofErr w:type="spellEnd"/>
             <w:r>
               <w:rPr>
                 <w:rFonts w:ascii="Nirmala UI" w:hAnsi="Nirmala UI" w:cs="Nirmala UI"/>
@@ -5163,8 +5085,6 @@
               </w:rPr>
               <w:t xml:space="preserve"> </w:t>
             </w:r>
-            <w:proofErr w:type="spellStart"/>
-            <w:proofErr w:type="gramStart"/>
             <w:r>
               <w:rPr>
                 <w:rFonts w:ascii="Nirmala UI" w:hAnsi="Nirmala UI" w:cs="Nirmala UI" w:hint="cs"/>
@@ -5186,8 +5106,6 @@
               </w:rPr>
               <w:t>तदेव</w:t>
             </w:r>
-            <w:proofErr w:type="spellEnd"/>
-            <w:proofErr w:type="gramEnd"/>
             <w:r>
               <w:rPr>
                 <w:rFonts w:ascii="Nirmala UI" w:hAnsi="Nirmala UI" w:cs="Nirmala UI"/>
@@ -5195,7 +5113,6 @@
               </w:rPr>
               <w:t xml:space="preserve"> </w:t>
             </w:r>
-            <w:proofErr w:type="spellStart"/>
             <w:r>
               <w:rPr>
                 <w:rFonts w:ascii="Nirmala UI" w:hAnsi="Nirmala UI" w:cs="Nirmala UI" w:hint="cs"/>
@@ -5203,7 +5120,6 @@
               </w:rPr>
               <w:t>एकत्र</w:t>
             </w:r>
-            <w:proofErr w:type="spellEnd"/>
             <w:r>
               <w:rPr>
                 <w:rFonts w:ascii="Nirmala UI" w:hAnsi="Nirmala UI" w:cs="Nirmala UI"/>
@@ -5211,7 +5127,6 @@
               </w:rPr>
               <w:t xml:space="preserve"> </w:t>
             </w:r>
-            <w:proofErr w:type="spellStart"/>
             <w:r>
               <w:rPr>
                 <w:rFonts w:ascii="Nirmala UI" w:hAnsi="Nirmala UI" w:cs="Nirmala UI" w:hint="cs"/>
@@ -5219,7 +5134,6 @@
               </w:rPr>
               <w:t>आगत्य</w:t>
             </w:r>
-            <w:proofErr w:type="spellEnd"/>
             <w:r>
               <w:rPr>
                 <w:rFonts w:ascii="Nirmala UI" w:hAnsi="Nirmala UI" w:cs="Nirmala UI"/>
@@ -5227,7 +5141,6 @@
               </w:rPr>
               <w:t xml:space="preserve"> </w:t>
             </w:r>
-            <w:proofErr w:type="spellStart"/>
             <w:r>
               <w:rPr>
                 <w:rFonts w:ascii="Nirmala UI" w:hAnsi="Nirmala UI" w:cs="Nirmala UI" w:hint="cs"/>
@@ -5235,7 +5148,6 @@
               </w:rPr>
               <w:t>भौमं</w:t>
             </w:r>
-            <w:proofErr w:type="spellEnd"/>
             <w:r>
               <w:rPr>
                 <w:rFonts w:ascii="Nirmala UI" w:hAnsi="Nirmala UI" w:cs="Nirmala UI"/>
@@ -5243,7 +5155,6 @@
               </w:rPr>
               <w:t xml:space="preserve"> </w:t>
             </w:r>
-            <w:proofErr w:type="spellStart"/>
             <w:r>
               <w:rPr>
                 <w:rFonts w:ascii="Nirmala UI" w:hAnsi="Nirmala UI" w:cs="Nirmala UI" w:hint="cs"/>
@@ -5251,7 +5162,6 @@
               </w:rPr>
               <w:t>जलं</w:t>
             </w:r>
-            <w:proofErr w:type="spellEnd"/>
             <w:r>
               <w:rPr>
                 <w:rFonts w:ascii="Nirmala UI" w:hAnsi="Nirmala UI" w:cs="Nirmala UI"/>
@@ -5259,21 +5169,12 @@
               </w:rPr>
               <w:t xml:space="preserve"> </w:t>
             </w:r>
-            <w:proofErr w:type="spellStart"/>
             <w:r>
               <w:rPr>
                 <w:rFonts w:ascii="Nirmala UI" w:hAnsi="Nirmala UI" w:cs="Nirmala UI" w:hint="cs"/>
                 <w:sz w:val="16"/>
               </w:rPr>
-              <w:t>भवति</w:t>
-            </w:r>
-            <w:proofErr w:type="spellEnd"/>
-            <w:r>
-              <w:rPr>
-                <w:rFonts w:ascii="Nirmala UI" w:hAnsi="Nirmala UI" w:cs="Nirmala UI" w:hint="cs"/>
-                <w:sz w:val="16"/>
-              </w:rPr>
-              <w:t>।</w:t>
+              <w:t>भवति।</w:t>
             </w:r>
             <w:r>
               <w:rPr>
@@ -5299,35 +5200,7 @@
               <w:rPr>
                 <w:sz w:val="16"/>
               </w:rPr>
-              <w:t xml:space="preserve">A part of rain water is </w:t>
-            </w:r>
-            <w:proofErr w:type="spellStart"/>
-            <w:r>
-              <w:rPr>
-                <w:sz w:val="16"/>
-              </w:rPr>
-              <w:t>absorbedby</w:t>
-            </w:r>
-            <w:proofErr w:type="spellEnd"/>
-            <w:r>
-              <w:rPr>
-                <w:sz w:val="16"/>
-              </w:rPr>
-              <w:t xml:space="preserve"> earth. Water collected under the earth is called </w:t>
-            </w:r>
-            <w:proofErr w:type="spellStart"/>
-            <w:r>
-              <w:rPr>
-                <w:sz w:val="16"/>
-              </w:rPr>
-              <w:t>undergroundwater</w:t>
-            </w:r>
-            <w:proofErr w:type="spellEnd"/>
-            <w:r>
-              <w:rPr>
-                <w:sz w:val="16"/>
-              </w:rPr>
-              <w:t>.</w:t>
+              <w:t>A part of rain water is absorbedby earth. Water collected under the earth is called undergroundwater.</w:t>
             </w:r>
           </w:p>
         </w:tc>
@@ -5380,7 +5253,6 @@
         <w:rPr>
           <w:color w:val="000000"/>
         </w:rPr>
-        <w:lastRenderedPageBreak/>
         <w:t>6. Experiments</w:t>
       </w:r>
     </w:p>
@@ -5414,35 +5286,7 @@
         <w:rPr>
           <w:sz w:val="20"/>
         </w:rPr>
-        <w:t xml:space="preserve">The experiments generate the results from evaluating the pretrained </w:t>
-      </w:r>
-      <w:proofErr w:type="spellStart"/>
-      <w:r>
-        <w:rPr>
-          <w:sz w:val="20"/>
-        </w:rPr>
-        <w:t>facebook</w:t>
-      </w:r>
-      <w:proofErr w:type="spellEnd"/>
-      <w:r>
-        <w:rPr>
-          <w:sz w:val="20"/>
-        </w:rPr>
-        <w:t xml:space="preserve">/nllb-200-distilled-600M model using zero-shot inference with beam search (beams=5), on the full dev (1,000) and test (1,000) splits, with the metrics corpus BLEU and </w:t>
-      </w:r>
-      <w:proofErr w:type="spellStart"/>
-      <w:r>
-        <w:rPr>
-          <w:sz w:val="20"/>
-        </w:rPr>
-        <w:t>BERTScore</w:t>
-      </w:r>
-      <w:proofErr w:type="spellEnd"/>
-      <w:r>
-        <w:rPr>
-          <w:sz w:val="20"/>
-        </w:rPr>
-        <w:t xml:space="preserve"> F1.</w:t>
+        <w:t>The experiments generate the results from evaluating the pretrained facebook/nllb-200-distilled-600M model using zero-shot inference with beam search (beams=5), on the full dev (1,000) and test (1,000) splits, with the metrics corpus BLEU and BERTScore F1.</w:t>
       </w:r>
     </w:p>
     <w:p>
@@ -5453,21 +5297,7 @@
         <w:rPr>
           <w:sz w:val="20"/>
         </w:rPr>
-        <w:t>Experiment B (sanskrit_nmt_assignment_run-</w:t>
-      </w:r>
-      <w:proofErr w:type="gramStart"/>
-      <w:r>
-        <w:rPr>
-          <w:sz w:val="20"/>
-        </w:rPr>
-        <w:t>1.ipynb</w:t>
-      </w:r>
-      <w:proofErr w:type="gramEnd"/>
-      <w:r>
-        <w:rPr>
-          <w:sz w:val="20"/>
-        </w:rPr>
-        <w:t xml:space="preserve">): </w:t>
+        <w:t xml:space="preserve">Experiment B (sanskrit_nmt_assignment_run-1.ipynb): </w:t>
       </w:r>
       <w:r>
         <w:rPr>
@@ -5508,21 +5338,7 @@
         <w:rPr>
           <w:sz w:val="20"/>
         </w:rPr>
-        <w:t xml:space="preserve">Ablation signal from training curves: dev BLEU improved almost monotonically epoch-over-epoch (from 0.013 to 0.077), while dev </w:t>
-      </w:r>
-      <w:proofErr w:type="spellStart"/>
-      <w:r>
-        <w:rPr>
-          <w:sz w:val="20"/>
-        </w:rPr>
-        <w:t>BERTScore</w:t>
-      </w:r>
-      <w:proofErr w:type="spellEnd"/>
-      <w:r>
-        <w:rPr>
-          <w:sz w:val="20"/>
-        </w:rPr>
-        <w:t xml:space="preserve"> F1 dipped in semantic scoring around epoch 10-11 but recovered eventually, indicating some instability in semantic scoring during training, which stabilized by epoch 20.</w:t>
+        <w:t>Ablation signal from training curves: dev BLEU improved almost monotonically epoch-over-epoch (from 0.013 to 0.077), while dev BERTScore F1 dipped in semantic scoring around epoch 10-11 but recovered eventually, indicating some instability in semantic scoring during training, which stabilized by epoch 20.</w:t>
       </w:r>
     </w:p>
     <w:p>
@@ -5550,6 +5366,7 @@
         <w:rPr>
           <w:color w:val="000000"/>
         </w:rPr>
+        <w:lastRenderedPageBreak/>
         <w:t>7. Discussion</w:t>
       </w:r>
     </w:p>
@@ -5643,99 +5460,7 @@
         <w:rPr>
           <w:sz w:val="20"/>
         </w:rPr>
-        <w:t>It was not directly tested on the test set beyond timing, so the BLEU/</w:t>
-      </w:r>
-      <w:proofErr w:type="spellStart"/>
-      <w:r>
-        <w:rPr>
-          <w:sz w:val="20"/>
-        </w:rPr>
-        <w:t>BERTScore</w:t>
-      </w:r>
-      <w:proofErr w:type="spellEnd"/>
-      <w:r>
-        <w:rPr>
-          <w:sz w:val="20"/>
-        </w:rPr>
-        <w:t xml:space="preserve"> of the custom model was only considered on the dev split. The models do not utilize any early stopping method based on validation, and the custom model has no implementation of </w:t>
-      </w:r>
-      <w:proofErr w:type="spellStart"/>
-      <w:r>
-        <w:rPr>
-          <w:sz w:val="20"/>
-        </w:rPr>
-        <w:t>subword</w:t>
-      </w:r>
-      <w:proofErr w:type="spellEnd"/>
-      <w:r>
-        <w:rPr>
-          <w:sz w:val="20"/>
-        </w:rPr>
-        <w:t xml:space="preserve"> tokenization, label smoothing or beam search, which are all listed as future plans for the notebook. For the custom model, </w:t>
-      </w:r>
-      <w:proofErr w:type="spellStart"/>
-      <w:r>
-        <w:rPr>
-          <w:sz w:val="20"/>
-        </w:rPr>
-        <w:t>BERTScore</w:t>
-      </w:r>
-      <w:proofErr w:type="spellEnd"/>
-      <w:r>
-        <w:rPr>
-          <w:sz w:val="20"/>
-        </w:rPr>
-        <w:t xml:space="preserve"> uses the same </w:t>
-      </w:r>
-      <w:proofErr w:type="spellStart"/>
-      <w:r>
-        <w:rPr>
-          <w:sz w:val="20"/>
-        </w:rPr>
-        <w:t>roberta</w:t>
-      </w:r>
-      <w:proofErr w:type="spellEnd"/>
-      <w:r>
-        <w:rPr>
-          <w:sz w:val="20"/>
-        </w:rPr>
-        <w:t xml:space="preserve">-large scorer as the pretrained model, however very short/degenerate predictions (e.g., 'these are </w:t>
-      </w:r>
-      <w:proofErr w:type="spellStart"/>
-      <w:proofErr w:type="gramStart"/>
-      <w:r>
-        <w:rPr>
-          <w:sz w:val="20"/>
-        </w:rPr>
-        <w:t>are</w:t>
-      </w:r>
-      <w:proofErr w:type="spellEnd"/>
-      <w:r>
-        <w:rPr>
-          <w:sz w:val="20"/>
-        </w:rPr>
-        <w:t xml:space="preserve"> .</w:t>
-      </w:r>
-      <w:proofErr w:type="gramEnd"/>
-      <w:r>
-        <w:rPr>
-          <w:sz w:val="20"/>
-        </w:rPr>
-        <w:t xml:space="preserve">') may result in negative </w:t>
-      </w:r>
-      <w:proofErr w:type="spellStart"/>
-      <w:r>
-        <w:rPr>
-          <w:sz w:val="20"/>
-        </w:rPr>
-        <w:t>BERTScore</w:t>
-      </w:r>
-      <w:proofErr w:type="spellEnd"/>
-      <w:r>
-        <w:rPr>
-          <w:sz w:val="20"/>
-        </w:rPr>
-        <w:t xml:space="preserve"> values in the initial epochs.</w:t>
+        <w:t>It was not directly tested on the test set beyond timing, so the BLEU/BERTScore of the custom model was only considered on the dev split. The models do not utilize any early stopping method based on validation, and the custom model has no implementation of subword tokenization, label smoothing or beam search, which are all listed as future plans for the notebook. For the custom model, BERTScore uses the same roberta-large scorer as the pretrained model, however very short/degenerate predictions (e.g., 'these are are .') may result in negative BERTScore values in the initial epochs.</w:t>
       </w:r>
     </w:p>
     <w:p>
@@ -5746,7 +5471,6 @@
         <w:rPr>
           <w:color w:val="000000"/>
         </w:rPr>
-        <w:lastRenderedPageBreak/>
         <w:t>8. Pre-trained Models Disclosed</w:t>
       </w:r>
     </w:p>
@@ -6044,16 +5768,15 @@
         <w:rPr>
           <w:sz w:val="20"/>
         </w:rPr>
+        <w:lastRenderedPageBreak/>
         <w:t xml:space="preserve">The custom encoder-decoder model is trained entirely from scratch and does not use any pretrained weights; only its BERTScore evaluation step depends on the pretrained </w:t>
       </w:r>
-      <w:proofErr w:type="spellStart"/>
       <w:r>
         <w:rPr>
           <w:sz w:val="20"/>
         </w:rPr>
         <w:t>RoBERTa</w:t>
       </w:r>
-      <w:proofErr w:type="spellEnd"/>
       <w:r>
         <w:rPr>
           <w:sz w:val="20"/>
@@ -6979,6 +6702,7 @@
   <w:style w:type="character" w:default="1" w:styleId="DefaultParagraphFont">
     <w:name w:val="Default Paragraph Font"/>
     <w:uiPriority w:val="1"/>
+    <w:semiHidden/>
     <w:unhideWhenUsed/>
   </w:style>
   <w:style w:type="table" w:default="1" w:styleId="TableNormal">

</xml_diff>

<commit_message>
Updated submission with better results
</commit_message>
<xml_diff>
--- a/g25ait1136_report.docx
+++ b/g25ait1136_report.docx
@@ -31,30 +31,78 @@
     <w:p>
       <w:pPr>
         <w:rPr>
+          <w:sz w:val="20"/>
+        </w:rPr>
+      </w:pPr>
+      <w:r>
+        <w:rPr>
           <w:i/>
           <w:sz w:val="20"/>
         </w:rPr>
-      </w:pPr>
+        <w:t xml:space="preserve">Artifacts: </w:t>
+      </w:r>
       <w:r>
         <w:rPr>
           <w:i/>
           <w:sz w:val="20"/>
         </w:rPr>
-        <w:t xml:space="preserve">Artifacts: g25ait1136.ipynb (code), </w:t>
+        <w:t>g25ait1136_retrained.ipynb</w:t>
       </w:r>
       <w:r>
         <w:rPr>
           <w:i/>
           <w:sz w:val="20"/>
         </w:rPr>
-        <w:t>sanskrit_nmt_assignment.ipynb</w:t>
+        <w:t xml:space="preserve"> (final – retrained)</w:t>
       </w:r>
       <w:r>
         <w:rPr>
           <w:i/>
           <w:sz w:val="20"/>
         </w:rPr>
-        <w:t xml:space="preserve"> (experiment – custom implementation), submission.csv, metric.json (result), dev/test/train_embeddings.npz (embedding exports), Github Link: </w:t>
+        <w:t>,</w:t>
+      </w:r>
+      <w:r>
+        <w:rPr>
+          <w:i/>
+          <w:sz w:val="20"/>
+        </w:rPr>
+        <w:t xml:space="preserve"> </w:t>
+      </w:r>
+      <w:r>
+        <w:rPr>
+          <w:i/>
+          <w:sz w:val="20"/>
+        </w:rPr>
+        <w:t>g25ait1136_pretrained.ipynb</w:t>
+      </w:r>
+      <w:r>
+        <w:rPr>
+          <w:i/>
+          <w:sz w:val="20"/>
+        </w:rPr>
+        <w:t xml:space="preserve"> (experiment – pretrained)</w:t>
+      </w:r>
+      <w:r>
+        <w:rPr>
+          <w:i/>
+          <w:sz w:val="20"/>
+        </w:rPr>
+        <w:t xml:space="preserve">, </w:t>
+      </w:r>
+      <w:r>
+        <w:rPr>
+          <w:i/>
+          <w:sz w:val="20"/>
+        </w:rPr>
+        <w:t>sanskrit_nmt_assignment.ipynb</w:t>
+      </w:r>
+      <w:r>
+        <w:rPr>
+          <w:i/>
+          <w:sz w:val="20"/>
+        </w:rPr>
+        <w:t xml:space="preserve"> (experiment – custom implementation), submission.csv, Github Link: </w:t>
       </w:r>
       <w:hyperlink r:id="rId6" w:history="1">
         <w:r>
@@ -90,19 +138,109 @@
         <w:rPr>
           <w:sz w:val="20"/>
         </w:rPr>
-        <w:t>This report presents two parallel neural machine translation (NMT) systems designed for the task of translating from Sanskrit into English: (1) the original submission (g25ait1136.ipynb)</w:t>
+        <w:t xml:space="preserve">This report presents </w:t>
       </w:r>
       <w:r>
         <w:rPr>
           <w:sz w:val="20"/>
         </w:rPr>
+        <w:t>three</w:t>
+      </w:r>
+      <w:r>
+        <w:rPr>
+          <w:sz w:val="20"/>
+        </w:rPr>
+        <w:t xml:space="preserve"> parallel neural machine translation (NMT) systems designed for the task of translating from Sanskrit into English: (1) the </w:t>
+      </w:r>
+      <w:r>
+        <w:rPr>
+          <w:sz w:val="20"/>
+        </w:rPr>
+        <w:t>final</w:t>
+      </w:r>
+      <w:r>
+        <w:rPr>
+          <w:sz w:val="20"/>
+        </w:rPr>
+        <w:t xml:space="preserve"> submission (g25ait1136</w:t>
+      </w:r>
+      <w:r>
+        <w:rPr>
+          <w:sz w:val="20"/>
+        </w:rPr>
+        <w:t>_retrained</w:t>
+      </w:r>
+      <w:r>
+        <w:rPr>
+          <w:sz w:val="20"/>
+        </w:rPr>
+        <w:t>.ipynb)</w:t>
+      </w:r>
+      <w:r>
+        <w:rPr>
+          <w:sz w:val="20"/>
+        </w:rPr>
+        <w:t xml:space="preserve"> which is re-trained on trained model using given dataset</w:t>
+      </w:r>
+      <w:r>
+        <w:rPr>
+          <w:sz w:val="20"/>
+        </w:rPr>
         <w:t>,</w:t>
       </w:r>
       <w:r>
         <w:rPr>
           <w:sz w:val="20"/>
         </w:rPr>
-        <w:t xml:space="preserve"> which takes advantage of a pre-trained multilingual sequence-to-sequence transformer model for zero-shot translation and evaluation, and (2) an experimental run (sanskrit_nmt_assignment.ipynb) that uses a custom encoder-decoder-based architecture with additive attention trained from scratch on the provided parallel corpus.</w:t>
+        <w:t xml:space="preserve"> </w:t>
+      </w:r>
+      <w:r>
+        <w:rPr>
+          <w:sz w:val="20"/>
+        </w:rPr>
+        <w:t>(2) the experiment run (</w:t>
+      </w:r>
+      <w:r>
+        <w:rPr>
+          <w:sz w:val="20"/>
+        </w:rPr>
+        <w:t>g25ait1136</w:t>
+      </w:r>
+      <w:r>
+        <w:rPr>
+          <w:sz w:val="20"/>
+        </w:rPr>
+        <w:t>_pretrained</w:t>
+      </w:r>
+      <w:r>
+        <w:rPr>
+          <w:sz w:val="20"/>
+        </w:rPr>
+        <w:t>.ipynb</w:t>
+      </w:r>
+      <w:r>
+        <w:rPr>
+          <w:sz w:val="20"/>
+        </w:rPr>
+        <w:t xml:space="preserve">) </w:t>
+      </w:r>
+      <w:r>
+        <w:rPr>
+          <w:sz w:val="20"/>
+        </w:rPr>
+        <w:t>which takes advantage of a pre-trained multilingual sequence-to-sequence transformer model for zero-shot translation and evaluation, and (</w:t>
+      </w:r>
+      <w:r>
+        <w:rPr>
+          <w:sz w:val="20"/>
+        </w:rPr>
+        <w:t>3</w:t>
+      </w:r>
+      <w:r>
+        <w:rPr>
+          <w:sz w:val="20"/>
+        </w:rPr>
+        <w:t>) an experimental run (sanskrit_nmt_assignment.ipynb) that uses a custom encoder-decoder-based architecture with additive attention trained from scratch on the provided parallel corpus.</w:t>
       </w:r>
     </w:p>
     <w:p>
@@ -110,7 +248,19 @@
         <w:rPr>
           <w:sz w:val="20"/>
         </w:rPr>
-        <w:t>It has 10,000 sentence pairs for training, 1,000 sentence pairs for dev and 1,000 sentence pairs for test data, namely Sanskrit-English sentences. In both systems, they are assessed using the BLEU, BERTScore F1 and inference efficiency metrics with the aim of comparing a large pretrained multilingual model with a lightweight custom-trained baseline.</w:t>
+        <w:t xml:space="preserve">It has 10,000 sentence pairs for training, 1,000 sentence pairs for dev and 1,000 sentence pairs for test data, namely Sanskrit-English sentences. In </w:t>
+      </w:r>
+      <w:r>
+        <w:rPr>
+          <w:sz w:val="20"/>
+        </w:rPr>
+        <w:t>all three</w:t>
+      </w:r>
+      <w:r>
+        <w:rPr>
+          <w:sz w:val="20"/>
+        </w:rPr>
+        <w:t xml:space="preserve"> systems, they are assessed using the BLEU, BERTScore F1 and inference efficiency metrics with the aim of comparing a large pretrained multilingual model with a lightweight custom-trained baseline.</w:t>
       </w:r>
     </w:p>
     <w:p>
@@ -129,7 +279,13 @@
         <w:rPr>
           <w:sz w:val="20"/>
         </w:rPr>
-        <w:t xml:space="preserve">Two different architectures were used in the two notebooks, as </w:t>
+        <w:t>Three</w:t>
+      </w:r>
+      <w:r>
+        <w:rPr>
+          <w:sz w:val="20"/>
+        </w:rPr>
+        <w:t xml:space="preserve"> different architectures were used in the two notebooks, as </w:t>
       </w:r>
       <w:r>
         <w:rPr>
@@ -146,7 +302,19 @@
         <w:rPr>
           <w:color w:val="000000"/>
         </w:rPr>
-        <w:t>2.1 Pretrained Model (g25ait1136.ipynb)</w:t>
+        <w:t xml:space="preserve">2.1 </w:t>
+      </w:r>
+      <w:r>
+        <w:rPr>
+          <w:color w:val="000000"/>
+        </w:rPr>
+        <w:t>R</w:t>
+      </w:r>
+      <w:r>
+        <w:rPr>
+          <w:color w:val="000000"/>
+        </w:rPr>
+        <w:t>etrained Model (g25ait1136_retrained.ipynb)</w:t>
       </w:r>
     </w:p>
     <w:p>
@@ -162,13 +330,7 @@
           <w:bCs/>
           <w:sz w:val="20"/>
         </w:rPr>
-        <w:t xml:space="preserve"> original submission</w:t>
-      </w:r>
-      <w:r>
-        <w:rPr>
-          <w:sz w:val="20"/>
-        </w:rPr>
-        <w:t xml:space="preserve"> uses </w:t>
+        <w:t xml:space="preserve"> </w:t>
       </w:r>
       <w:r>
         <w:rPr>
@@ -176,13 +338,7 @@
           <w:bCs/>
           <w:sz w:val="20"/>
         </w:rPr>
-        <w:t>facebook/nllb-200-distilled-600M</w:t>
-      </w:r>
-      <w:r>
-        <w:rPr>
-          <w:sz w:val="20"/>
-        </w:rPr>
-        <w:t xml:space="preserve">, which is a distilled multilingual encoder-decoder transformer with a hidden/embedding size of 1024 dimensions and a total of about 615 million parameters, loaded using </w:t>
+        <w:t>final</w:t>
       </w:r>
       <w:r>
         <w:rPr>
@@ -190,273 +346,101 @@
           <w:bCs/>
           <w:sz w:val="20"/>
         </w:rPr>
-        <w:t>AutoModelForSeq2SeqLM from Hugging Face</w:t>
+        <w:t xml:space="preserve"> submission</w:t>
       </w:r>
       <w:r>
         <w:rPr>
           <w:sz w:val="20"/>
         </w:rPr>
-        <w:t xml:space="preserve">. The Sanskrit input is marked with </w:t>
+        <w:t xml:space="preserve"> </w:t>
       </w:r>
       <w:r>
         <w:rPr>
           <w:sz w:val="20"/>
         </w:rPr>
-        <w:t>‘</w:t>
-      </w:r>
-      <w:r>
-        <w:rPr>
-          <w:sz w:val="20"/>
-        </w:rPr>
-        <w:t>san_Deva</w:t>
-      </w:r>
-      <w:r>
-        <w:rPr>
-          <w:sz w:val="20"/>
-        </w:rPr>
-        <w:t>’</w:t>
-      </w:r>
-      <w:r>
-        <w:rPr>
-          <w:sz w:val="20"/>
-        </w:rPr>
-        <w:t xml:space="preserve">, and the input must start with a token from the target language </w:t>
-      </w:r>
-      <w:r>
-        <w:rPr>
-          <w:sz w:val="20"/>
-        </w:rPr>
-        <w:t>‘</w:t>
-      </w:r>
-      <w:r>
-        <w:rPr>
-          <w:sz w:val="20"/>
-        </w:rPr>
-        <w:t>eng_Latn</w:t>
-      </w:r>
-      <w:r>
-        <w:rPr>
-          <w:sz w:val="20"/>
-        </w:rPr>
-        <w:t>’</w:t>
-      </w:r>
-      <w:r>
-        <w:rPr>
-          <w:sz w:val="20"/>
-        </w:rPr>
-        <w:t xml:space="preserve"> via forced_bos_token_id for generating.</w:t>
-      </w:r>
-    </w:p>
-    <w:p>
-      <w:pPr>
-        <w:pStyle w:val="Heading2"/>
-        <w:rPr>
-          <w:color w:val="000000"/>
-        </w:rPr>
-      </w:pPr>
-      <w:r>
-        <w:rPr>
-          <w:color w:val="000000"/>
-        </w:rPr>
-        <w:t>2.2 Custom Encoder-Decoder (sanskrit_nmt_assignment.ipynb)</w:t>
-      </w:r>
-    </w:p>
-    <w:p>
-      <w:r>
-        <w:t xml:space="preserve">The </w:t>
-      </w:r>
-      <w:r>
-        <w:rPr>
-          <w:b/>
-          <w:bCs/>
-        </w:rPr>
-        <w:t>experimental submission</w:t>
-      </w:r>
-      <w:r>
-        <w:t xml:space="preserve"> </w:t>
-      </w:r>
-      <w:r>
-        <w:t>makes use of</w:t>
-      </w:r>
-      <w:r>
-        <w:t>:</w:t>
-      </w:r>
-    </w:p>
-    <w:p>
-      <w:pPr>
-        <w:rPr>
-          <w:sz w:val="20"/>
-        </w:rPr>
-      </w:pPr>
+        <w:t xml:space="preserve">extends the pretrained model </w:t>
+      </w:r>
       <w:r>
         <w:rPr>
           <w:b/>
           <w:bCs/>
           <w:sz w:val="20"/>
         </w:rPr>
-        <w:t>Encoder</w:t>
+        <w:t>facebook/nllb-200-distilled-600M</w:t>
       </w:r>
       <w:r>
         <w:rPr>
           <w:sz w:val="20"/>
         </w:rPr>
-        <w:t xml:space="preserve">: A single-layer bidirectional GRU </w:t>
+        <w:t xml:space="preserve">, a distilled multilingual encoder-decoder transformer with a hidden/embedding size of 1024 </w:t>
       </w:r>
       <w:r>
         <w:rPr>
           <w:sz w:val="20"/>
         </w:rPr>
-        <w:t xml:space="preserve">with 256 </w:t>
-      </w:r>
-      <w:r>
-        <w:rPr>
-          <w:sz w:val="20"/>
-        </w:rPr>
-        <w:t xml:space="preserve">embedding dimension </w:t>
-      </w:r>
-      <w:r>
-        <w:rPr>
-          <w:sz w:val="20"/>
-        </w:rPr>
-        <w:t>and 512</w:t>
-      </w:r>
-      <w:r>
-        <w:rPr>
-          <w:sz w:val="20"/>
-        </w:rPr>
-        <w:t xml:space="preserve"> hidden dimension</w:t>
-      </w:r>
-      <w:r>
-        <w:rPr>
-          <w:sz w:val="20"/>
-        </w:rPr>
-        <w:t>s</w:t>
-      </w:r>
-      <w:r>
-        <w:rPr>
-          <w:sz w:val="20"/>
-        </w:rPr>
-        <w:t>.</w:t>
-      </w:r>
-    </w:p>
-    <w:p>
+        <w:t xml:space="preserve">and a total of about 615 million parameters, loaded using </w:t>
+      </w:r>
       <w:r>
         <w:rPr>
           <w:b/>
           <w:bCs/>
           <w:sz w:val="20"/>
         </w:rPr>
-        <w:t>Decoder</w:t>
+        <w:t>AutoModelForSeq2SeqLM from Hugging Face</w:t>
       </w:r>
       <w:r>
         <w:rPr>
           <w:sz w:val="20"/>
         </w:rPr>
-        <w:t xml:space="preserve">: </w:t>
+        <w:t xml:space="preserve">. The Sanskrit input is marked with </w:t>
       </w:r>
       <w:r>
         <w:rPr>
           <w:sz w:val="20"/>
         </w:rPr>
-        <w:t>A unidirectional GRU layer with a context vector, followed by a linear output layer (fc_out)</w:t>
+        <w:t>‘</w:t>
       </w:r>
       <w:r>
         <w:rPr>
           <w:sz w:val="20"/>
         </w:rPr>
-        <w:t>,</w:t>
+        <w:t>san_Deva</w:t>
       </w:r>
       <w:r>
         <w:rPr>
           <w:sz w:val="20"/>
         </w:rPr>
-        <w:t xml:space="preserve"> which takes the decoder output, context vector, and input embedding as inputs to produce the next token distribution.</w:t>
-      </w:r>
-    </w:p>
-    <w:p>
-      <w:r>
-        <w:rPr>
-          <w:b/>
-          <w:bCs/>
+        <w:t>’</w:t>
+      </w:r>
+      <w:r>
+        <w:rPr>
           <w:sz w:val="20"/>
         </w:rPr>
-        <w:t>Attention</w:t>
+        <w:t xml:space="preserve">, and the input must start with a token from the target language </w:t>
       </w:r>
       <w:r>
         <w:rPr>
           <w:sz w:val="20"/>
         </w:rPr>
-        <w:t xml:space="preserve">: </w:t>
+        <w:t>‘</w:t>
       </w:r>
       <w:r>
         <w:rPr>
           <w:sz w:val="20"/>
         </w:rPr>
-        <w:t>At every decoder step, an attention layer is used to compare the hidden state to the encoder output through a feed-forward layer</w:t>
+        <w:t>eng_Latn</w:t>
       </w:r>
       <w:r>
         <w:rPr>
           <w:sz w:val="20"/>
         </w:rPr>
-        <w:t>,</w:t>
+        <w:t>’</w:t>
       </w:r>
       <w:r>
         <w:rPr>
           <w:sz w:val="20"/>
         </w:rPr>
-        <w:t xml:space="preserve"> which is followed by a tanh activation and a scalar scoring vector v.</w:t>
-      </w:r>
-    </w:p>
-    <w:p>
-      <w:pPr>
-        <w:rPr>
-          <w:sz w:val="20"/>
-        </w:rPr>
-      </w:pPr>
-      <w:r>
-        <w:rPr>
-          <w:b/>
-          <w:bCs/>
-          <w:sz w:val="20"/>
-        </w:rPr>
-        <w:lastRenderedPageBreak/>
-        <w:t>Beam search:</w:t>
-      </w:r>
-      <w:r>
-        <w:rPr>
-          <w:sz w:val="20"/>
-        </w:rPr>
-        <w:t xml:space="preserve"> </w:t>
-      </w:r>
-      <w:r>
-        <w:rPr>
-          <w:sz w:val="20"/>
-        </w:rPr>
-        <w:t>Instead of beam search, it performs greedy decoding (argmax at each step), because greedy_decode() selects the max probability token at each step. The pretrained NLLB model</w:t>
-      </w:r>
-      <w:r>
-        <w:rPr>
-          <w:sz w:val="20"/>
-        </w:rPr>
-        <w:t>, on the other hand, is implemented with beam search (num_beams=5) and early_stopping=True,</w:t>
-      </w:r>
-      <w:r>
-        <w:rPr>
-          <w:sz w:val="20"/>
-        </w:rPr>
-        <w:t xml:space="preserve"> and forces the output language token at the first decoding step.</w:t>
-      </w:r>
-    </w:p>
-    <w:p/>
-    <w:p>
-      <w:pPr>
-        <w:pStyle w:val="Heading1"/>
-      </w:pPr>
-      <w:r>
-        <w:rPr>
-          <w:color w:val="000000"/>
-        </w:rPr>
-        <w:t>3. Training Procedure</w:t>
+        <w:t xml:space="preserve"> via forced_bos_token_id for generating.</w:t>
       </w:r>
     </w:p>
     <w:p>
@@ -467,6 +451,298 @@
         <w:rPr>
           <w:color w:val="000000"/>
         </w:rPr>
+        <w:t>2.2 Pretrained Model (g25ait1136_pretrained.ipynb)</w:t>
+      </w:r>
+    </w:p>
+    <w:p>
+      <w:r>
+        <w:rPr>
+          <w:sz w:val="20"/>
+        </w:rPr>
+        <w:t>The</w:t>
+      </w:r>
+      <w:r>
+        <w:rPr>
+          <w:b/>
+          <w:bCs/>
+          <w:sz w:val="20"/>
+        </w:rPr>
+        <w:t xml:space="preserve"> </w:t>
+      </w:r>
+      <w:r>
+        <w:rPr>
+          <w:b/>
+          <w:bCs/>
+          <w:sz w:val="20"/>
+        </w:rPr>
+        <w:t xml:space="preserve">experiment with the pretrained model </w:t>
+      </w:r>
+      <w:r>
+        <w:rPr>
+          <w:sz w:val="20"/>
+        </w:rPr>
+        <w:t>uses the same model described in 2.1, but is not retrained using the</w:t>
+      </w:r>
+      <w:r>
+        <w:rPr>
+          <w:b/>
+          <w:bCs/>
+          <w:sz w:val="20"/>
+        </w:rPr>
+        <w:t xml:space="preserve"> </w:t>
+      </w:r>
+      <w:r>
+        <w:rPr>
+          <w:sz w:val="20"/>
+        </w:rPr>
+        <w:t>given dataset.</w:t>
+      </w:r>
+    </w:p>
+    <w:p>
+      <w:pPr>
+        <w:pStyle w:val="Heading2"/>
+        <w:rPr>
+          <w:color w:val="000000"/>
+        </w:rPr>
+      </w:pPr>
+      <w:r>
+        <w:rPr>
+          <w:color w:val="000000"/>
+        </w:rPr>
+        <w:t>2.</w:t>
+      </w:r>
+      <w:r>
+        <w:rPr>
+          <w:color w:val="000000"/>
+        </w:rPr>
+        <w:t>3</w:t>
+      </w:r>
+      <w:r>
+        <w:rPr>
+          <w:color w:val="000000"/>
+        </w:rPr>
+        <w:t xml:space="preserve"> Custom Encoder-Decoder (sanskrit_nmt_assignment.ipynb)</w:t>
+      </w:r>
+    </w:p>
+    <w:p>
+      <w:r>
+        <w:t xml:space="preserve">The </w:t>
+      </w:r>
+      <w:r>
+        <w:rPr>
+          <w:b/>
+          <w:bCs/>
+        </w:rPr>
+        <w:t xml:space="preserve">experimental </w:t>
+      </w:r>
+      <w:r>
+        <w:rPr>
+          <w:b/>
+          <w:bCs/>
+        </w:rPr>
+        <w:t xml:space="preserve">fully custom development </w:t>
+      </w:r>
+      <w:r>
+        <w:rPr>
+          <w:b/>
+          <w:bCs/>
+        </w:rPr>
+        <w:t>submission</w:t>
+      </w:r>
+      <w:r>
+        <w:t xml:space="preserve"> </w:t>
+      </w:r>
+      <w:r>
+        <w:t>makes use of</w:t>
+      </w:r>
+      <w:r>
+        <w:t>:</w:t>
+      </w:r>
+    </w:p>
+    <w:p>
+      <w:pPr>
+        <w:rPr>
+          <w:sz w:val="20"/>
+        </w:rPr>
+      </w:pPr>
+      <w:r>
+        <w:rPr>
+          <w:b/>
+          <w:bCs/>
+          <w:sz w:val="20"/>
+        </w:rPr>
+        <w:t>Encoder</w:t>
+      </w:r>
+      <w:r>
+        <w:rPr>
+          <w:sz w:val="20"/>
+        </w:rPr>
+        <w:t xml:space="preserve">: A single-layer bidirectional GRU </w:t>
+      </w:r>
+      <w:r>
+        <w:rPr>
+          <w:sz w:val="20"/>
+        </w:rPr>
+        <w:t xml:space="preserve">with 256 </w:t>
+      </w:r>
+      <w:r>
+        <w:rPr>
+          <w:sz w:val="20"/>
+        </w:rPr>
+        <w:t xml:space="preserve">embedding dimension </w:t>
+      </w:r>
+      <w:r>
+        <w:rPr>
+          <w:sz w:val="20"/>
+        </w:rPr>
+        <w:t>and 512</w:t>
+      </w:r>
+      <w:r>
+        <w:rPr>
+          <w:sz w:val="20"/>
+        </w:rPr>
+        <w:t xml:space="preserve"> hidden dimension</w:t>
+      </w:r>
+      <w:r>
+        <w:rPr>
+          <w:sz w:val="20"/>
+        </w:rPr>
+        <w:t>s</w:t>
+      </w:r>
+      <w:r>
+        <w:rPr>
+          <w:sz w:val="20"/>
+        </w:rPr>
+        <w:t>.</w:t>
+      </w:r>
+    </w:p>
+    <w:p>
+      <w:r>
+        <w:rPr>
+          <w:b/>
+          <w:bCs/>
+          <w:sz w:val="20"/>
+        </w:rPr>
+        <w:lastRenderedPageBreak/>
+        <w:t>Decoder</w:t>
+      </w:r>
+      <w:r>
+        <w:rPr>
+          <w:sz w:val="20"/>
+        </w:rPr>
+        <w:t xml:space="preserve">: </w:t>
+      </w:r>
+      <w:r>
+        <w:rPr>
+          <w:sz w:val="20"/>
+        </w:rPr>
+        <w:t>A unidirectional GRU layer with a context vector, followed by a linear output layer (fc_out)</w:t>
+      </w:r>
+      <w:r>
+        <w:rPr>
+          <w:sz w:val="20"/>
+        </w:rPr>
+        <w:t>,</w:t>
+      </w:r>
+      <w:r>
+        <w:rPr>
+          <w:sz w:val="20"/>
+        </w:rPr>
+        <w:t xml:space="preserve"> which takes the decoder output, context vector, and input embedding as inputs to produce the next token distribution.</w:t>
+      </w:r>
+    </w:p>
+    <w:p>
+      <w:r>
+        <w:rPr>
+          <w:b/>
+          <w:bCs/>
+          <w:sz w:val="20"/>
+        </w:rPr>
+        <w:t>Attention</w:t>
+      </w:r>
+      <w:r>
+        <w:rPr>
+          <w:sz w:val="20"/>
+        </w:rPr>
+        <w:t xml:space="preserve">: </w:t>
+      </w:r>
+      <w:r>
+        <w:rPr>
+          <w:sz w:val="20"/>
+        </w:rPr>
+        <w:t>At every decoder step, an attention layer is used to compare the hidden state to the encoder output through a feed-forward layer</w:t>
+      </w:r>
+      <w:r>
+        <w:rPr>
+          <w:sz w:val="20"/>
+        </w:rPr>
+        <w:t>,</w:t>
+      </w:r>
+      <w:r>
+        <w:rPr>
+          <w:sz w:val="20"/>
+        </w:rPr>
+        <w:t xml:space="preserve"> which is followed by a tanh activation and a scalar scoring vector v.</w:t>
+      </w:r>
+    </w:p>
+    <w:p>
+      <w:pPr>
+        <w:rPr>
+          <w:sz w:val="20"/>
+        </w:rPr>
+      </w:pPr>
+      <w:r>
+        <w:rPr>
+          <w:b/>
+          <w:bCs/>
+          <w:sz w:val="20"/>
+        </w:rPr>
+        <w:t>Beam search:</w:t>
+      </w:r>
+      <w:r>
+        <w:rPr>
+          <w:sz w:val="20"/>
+        </w:rPr>
+        <w:t xml:space="preserve"> </w:t>
+      </w:r>
+      <w:r>
+        <w:rPr>
+          <w:sz w:val="20"/>
+        </w:rPr>
+        <w:t>Instead of beam search, it performs greedy decoding (argmax at each step), because greedy_decode() selects the max probability token at each step. The pretrained NLLB model</w:t>
+      </w:r>
+      <w:r>
+        <w:rPr>
+          <w:sz w:val="20"/>
+        </w:rPr>
+        <w:t>, on the other hand, is implemented with beam search (num_beams=5) and early_stopping=True,</w:t>
+      </w:r>
+      <w:r>
+        <w:rPr>
+          <w:sz w:val="20"/>
+        </w:rPr>
+        <w:t xml:space="preserve"> and forces the output language token at the first decoding step.</w:t>
+      </w:r>
+    </w:p>
+    <w:p>
+      <w:pPr>
+        <w:pStyle w:val="Heading1"/>
+      </w:pPr>
+      <w:r>
+        <w:rPr>
+          <w:color w:val="000000"/>
+        </w:rPr>
+        <w:t>3. Training Procedure</w:t>
+      </w:r>
+    </w:p>
+    <w:p>
+      <w:pPr>
+        <w:pStyle w:val="Heading2"/>
+      </w:pPr>
+      <w:r>
+        <w:rPr>
+          <w:color w:val="000000"/>
+        </w:rPr>
         <w:t>3.1 Preprocessing</w:t>
       </w:r>
     </w:p>
@@ -510,12 +786,13 @@
       </w:pPr>
       <w:r>
         <w:rPr>
+          <w:noProof/>
           <w:sz w:val="20"/>
         </w:rPr>
         <w:drawing>
-          <wp:inline distT="0" distB="0" distL="0" distR="0" wp14:anchorId="1240EC1E" wp14:editId="2008620D">
-            <wp:extent cx="4417255" cy="1740317"/>
-            <wp:effectExtent l="0" t="0" r="2540" b="0"/>
+          <wp:inline distT="0" distB="0" distL="0" distR="0" wp14:anchorId="1240EC1E" wp14:editId="5B224890">
+            <wp:extent cx="3713474" cy="1463040"/>
+            <wp:effectExtent l="0" t="0" r="1905" b="3810"/>
             <wp:docPr id="1686576090" name="Picture 1"/>
             <wp:cNvGraphicFramePr>
               <a:graphicFrameLocks xmlns:a="http://schemas.openxmlformats.org/drawingml/2006/main" noChangeAspect="1"/>
@@ -536,7 +813,7 @@
                   <pic:spPr>
                     <a:xfrm>
                       <a:off x="0" y="0"/>
-                      <a:ext cx="4417255" cy="1740317"/>
+                      <a:ext cx="3736445" cy="1472090"/>
                     </a:xfrm>
                     <a:prstGeom prst="rect">
                       <a:avLst/>
@@ -550,10 +827,15 @@
       </w:r>
     </w:p>
     <w:p>
-      <w:r>
+      <w:pPr>
         <w:rPr>
           <w:sz w:val="20"/>
         </w:rPr>
+      </w:pPr>
+      <w:r>
+        <w:rPr>
+          <w:sz w:val="20"/>
+        </w:rPr>
         <w:t xml:space="preserve">If using a pretrained model, there is no tokenization performed by the </w:t>
       </w:r>
       <w:r>
@@ -569,6 +851,259 @@
         <w:t xml:space="preserve"> and only the string of normalized raw text is passed to the NLLB tokenizer.</w:t>
       </w:r>
     </w:p>
+    <w:p>
+      <w:pPr>
+        <w:rPr>
+          <w:sz w:val="20"/>
+        </w:rPr>
+      </w:pPr>
+      <w:r>
+        <w:rPr>
+          <w:sz w:val="20"/>
+        </w:rPr>
+        <w:t xml:space="preserve">Finally, </w:t>
+      </w:r>
+      <w:r>
+        <w:rPr>
+          <w:sz w:val="20"/>
+        </w:rPr>
+        <w:t>the final submission with retrained model using the provided dataset</w:t>
+      </w:r>
+      <w:r>
+        <w:rPr>
+          <w:sz w:val="20"/>
+        </w:rPr>
+        <w:t xml:space="preserve"> is as shown below:</w:t>
+      </w:r>
+    </w:p>
+    <w:tbl>
+      <w:tblPr>
+        <w:tblStyle w:val="LightGrid-Accent1"/>
+        <w:tblW w:w="0" w:type="auto"/>
+        <w:jc w:val="center"/>
+        <w:tblLook w:val="04A0" w:firstRow="1" w:lastRow="0" w:firstColumn="1" w:lastColumn="0" w:noHBand="0" w:noVBand="1"/>
+      </w:tblPr>
+      <w:tblGrid>
+        <w:gridCol w:w="2346"/>
+        <w:gridCol w:w="2222"/>
+        <w:gridCol w:w="2275"/>
+      </w:tblGrid>
+      <w:tr>
+        <w:trPr>
+          <w:cnfStyle w:val="100000000000" w:firstRow="1" w:lastRow="0" w:firstColumn="0" w:lastColumn="0" w:oddVBand="0" w:evenVBand="0" w:oddHBand="0" w:evenHBand="0" w:firstRowFirstColumn="0" w:firstRowLastColumn="0" w:lastRowFirstColumn="0" w:lastRowLastColumn="0"/>
+          <w:jc w:val="center"/>
+        </w:trPr>
+        <w:tc>
+          <w:tcPr>
+            <w:cnfStyle w:val="001000000000" w:firstRow="0" w:lastRow="0" w:firstColumn="1" w:lastColumn="0" w:oddVBand="0" w:evenVBand="0" w:oddHBand="0" w:evenHBand="0" w:firstRowFirstColumn="0" w:firstRowLastColumn="0" w:lastRowFirstColumn="0" w:lastRowLastColumn="0"/>
+            <w:tcW w:w="2346" w:type="dxa"/>
+          </w:tcPr>
+          <w:p>
+            <w:r>
+              <w:rPr>
+                <w:lang w:val="en-IN"/>
+              </w:rPr>
+              <w:t>Epoch</w:t>
+            </w:r>
+          </w:p>
+        </w:tc>
+        <w:tc>
+          <w:tcPr>
+            <w:tcW w:w="2222" w:type="dxa"/>
+          </w:tcPr>
+          <w:p>
+            <w:pPr>
+              <w:cnfStyle w:val="100000000000" w:firstRow="1" w:lastRow="0" w:firstColumn="0" w:lastColumn="0" w:oddVBand="0" w:evenVBand="0" w:oddHBand="0" w:evenHBand="0" w:firstRowFirstColumn="0" w:firstRowLastColumn="0" w:lastRowFirstColumn="0" w:lastRowLastColumn="0"/>
+            </w:pPr>
+            <w:r>
+              <w:rPr>
+                <w:lang w:val="en-IN"/>
+              </w:rPr>
+              <w:t>Training Loss</w:t>
+            </w:r>
+          </w:p>
+        </w:tc>
+        <w:tc>
+          <w:tcPr>
+            <w:tcW w:w="2275" w:type="dxa"/>
+            <w:vAlign w:val="center"/>
+          </w:tcPr>
+          <w:p>
+            <w:pPr>
+              <w:cnfStyle w:val="100000000000" w:firstRow="1" w:lastRow="0" w:firstColumn="0" w:lastColumn="0" w:oddVBand="0" w:evenVBand="0" w:oddHBand="0" w:evenHBand="0" w:firstRowFirstColumn="0" w:firstRowLastColumn="0" w:lastRowFirstColumn="0" w:lastRowLastColumn="0"/>
+            </w:pPr>
+            <w:r>
+              <w:rPr>
+                <w:lang w:val="en-IN"/>
+              </w:rPr>
+              <w:t>Validation Loss</w:t>
+            </w:r>
+          </w:p>
+        </w:tc>
+      </w:tr>
+      <w:tr>
+        <w:trPr>
+          <w:cnfStyle w:val="000000100000" w:firstRow="0" w:lastRow="0" w:firstColumn="0" w:lastColumn="0" w:oddVBand="0" w:evenVBand="0" w:oddHBand="1" w:evenHBand="0" w:firstRowFirstColumn="0" w:firstRowLastColumn="0" w:lastRowFirstColumn="0" w:lastRowLastColumn="0"/>
+          <w:jc w:val="center"/>
+        </w:trPr>
+        <w:tc>
+          <w:tcPr>
+            <w:cnfStyle w:val="001000000000" w:firstRow="0" w:lastRow="0" w:firstColumn="1" w:lastColumn="0" w:oddVBand="0" w:evenVBand="0" w:oddHBand="0" w:evenHBand="0" w:firstRowFirstColumn="0" w:firstRowLastColumn="0" w:lastRowFirstColumn="0" w:lastRowLastColumn="0"/>
+            <w:tcW w:w="2346" w:type="dxa"/>
+          </w:tcPr>
+          <w:p>
+            <w:r>
+              <w:rPr>
+                <w:sz w:val="20"/>
+              </w:rPr>
+              <w:t>1</w:t>
+            </w:r>
+          </w:p>
+        </w:tc>
+        <w:tc>
+          <w:tcPr>
+            <w:tcW w:w="2222" w:type="dxa"/>
+          </w:tcPr>
+          <w:p>
+            <w:pPr>
+              <w:cnfStyle w:val="000000100000" w:firstRow="0" w:lastRow="0" w:firstColumn="0" w:lastColumn="0" w:oddVBand="0" w:evenVBand="0" w:oddHBand="1" w:evenHBand="0" w:firstRowFirstColumn="0" w:firstRowLastColumn="0" w:lastRowFirstColumn="0" w:lastRowLastColumn="0"/>
+            </w:pPr>
+            <w:r>
+              <w:rPr>
+                <w:lang w:val="en-IN"/>
+              </w:rPr>
+              <w:t>6.300782</w:t>
+            </w:r>
+          </w:p>
+        </w:tc>
+        <w:tc>
+          <w:tcPr>
+            <w:tcW w:w="2275" w:type="dxa"/>
+            <w:vAlign w:val="center"/>
+          </w:tcPr>
+          <w:p>
+            <w:pPr>
+              <w:cnfStyle w:val="000000100000" w:firstRow="0" w:lastRow="0" w:firstColumn="0" w:lastColumn="0" w:oddVBand="0" w:evenVBand="0" w:oddHBand="1" w:evenHBand="0" w:firstRowFirstColumn="0" w:firstRowLastColumn="0" w:lastRowFirstColumn="0" w:lastRowLastColumn="0"/>
+            </w:pPr>
+            <w:r>
+              <w:rPr>
+                <w:lang w:val="en-IN"/>
+              </w:rPr>
+              <w:t>1.443388</w:t>
+            </w:r>
+          </w:p>
+        </w:tc>
+      </w:tr>
+      <w:tr>
+        <w:trPr>
+          <w:cnfStyle w:val="000000010000" w:firstRow="0" w:lastRow="0" w:firstColumn="0" w:lastColumn="0" w:oddVBand="0" w:evenVBand="0" w:oddHBand="0" w:evenHBand="1" w:firstRowFirstColumn="0" w:firstRowLastColumn="0" w:lastRowFirstColumn="0" w:lastRowLastColumn="0"/>
+          <w:jc w:val="center"/>
+        </w:trPr>
+        <w:tc>
+          <w:tcPr>
+            <w:cnfStyle w:val="001000000000" w:firstRow="0" w:lastRow="0" w:firstColumn="1" w:lastColumn="0" w:oddVBand="0" w:evenVBand="0" w:oddHBand="0" w:evenHBand="0" w:firstRowFirstColumn="0" w:firstRowLastColumn="0" w:lastRowFirstColumn="0" w:lastRowLastColumn="0"/>
+            <w:tcW w:w="2346" w:type="dxa"/>
+          </w:tcPr>
+          <w:p>
+            <w:r>
+              <w:rPr>
+                <w:sz w:val="20"/>
+              </w:rPr>
+              <w:t>2</w:t>
+            </w:r>
+          </w:p>
+        </w:tc>
+        <w:tc>
+          <w:tcPr>
+            <w:tcW w:w="2222" w:type="dxa"/>
+            <w:vAlign w:val="center"/>
+          </w:tcPr>
+          <w:p>
+            <w:pPr>
+              <w:cnfStyle w:val="000000010000" w:firstRow="0" w:lastRow="0" w:firstColumn="0" w:lastColumn="0" w:oddVBand="0" w:evenVBand="0" w:oddHBand="0" w:evenHBand="1" w:firstRowFirstColumn="0" w:firstRowLastColumn="0" w:lastRowFirstColumn="0" w:lastRowLastColumn="0"/>
+            </w:pPr>
+            <w:r>
+              <w:rPr>
+                <w:lang w:val="en-IN"/>
+              </w:rPr>
+              <w:t>5.356235</w:t>
+            </w:r>
+          </w:p>
+        </w:tc>
+        <w:tc>
+          <w:tcPr>
+            <w:tcW w:w="2275" w:type="dxa"/>
+            <w:vAlign w:val="center"/>
+          </w:tcPr>
+          <w:p>
+            <w:pPr>
+              <w:cnfStyle w:val="000000010000" w:firstRow="0" w:lastRow="0" w:firstColumn="0" w:lastColumn="0" w:oddVBand="0" w:evenVBand="0" w:oddHBand="0" w:evenHBand="1" w:firstRowFirstColumn="0" w:firstRowLastColumn="0" w:lastRowFirstColumn="0" w:lastRowLastColumn="0"/>
+            </w:pPr>
+            <w:r>
+              <w:rPr>
+                <w:lang w:val="en-IN"/>
+              </w:rPr>
+              <w:t>1.383186</w:t>
+            </w:r>
+          </w:p>
+        </w:tc>
+      </w:tr>
+      <w:tr>
+        <w:trPr>
+          <w:cnfStyle w:val="000000100000" w:firstRow="0" w:lastRow="0" w:firstColumn="0" w:lastColumn="0" w:oddVBand="0" w:evenVBand="0" w:oddHBand="1" w:evenHBand="0" w:firstRowFirstColumn="0" w:firstRowLastColumn="0" w:lastRowFirstColumn="0" w:lastRowLastColumn="0"/>
+          <w:jc w:val="center"/>
+        </w:trPr>
+        <w:tc>
+          <w:tcPr>
+            <w:cnfStyle w:val="001000000000" w:firstRow="0" w:lastRow="0" w:firstColumn="1" w:lastColumn="0" w:oddVBand="0" w:evenVBand="0" w:oddHBand="0" w:evenHBand="0" w:firstRowFirstColumn="0" w:firstRowLastColumn="0" w:lastRowFirstColumn="0" w:lastRowLastColumn="0"/>
+            <w:tcW w:w="2346" w:type="dxa"/>
+          </w:tcPr>
+          <w:p>
+            <w:r>
+              <w:rPr>
+                <w:sz w:val="20"/>
+              </w:rPr>
+              <w:t>3</w:t>
+            </w:r>
+          </w:p>
+        </w:tc>
+        <w:tc>
+          <w:tcPr>
+            <w:tcW w:w="2222" w:type="dxa"/>
+            <w:vAlign w:val="center"/>
+          </w:tcPr>
+          <w:p>
+            <w:pPr>
+              <w:cnfStyle w:val="000000100000" w:firstRow="0" w:lastRow="0" w:firstColumn="0" w:lastColumn="0" w:oddVBand="0" w:evenVBand="0" w:oddHBand="1" w:evenHBand="0" w:firstRowFirstColumn="0" w:firstRowLastColumn="0" w:lastRowFirstColumn="0" w:lastRowLastColumn="0"/>
+            </w:pPr>
+            <w:r>
+              <w:rPr>
+                <w:lang w:val="en-IN"/>
+              </w:rPr>
+              <w:t>4.729929</w:t>
+            </w:r>
+          </w:p>
+        </w:tc>
+        <w:tc>
+          <w:tcPr>
+            <w:tcW w:w="2275" w:type="dxa"/>
+            <w:vAlign w:val="center"/>
+          </w:tcPr>
+          <w:p>
+            <w:pPr>
+              <w:cnfStyle w:val="000000100000" w:firstRow="0" w:lastRow="0" w:firstColumn="0" w:lastColumn="0" w:oddVBand="0" w:evenVBand="0" w:oddHBand="1" w:evenHBand="0" w:firstRowFirstColumn="0" w:firstRowLastColumn="0" w:lastRowFirstColumn="0" w:lastRowLastColumn="0"/>
+            </w:pPr>
+            <w:r>
+              <w:rPr>
+                <w:lang w:val="en-IN"/>
+              </w:rPr>
+              <w:t>1.376269</w:t>
+            </w:r>
+          </w:p>
+        </w:tc>
+      </w:tr>
+    </w:tbl>
+    <w:p/>
     <w:p>
       <w:pPr>
         <w:pStyle w:val="Heading2"/>
@@ -577,26 +1112,19 @@
         <w:rPr>
           <w:color w:val="000000"/>
         </w:rPr>
-        <w:t>3.2 Tokenization</w:t>
-      </w:r>
-    </w:p>
-    <w:p>
-      <w:r>
-        <w:rPr>
-          <w:sz w:val="20"/>
-        </w:rPr>
-        <w:t>The custom model creates two separate word-level vocabularies from the training set, with a minimum frequency threshold of 1, and with special tokens, &lt;bos&gt;, &lt;eos&gt;. This yielded 33278 Sanskrit tokens and 10743 English tokens. The pretrained model uses NLLB's built-in SentencePiece subword tokenizer (AutoTokenizer.from_pretrained), which supports 200 languages, with src_lang= san_Deva.</w:t>
-      </w:r>
-    </w:p>
-    <w:p>
-      <w:pPr>
-        <w:pStyle w:val="Heading2"/>
-      </w:pPr>
+        <w:t>3.</w:t>
+      </w:r>
       <w:r>
         <w:rPr>
           <w:color w:val="000000"/>
         </w:rPr>
-        <w:t>3.3 Hyperparameters</w:t>
+        <w:t>2</w:t>
+      </w:r>
+      <w:r>
+        <w:rPr>
+          <w:color w:val="000000"/>
+        </w:rPr>
+        <w:t xml:space="preserve"> Hyperparameters</w:t>
       </w:r>
     </w:p>
     <w:tbl>
@@ -606,9 +1134,10 @@
         <w:tblLook w:val="04A0" w:firstRow="1" w:lastRow="0" w:firstColumn="1" w:lastColumn="0" w:noHBand="0" w:noVBand="1"/>
       </w:tblPr>
       <w:tblGrid>
-        <w:gridCol w:w="2874"/>
-        <w:gridCol w:w="2873"/>
-        <w:gridCol w:w="2873"/>
+        <w:gridCol w:w="2346"/>
+        <w:gridCol w:w="2222"/>
+        <w:gridCol w:w="2275"/>
+        <w:gridCol w:w="1777"/>
       </w:tblGrid>
       <w:tr>
         <w:trPr>
@@ -617,7 +1146,7 @@
         <w:tc>
           <w:tcPr>
             <w:cnfStyle w:val="001000000000" w:firstRow="0" w:lastRow="0" w:firstColumn="1" w:lastColumn="0" w:oddVBand="0" w:evenVBand="0" w:oddHBand="0" w:evenHBand="0" w:firstRowFirstColumn="0" w:firstRowLastColumn="0" w:lastRowFirstColumn="0" w:lastRowLastColumn="0"/>
-            <w:tcW w:w="2874" w:type="dxa"/>
+            <w:tcW w:w="2346" w:type="dxa"/>
           </w:tcPr>
           <w:p>
             <w:r>
@@ -630,7 +1159,7 @@
         </w:tc>
         <w:tc>
           <w:tcPr>
-            <w:tcW w:w="2873" w:type="dxa"/>
+            <w:tcW w:w="2222" w:type="dxa"/>
           </w:tcPr>
           <w:p>
             <w:pPr>
@@ -646,7 +1175,7 @@
         </w:tc>
         <w:tc>
           <w:tcPr>
-            <w:tcW w:w="2873" w:type="dxa"/>
+            <w:tcW w:w="2275" w:type="dxa"/>
           </w:tcPr>
           <w:p>
             <w:pPr>
@@ -657,6 +1186,25 @@
                 <w:sz w:val="20"/>
               </w:rPr>
               <w:t>Pretrained Model</w:t>
+            </w:r>
+          </w:p>
+        </w:tc>
+        <w:tc>
+          <w:tcPr>
+            <w:tcW w:w="1777" w:type="dxa"/>
+          </w:tcPr>
+          <w:p>
+            <w:pPr>
+              <w:cnfStyle w:val="100000000000" w:firstRow="1" w:lastRow="0" w:firstColumn="0" w:lastColumn="0" w:oddVBand="0" w:evenVBand="0" w:oddHBand="0" w:evenHBand="0" w:firstRowFirstColumn="0" w:firstRowLastColumn="0" w:lastRowFirstColumn="0" w:lastRowLastColumn="0"/>
+              <w:rPr>
+                <w:sz w:val="20"/>
+              </w:rPr>
+            </w:pPr>
+            <w:r>
+              <w:rPr>
+                <w:sz w:val="20"/>
+              </w:rPr>
+              <w:t>Retrained Model</w:t>
             </w:r>
           </w:p>
         </w:tc>
@@ -668,7 +1216,7 @@
         <w:tc>
           <w:tcPr>
             <w:cnfStyle w:val="001000000000" w:firstRow="0" w:lastRow="0" w:firstColumn="1" w:lastColumn="0" w:oddVBand="0" w:evenVBand="0" w:oddHBand="0" w:evenHBand="0" w:firstRowFirstColumn="0" w:firstRowLastColumn="0" w:lastRowFirstColumn="0" w:lastRowLastColumn="0"/>
-            <w:tcW w:w="2874" w:type="dxa"/>
+            <w:tcW w:w="2346" w:type="dxa"/>
           </w:tcPr>
           <w:p>
             <w:r>
@@ -681,7 +1229,7 @@
         </w:tc>
         <w:tc>
           <w:tcPr>
-            <w:tcW w:w="2873" w:type="dxa"/>
+            <w:tcW w:w="2222" w:type="dxa"/>
           </w:tcPr>
           <w:p>
             <w:pPr>
@@ -697,11 +1245,30 @@
         </w:tc>
         <w:tc>
           <w:tcPr>
-            <w:tcW w:w="2873" w:type="dxa"/>
+            <w:tcW w:w="2275" w:type="dxa"/>
           </w:tcPr>
           <w:p>
             <w:pPr>
               <w:cnfStyle w:val="000000100000" w:firstRow="0" w:lastRow="0" w:firstColumn="0" w:lastColumn="0" w:oddVBand="0" w:evenVBand="0" w:oddHBand="1" w:evenHBand="0" w:firstRowFirstColumn="0" w:firstRowLastColumn="0" w:lastRowFirstColumn="0" w:lastRowLastColumn="0"/>
+            </w:pPr>
+            <w:r>
+              <w:rPr>
+                <w:sz w:val="20"/>
+              </w:rPr>
+              <w:t>1024 (fixed, from checkpoint)</w:t>
+            </w:r>
+          </w:p>
+        </w:tc>
+        <w:tc>
+          <w:tcPr>
+            <w:tcW w:w="1777" w:type="dxa"/>
+          </w:tcPr>
+          <w:p>
+            <w:pPr>
+              <w:cnfStyle w:val="000000100000" w:firstRow="0" w:lastRow="0" w:firstColumn="0" w:lastColumn="0" w:oddVBand="0" w:evenVBand="0" w:oddHBand="1" w:evenHBand="0" w:firstRowFirstColumn="0" w:firstRowLastColumn="0" w:lastRowFirstColumn="0" w:lastRowLastColumn="0"/>
+              <w:rPr>
+                <w:sz w:val="20"/>
+              </w:rPr>
             </w:pPr>
             <w:r>
               <w:rPr>
@@ -719,20 +1286,21 @@
         <w:tc>
           <w:tcPr>
             <w:cnfStyle w:val="001000000000" w:firstRow="0" w:lastRow="0" w:firstColumn="1" w:lastColumn="0" w:oddVBand="0" w:evenVBand="0" w:oddHBand="0" w:evenHBand="0" w:firstRowFirstColumn="0" w:firstRowLastColumn="0" w:lastRowFirstColumn="0" w:lastRowLastColumn="0"/>
-            <w:tcW w:w="2874" w:type="dxa"/>
+            <w:tcW w:w="2346" w:type="dxa"/>
           </w:tcPr>
           <w:p>
             <w:r>
               <w:rPr>
                 <w:sz w:val="20"/>
               </w:rPr>
+              <w:lastRenderedPageBreak/>
               <w:t>Hidden dimension</w:t>
             </w:r>
           </w:p>
         </w:tc>
         <w:tc>
           <w:tcPr>
-            <w:tcW w:w="2873" w:type="dxa"/>
+            <w:tcW w:w="2222" w:type="dxa"/>
           </w:tcPr>
           <w:p>
             <w:pPr>
@@ -748,11 +1316,30 @@
         </w:tc>
         <w:tc>
           <w:tcPr>
-            <w:tcW w:w="2873" w:type="dxa"/>
+            <w:tcW w:w="2275" w:type="dxa"/>
           </w:tcPr>
           <w:p>
             <w:pPr>
               <w:cnfStyle w:val="000000010000" w:firstRow="0" w:lastRow="0" w:firstColumn="0" w:lastColumn="0" w:oddVBand="0" w:evenVBand="0" w:oddHBand="0" w:evenHBand="1" w:firstRowFirstColumn="0" w:firstRowLastColumn="0" w:lastRowFirstColumn="0" w:lastRowLastColumn="0"/>
+            </w:pPr>
+            <w:r>
+              <w:rPr>
+                <w:sz w:val="20"/>
+              </w:rPr>
+              <w:t>1024 (fixed, from checkpoint)</w:t>
+            </w:r>
+          </w:p>
+        </w:tc>
+        <w:tc>
+          <w:tcPr>
+            <w:tcW w:w="1777" w:type="dxa"/>
+          </w:tcPr>
+          <w:p>
+            <w:pPr>
+              <w:cnfStyle w:val="000000010000" w:firstRow="0" w:lastRow="0" w:firstColumn="0" w:lastColumn="0" w:oddVBand="0" w:evenVBand="0" w:oddHBand="0" w:evenHBand="1" w:firstRowFirstColumn="0" w:firstRowLastColumn="0" w:lastRowFirstColumn="0" w:lastRowLastColumn="0"/>
+              <w:rPr>
+                <w:sz w:val="20"/>
+              </w:rPr>
             </w:pPr>
             <w:r>
               <w:rPr>
@@ -770,7 +1357,7 @@
         <w:tc>
           <w:tcPr>
             <w:cnfStyle w:val="001000000000" w:firstRow="0" w:lastRow="0" w:firstColumn="1" w:lastColumn="0" w:oddVBand="0" w:evenVBand="0" w:oddHBand="0" w:evenHBand="0" w:firstRowFirstColumn="0" w:firstRowLastColumn="0" w:lastRowFirstColumn="0" w:lastRowLastColumn="0"/>
-            <w:tcW w:w="2874" w:type="dxa"/>
+            <w:tcW w:w="2346" w:type="dxa"/>
           </w:tcPr>
           <w:p>
             <w:r>
@@ -783,7 +1370,7 @@
         </w:tc>
         <w:tc>
           <w:tcPr>
-            <w:tcW w:w="2873" w:type="dxa"/>
+            <w:tcW w:w="2222" w:type="dxa"/>
           </w:tcPr>
           <w:p>
             <w:pPr>
@@ -799,7 +1386,7 @@
         </w:tc>
         <w:tc>
           <w:tcPr>
-            <w:tcW w:w="2873" w:type="dxa"/>
+            <w:tcW w:w="2275" w:type="dxa"/>
           </w:tcPr>
           <w:p>
             <w:pPr>
@@ -810,6 +1397,25 @@
                 <w:sz w:val="20"/>
               </w:rPr>
               <w:t>12 (Transformer, fixed)</w:t>
+            </w:r>
+          </w:p>
+        </w:tc>
+        <w:tc>
+          <w:tcPr>
+            <w:tcW w:w="1777" w:type="dxa"/>
+          </w:tcPr>
+          <w:p>
+            <w:pPr>
+              <w:cnfStyle w:val="000000100000" w:firstRow="0" w:lastRow="0" w:firstColumn="0" w:lastColumn="0" w:oddVBand="0" w:evenVBand="0" w:oddHBand="1" w:evenHBand="0" w:firstRowFirstColumn="0" w:firstRowLastColumn="0" w:lastRowFirstColumn="0" w:lastRowLastColumn="0"/>
+              <w:rPr>
+                <w:sz w:val="20"/>
+              </w:rPr>
+            </w:pPr>
+            <w:r>
+              <w:rPr>
+                <w:sz w:val="20"/>
+              </w:rPr>
+              <w:t>12</w:t>
             </w:r>
           </w:p>
         </w:tc>
@@ -821,7 +1427,7 @@
         <w:tc>
           <w:tcPr>
             <w:cnfStyle w:val="001000000000" w:firstRow="0" w:lastRow="0" w:firstColumn="1" w:lastColumn="0" w:oddVBand="0" w:evenVBand="0" w:oddHBand="0" w:evenHBand="0" w:firstRowFirstColumn="0" w:firstRowLastColumn="0" w:lastRowFirstColumn="0" w:lastRowLastColumn="0"/>
-            <w:tcW w:w="2874" w:type="dxa"/>
+            <w:tcW w:w="2346" w:type="dxa"/>
           </w:tcPr>
           <w:p>
             <w:r>
@@ -834,7 +1440,7 @@
         </w:tc>
         <w:tc>
           <w:tcPr>
-            <w:tcW w:w="2873" w:type="dxa"/>
+            <w:tcW w:w="2222" w:type="dxa"/>
           </w:tcPr>
           <w:p>
             <w:pPr>
@@ -850,7 +1456,7 @@
         </w:tc>
         <w:tc>
           <w:tcPr>
-            <w:tcW w:w="2873" w:type="dxa"/>
+            <w:tcW w:w="2275" w:type="dxa"/>
           </w:tcPr>
           <w:p>
             <w:pPr>
@@ -861,6 +1467,25 @@
                 <w:sz w:val="20"/>
               </w:rPr>
               <w:t>N/A (inference only, no fine-tuning)</w:t>
+            </w:r>
+          </w:p>
+        </w:tc>
+        <w:tc>
+          <w:tcPr>
+            <w:tcW w:w="1777" w:type="dxa"/>
+          </w:tcPr>
+          <w:p>
+            <w:pPr>
+              <w:cnfStyle w:val="000000010000" w:firstRow="0" w:lastRow="0" w:firstColumn="0" w:lastColumn="0" w:oddVBand="0" w:evenVBand="0" w:oddHBand="0" w:evenHBand="1" w:firstRowFirstColumn="0" w:firstRowLastColumn="0" w:lastRowFirstColumn="0" w:lastRowLastColumn="0"/>
+              <w:rPr>
+                <w:sz w:val="20"/>
+              </w:rPr>
+            </w:pPr>
+            <w:r>
+              <w:rPr>
+                <w:sz w:val="20"/>
+              </w:rPr>
+              <w:t>0.1</w:t>
             </w:r>
           </w:p>
         </w:tc>
@@ -872,7 +1497,7 @@
         <w:tc>
           <w:tcPr>
             <w:cnfStyle w:val="001000000000" w:firstRow="0" w:lastRow="0" w:firstColumn="1" w:lastColumn="0" w:oddVBand="0" w:evenVBand="0" w:oddHBand="0" w:evenHBand="0" w:firstRowFirstColumn="0" w:firstRowLastColumn="0" w:lastRowFirstColumn="0" w:lastRowLastColumn="0"/>
-            <w:tcW w:w="2874" w:type="dxa"/>
+            <w:tcW w:w="2346" w:type="dxa"/>
           </w:tcPr>
           <w:p>
             <w:r>
@@ -885,7 +1510,7 @@
         </w:tc>
         <w:tc>
           <w:tcPr>
-            <w:tcW w:w="2873" w:type="dxa"/>
+            <w:tcW w:w="2222" w:type="dxa"/>
           </w:tcPr>
           <w:p>
             <w:pPr>
@@ -901,7 +1526,7 @@
         </w:tc>
         <w:tc>
           <w:tcPr>
-            <w:tcW w:w="2873" w:type="dxa"/>
+            <w:tcW w:w="2275" w:type="dxa"/>
           </w:tcPr>
           <w:p>
             <w:pPr>
@@ -912,6 +1537,25 @@
                 <w:sz w:val="20"/>
               </w:rPr>
               <w:t>N/A</w:t>
+            </w:r>
+          </w:p>
+        </w:tc>
+        <w:tc>
+          <w:tcPr>
+            <w:tcW w:w="1777" w:type="dxa"/>
+          </w:tcPr>
+          <w:p>
+            <w:pPr>
+              <w:cnfStyle w:val="000000100000" w:firstRow="0" w:lastRow="0" w:firstColumn="0" w:lastColumn="0" w:oddVBand="0" w:evenVBand="0" w:oddHBand="1" w:evenHBand="0" w:firstRowFirstColumn="0" w:firstRowLastColumn="0" w:lastRowFirstColumn="0" w:lastRowLastColumn="0"/>
+              <w:rPr>
+                <w:sz w:val="20"/>
+              </w:rPr>
+            </w:pPr>
+            <w:r>
+              <w:rPr>
+                <w:sz w:val="20"/>
+              </w:rPr>
+              <w:t>5e-5</w:t>
             </w:r>
           </w:p>
         </w:tc>
@@ -923,7 +1567,7 @@
         <w:tc>
           <w:tcPr>
             <w:cnfStyle w:val="001000000000" w:firstRow="0" w:lastRow="0" w:firstColumn="1" w:lastColumn="0" w:oddVBand="0" w:evenVBand="0" w:oddHBand="0" w:evenHBand="0" w:firstRowFirstColumn="0" w:firstRowLastColumn="0" w:lastRowFirstColumn="0" w:lastRowLastColumn="0"/>
-            <w:tcW w:w="2874" w:type="dxa"/>
+            <w:tcW w:w="2346" w:type="dxa"/>
           </w:tcPr>
           <w:p>
             <w:r>
@@ -936,7 +1580,7 @@
         </w:tc>
         <w:tc>
           <w:tcPr>
-            <w:tcW w:w="2873" w:type="dxa"/>
+            <w:tcW w:w="2222" w:type="dxa"/>
           </w:tcPr>
           <w:p>
             <w:pPr>
@@ -952,7 +1596,7 @@
         </w:tc>
         <w:tc>
           <w:tcPr>
-            <w:tcW w:w="2873" w:type="dxa"/>
+            <w:tcW w:w="2275" w:type="dxa"/>
           </w:tcPr>
           <w:p>
             <w:pPr>
@@ -964,6 +1608,19 @@
               </w:rPr>
               <w:t>16 (inference batching)</w:t>
             </w:r>
+          </w:p>
+        </w:tc>
+        <w:tc>
+          <w:tcPr>
+            <w:tcW w:w="1777" w:type="dxa"/>
+          </w:tcPr>
+          <w:p>
+            <w:pPr>
+              <w:cnfStyle w:val="000000010000" w:firstRow="0" w:lastRow="0" w:firstColumn="0" w:lastColumn="0" w:oddVBand="0" w:evenVBand="0" w:oddHBand="0" w:evenHBand="1" w:firstRowFirstColumn="0" w:firstRowLastColumn="0" w:lastRowFirstColumn="0" w:lastRowLastColumn="0"/>
+              <w:rPr>
+                <w:sz w:val="20"/>
+              </w:rPr>
+            </w:pPr>
           </w:p>
         </w:tc>
       </w:tr>
@@ -974,7 +1631,7 @@
         <w:tc>
           <w:tcPr>
             <w:cnfStyle w:val="001000000000" w:firstRow="0" w:lastRow="0" w:firstColumn="1" w:lastColumn="0" w:oddVBand="0" w:evenVBand="0" w:oddHBand="0" w:evenHBand="0" w:firstRowFirstColumn="0" w:firstRowLastColumn="0" w:lastRowFirstColumn="0" w:lastRowLastColumn="0"/>
-            <w:tcW w:w="2874" w:type="dxa"/>
+            <w:tcW w:w="2346" w:type="dxa"/>
           </w:tcPr>
           <w:p>
             <w:r>
@@ -987,7 +1644,7 @@
         </w:tc>
         <w:tc>
           <w:tcPr>
-            <w:tcW w:w="2873" w:type="dxa"/>
+            <w:tcW w:w="2222" w:type="dxa"/>
           </w:tcPr>
           <w:p>
             <w:pPr>
@@ -1003,7 +1660,7 @@
         </w:tc>
         <w:tc>
           <w:tcPr>
-            <w:tcW w:w="2873" w:type="dxa"/>
+            <w:tcW w:w="2275" w:type="dxa"/>
           </w:tcPr>
           <w:p>
             <w:pPr>
@@ -1014,6 +1671,177 @@
                 <w:sz w:val="20"/>
               </w:rPr>
               <w:t>0 (zero-shot, no training)</w:t>
+            </w:r>
+          </w:p>
+        </w:tc>
+        <w:tc>
+          <w:tcPr>
+            <w:tcW w:w="1777" w:type="dxa"/>
+          </w:tcPr>
+          <w:p>
+            <w:pPr>
+              <w:cnfStyle w:val="000000100000" w:firstRow="0" w:lastRow="0" w:firstColumn="0" w:lastColumn="0" w:oddVBand="0" w:evenVBand="0" w:oddHBand="1" w:evenHBand="0" w:firstRowFirstColumn="0" w:firstRowLastColumn="0" w:lastRowFirstColumn="0" w:lastRowLastColumn="0"/>
+              <w:rPr>
+                <w:sz w:val="20"/>
+              </w:rPr>
+            </w:pPr>
+            <w:r>
+              <w:rPr>
+                <w:sz w:val="20"/>
+              </w:rPr>
+              <w:t>3</w:t>
+            </w:r>
+          </w:p>
+        </w:tc>
+      </w:tr>
+      <w:tr>
+        <w:trPr>
+          <w:cnfStyle w:val="000000010000" w:firstRow="0" w:lastRow="0" w:firstColumn="0" w:lastColumn="0" w:oddVBand="0" w:evenVBand="0" w:oddHBand="0" w:evenHBand="1" w:firstRowFirstColumn="0" w:firstRowLastColumn="0" w:lastRowFirstColumn="0" w:lastRowLastColumn="0"/>
+          <w:trHeight w:val="44"/>
+        </w:trPr>
+        <w:tc>
+          <w:tcPr>
+            <w:cnfStyle w:val="001000000000" w:firstRow="0" w:lastRow="0" w:firstColumn="1" w:lastColumn="0" w:oddVBand="0" w:evenVBand="0" w:oddHBand="0" w:evenHBand="0" w:firstRowFirstColumn="0" w:firstRowLastColumn="0" w:lastRowFirstColumn="0" w:lastRowLastColumn="0"/>
+            <w:tcW w:w="2346" w:type="dxa"/>
+          </w:tcPr>
+          <w:p>
+            <w:r>
+              <w:rPr>
+                <w:sz w:val="20"/>
+              </w:rPr>
+              <w:t>Decoding strategy</w:t>
+            </w:r>
+          </w:p>
+        </w:tc>
+        <w:tc>
+          <w:tcPr>
+            <w:tcW w:w="2222" w:type="dxa"/>
+          </w:tcPr>
+          <w:p>
+            <w:pPr>
+              <w:cnfStyle w:val="000000010000" w:firstRow="0" w:lastRow="0" w:firstColumn="0" w:lastColumn="0" w:oddVBand="0" w:evenVBand="0" w:oddHBand="0" w:evenHBand="1" w:firstRowFirstColumn="0" w:firstRowLastColumn="0" w:lastRowFirstColumn="0" w:lastRowLastColumn="0"/>
+            </w:pPr>
+            <w:r>
+              <w:rPr>
+                <w:sz w:val="20"/>
+              </w:rPr>
+              <w:t>Greedy (argmax)</w:t>
+            </w:r>
+          </w:p>
+        </w:tc>
+        <w:tc>
+          <w:tcPr>
+            <w:tcW w:w="2275" w:type="dxa"/>
+          </w:tcPr>
+          <w:p>
+            <w:pPr>
+              <w:cnfStyle w:val="000000010000" w:firstRow="0" w:lastRow="0" w:firstColumn="0" w:lastColumn="0" w:oddVBand="0" w:evenVBand="0" w:oddHBand="0" w:evenHBand="1" w:firstRowFirstColumn="0" w:firstRowLastColumn="0" w:lastRowFirstColumn="0" w:lastRowLastColumn="0"/>
+            </w:pPr>
+            <w:r>
+              <w:rPr>
+                <w:sz w:val="20"/>
+              </w:rPr>
+              <w:t>Beam search, num_beams=5</w:t>
+            </w:r>
+          </w:p>
+        </w:tc>
+        <w:tc>
+          <w:tcPr>
+            <w:tcW w:w="1777" w:type="dxa"/>
+          </w:tcPr>
+          <w:p>
+            <w:pPr>
+              <w:cnfStyle w:val="000000010000" w:firstRow="0" w:lastRow="0" w:firstColumn="0" w:lastColumn="0" w:oddVBand="0" w:evenVBand="0" w:oddHBand="0" w:evenHBand="1" w:firstRowFirstColumn="0" w:firstRowLastColumn="0" w:lastRowFirstColumn="0" w:lastRowLastColumn="0"/>
+              <w:rPr>
+                <w:sz w:val="20"/>
+              </w:rPr>
+            </w:pPr>
+            <w:r>
+              <w:rPr>
+                <w:sz w:val="20"/>
+              </w:rPr>
+              <w:t>Beam search, num_beams=5</w:t>
+            </w:r>
+          </w:p>
+        </w:tc>
+      </w:tr>
+      <w:tr>
+        <w:trPr>
+          <w:cnfStyle w:val="000000100000" w:firstRow="0" w:lastRow="0" w:firstColumn="0" w:lastColumn="0" w:oddVBand="0" w:evenVBand="0" w:oddHBand="1" w:evenHBand="0" w:firstRowFirstColumn="0" w:firstRowLastColumn="0" w:lastRowFirstColumn="0" w:lastRowLastColumn="0"/>
+        </w:trPr>
+        <w:tc>
+          <w:tcPr>
+            <w:cnfStyle w:val="001000000000" w:firstRow="0" w:lastRow="0" w:firstColumn="1" w:lastColumn="0" w:oddVBand="0" w:evenVBand="0" w:oddHBand="0" w:evenHBand="0" w:firstRowFirstColumn="0" w:firstRowLastColumn="0" w:lastRowFirstColumn="0" w:lastRowLastColumn="0"/>
+            <w:tcW w:w="2346" w:type="dxa"/>
+          </w:tcPr>
+          <w:p>
+            <w:pPr>
+              <w:rPr>
+                <w:sz w:val="20"/>
+              </w:rPr>
+            </w:pPr>
+            <w:r>
+              <w:rPr>
+                <w:sz w:val="20"/>
+              </w:rPr>
+              <w:t>Length Penalty</w:t>
+            </w:r>
+          </w:p>
+        </w:tc>
+        <w:tc>
+          <w:tcPr>
+            <w:tcW w:w="2222" w:type="dxa"/>
+          </w:tcPr>
+          <w:p>
+            <w:pPr>
+              <w:cnfStyle w:val="000000100000" w:firstRow="0" w:lastRow="0" w:firstColumn="0" w:lastColumn="0" w:oddVBand="0" w:evenVBand="0" w:oddHBand="1" w:evenHBand="0" w:firstRowFirstColumn="0" w:firstRowLastColumn="0" w:lastRowFirstColumn="0" w:lastRowLastColumn="0"/>
+              <w:rPr>
+                <w:sz w:val="20"/>
+              </w:rPr>
+            </w:pPr>
+            <w:r>
+              <w:rPr>
+                <w:sz w:val="20"/>
+              </w:rPr>
+              <w:t>N/A</w:t>
+            </w:r>
+          </w:p>
+        </w:tc>
+        <w:tc>
+          <w:tcPr>
+            <w:tcW w:w="2275" w:type="dxa"/>
+          </w:tcPr>
+          <w:p>
+            <w:pPr>
+              <w:cnfStyle w:val="000000100000" w:firstRow="0" w:lastRow="0" w:firstColumn="0" w:lastColumn="0" w:oddVBand="0" w:evenVBand="0" w:oddHBand="1" w:evenHBand="0" w:firstRowFirstColumn="0" w:firstRowLastColumn="0" w:lastRowFirstColumn="0" w:lastRowLastColumn="0"/>
+              <w:rPr>
+                <w:sz w:val="20"/>
+              </w:rPr>
+            </w:pPr>
+            <w:r>
+              <w:rPr>
+                <w:sz w:val="20"/>
+              </w:rPr>
+              <w:t>1.0</w:t>
+            </w:r>
+          </w:p>
+        </w:tc>
+        <w:tc>
+          <w:tcPr>
+            <w:tcW w:w="1777" w:type="dxa"/>
+          </w:tcPr>
+          <w:p>
+            <w:pPr>
+              <w:cnfStyle w:val="000000100000" w:firstRow="0" w:lastRow="0" w:firstColumn="0" w:lastColumn="0" w:oddVBand="0" w:evenVBand="0" w:oddHBand="1" w:evenHBand="0" w:firstRowFirstColumn="0" w:firstRowLastColumn="0" w:lastRowFirstColumn="0" w:lastRowLastColumn="0"/>
+              <w:rPr>
+                <w:sz w:val="20"/>
+              </w:rPr>
+            </w:pPr>
+            <w:r>
+              <w:rPr>
+                <w:sz w:val="20"/>
+              </w:rPr>
+              <w:t>1.0</w:t>
             </w:r>
           </w:p>
         </w:tc>
@@ -1025,47 +1853,76 @@
         <w:tc>
           <w:tcPr>
             <w:cnfStyle w:val="001000000000" w:firstRow="0" w:lastRow="0" w:firstColumn="1" w:lastColumn="0" w:oddVBand="0" w:evenVBand="0" w:oddHBand="0" w:evenHBand="0" w:firstRowFirstColumn="0" w:firstRowLastColumn="0" w:lastRowFirstColumn="0" w:lastRowLastColumn="0"/>
-            <w:tcW w:w="2874" w:type="dxa"/>
+            <w:tcW w:w="2346" w:type="dxa"/>
           </w:tcPr>
           <w:p>
-            <w:r>
+            <w:pPr>
               <w:rPr>
                 <w:sz w:val="20"/>
               </w:rPr>
-              <w:lastRenderedPageBreak/>
-              <w:t>Gradient clipping</w:t>
+            </w:pPr>
+            <w:r>
+              <w:rPr>
+                <w:sz w:val="20"/>
+              </w:rPr>
+              <w:t>No Repeat N-Gram Size</w:t>
             </w:r>
           </w:p>
         </w:tc>
         <w:tc>
           <w:tcPr>
-            <w:tcW w:w="2873" w:type="dxa"/>
+            <w:tcW w:w="2222" w:type="dxa"/>
           </w:tcPr>
           <w:p>
             <w:pPr>
               <w:cnfStyle w:val="000000010000" w:firstRow="0" w:lastRow="0" w:firstColumn="0" w:lastColumn="0" w:oddVBand="0" w:evenVBand="0" w:oddHBand="0" w:evenHBand="1" w:firstRowFirstColumn="0" w:firstRowLastColumn="0" w:lastRowFirstColumn="0" w:lastRowLastColumn="0"/>
+              <w:rPr>
+                <w:sz w:val="20"/>
+              </w:rPr>
             </w:pPr>
             <w:r>
               <w:rPr>
                 <w:sz w:val="20"/>
               </w:rPr>
-              <w:t>1.0</w:t>
+              <w:t>N/A</w:t>
             </w:r>
           </w:p>
         </w:tc>
         <w:tc>
           <w:tcPr>
-            <w:tcW w:w="2873" w:type="dxa"/>
+            <w:tcW w:w="2275" w:type="dxa"/>
           </w:tcPr>
           <w:p>
             <w:pPr>
               <w:cnfStyle w:val="000000010000" w:firstRow="0" w:lastRow="0" w:firstColumn="0" w:lastColumn="0" w:oddVBand="0" w:evenVBand="0" w:oddHBand="0" w:evenHBand="1" w:firstRowFirstColumn="0" w:firstRowLastColumn="0" w:lastRowFirstColumn="0" w:lastRowLastColumn="0"/>
+              <w:rPr>
+                <w:sz w:val="20"/>
+              </w:rPr>
             </w:pPr>
             <w:r>
               <w:rPr>
                 <w:sz w:val="20"/>
               </w:rPr>
-              <w:t>N/A</w:t>
+              <w:t>3</w:t>
+            </w:r>
+          </w:p>
+        </w:tc>
+        <w:tc>
+          <w:tcPr>
+            <w:tcW w:w="1777" w:type="dxa"/>
+          </w:tcPr>
+          <w:p>
+            <w:pPr>
+              <w:cnfStyle w:val="000000010000" w:firstRow="0" w:lastRow="0" w:firstColumn="0" w:lastColumn="0" w:oddVBand="0" w:evenVBand="0" w:oddHBand="0" w:evenHBand="1" w:firstRowFirstColumn="0" w:firstRowLastColumn="0" w:lastRowFirstColumn="0" w:lastRowLastColumn="0"/>
+              <w:rPr>
+                <w:sz w:val="20"/>
+              </w:rPr>
+            </w:pPr>
+            <w:r>
+              <w:rPr>
+                <w:sz w:val="20"/>
+              </w:rPr>
+              <w:t>3</w:t>
             </w:r>
           </w:p>
         </w:tc>
@@ -1077,46 +1934,76 @@
         <w:tc>
           <w:tcPr>
             <w:cnfStyle w:val="001000000000" w:firstRow="0" w:lastRow="0" w:firstColumn="1" w:lastColumn="0" w:oddVBand="0" w:evenVBand="0" w:oddHBand="0" w:evenHBand="0" w:firstRowFirstColumn="0" w:firstRowLastColumn="0" w:lastRowFirstColumn="0" w:lastRowLastColumn="0"/>
-            <w:tcW w:w="2874" w:type="dxa"/>
+            <w:tcW w:w="2346" w:type="dxa"/>
           </w:tcPr>
           <w:p>
-            <w:r>
+            <w:pPr>
               <w:rPr>
                 <w:sz w:val="20"/>
               </w:rPr>
-              <w:t>Decoding strategy</w:t>
+            </w:pPr>
+            <w:r>
+              <w:rPr>
+                <w:sz w:val="20"/>
+              </w:rPr>
+              <w:t>Repetition Penalty</w:t>
             </w:r>
           </w:p>
         </w:tc>
         <w:tc>
           <w:tcPr>
-            <w:tcW w:w="2873" w:type="dxa"/>
+            <w:tcW w:w="2222" w:type="dxa"/>
           </w:tcPr>
           <w:p>
             <w:pPr>
               <w:cnfStyle w:val="000000100000" w:firstRow="0" w:lastRow="0" w:firstColumn="0" w:lastColumn="0" w:oddVBand="0" w:evenVBand="0" w:oddHBand="1" w:evenHBand="0" w:firstRowFirstColumn="0" w:firstRowLastColumn="0" w:lastRowFirstColumn="0" w:lastRowLastColumn="0"/>
+              <w:rPr>
+                <w:sz w:val="20"/>
+              </w:rPr>
             </w:pPr>
             <w:r>
               <w:rPr>
                 <w:sz w:val="20"/>
               </w:rPr>
-              <w:t>Greedy (argmax)</w:t>
+              <w:t>N/A</w:t>
             </w:r>
           </w:p>
         </w:tc>
         <w:tc>
           <w:tcPr>
-            <w:tcW w:w="2873" w:type="dxa"/>
+            <w:tcW w:w="2275" w:type="dxa"/>
           </w:tcPr>
           <w:p>
             <w:pPr>
               <w:cnfStyle w:val="000000100000" w:firstRow="0" w:lastRow="0" w:firstColumn="0" w:lastColumn="0" w:oddVBand="0" w:evenVBand="0" w:oddHBand="1" w:evenHBand="0" w:firstRowFirstColumn="0" w:firstRowLastColumn="0" w:lastRowFirstColumn="0" w:lastRowLastColumn="0"/>
+              <w:rPr>
+                <w:sz w:val="20"/>
+              </w:rPr>
             </w:pPr>
             <w:r>
               <w:rPr>
                 <w:sz w:val="20"/>
               </w:rPr>
-              <w:t>Beam search, num_beams=5</w:t>
+              <w:t>1.2</w:t>
+            </w:r>
+          </w:p>
+        </w:tc>
+        <w:tc>
+          <w:tcPr>
+            <w:tcW w:w="1777" w:type="dxa"/>
+          </w:tcPr>
+          <w:p>
+            <w:pPr>
+              <w:cnfStyle w:val="000000100000" w:firstRow="0" w:lastRow="0" w:firstColumn="0" w:lastColumn="0" w:oddVBand="0" w:evenVBand="0" w:oddHBand="1" w:evenHBand="0" w:firstRowFirstColumn="0" w:firstRowLastColumn="0" w:lastRowFirstColumn="0" w:lastRowLastColumn="0"/>
+              <w:rPr>
+                <w:sz w:val="20"/>
+              </w:rPr>
+            </w:pPr>
+            <w:r>
+              <w:rPr>
+                <w:sz w:val="20"/>
+              </w:rPr>
+              <w:t>1.2</w:t>
             </w:r>
           </w:p>
         </w:tc>
@@ -1128,57 +2015,65 @@
         <w:tc>
           <w:tcPr>
             <w:cnfStyle w:val="001000000000" w:firstRow="0" w:lastRow="0" w:firstColumn="1" w:lastColumn="0" w:oddVBand="0" w:evenVBand="0" w:oddHBand="0" w:evenHBand="0" w:firstRowFirstColumn="0" w:firstRowLastColumn="0" w:lastRowFirstColumn="0" w:lastRowLastColumn="0"/>
-            <w:tcW w:w="2874" w:type="dxa"/>
+            <w:tcW w:w="2346" w:type="dxa"/>
           </w:tcPr>
           <w:p>
-            <w:pPr>
+            <w:r>
               <w:rPr>
                 <w:sz w:val="20"/>
               </w:rPr>
-            </w:pPr>
-            <w:r>
-              <w:rPr>
-                <w:sz w:val="20"/>
-              </w:rPr>
-              <w:t>Length Penalty</w:t>
+              <w:t>Max sequence length</w:t>
             </w:r>
           </w:p>
         </w:tc>
         <w:tc>
           <w:tcPr>
-            <w:tcW w:w="2873" w:type="dxa"/>
+            <w:tcW w:w="2222" w:type="dxa"/>
           </w:tcPr>
           <w:p>
             <w:pPr>
               <w:cnfStyle w:val="000000010000" w:firstRow="0" w:lastRow="0" w:firstColumn="0" w:lastColumn="0" w:oddVBand="0" w:evenVBand="0" w:oddHBand="0" w:evenHBand="1" w:firstRowFirstColumn="0" w:firstRowLastColumn="0" w:lastRowFirstColumn="0" w:lastRowLastColumn="0"/>
+            </w:pPr>
+            <w:r>
               <w:rPr>
                 <w:sz w:val="20"/>
               </w:rPr>
-            </w:pPr>
-            <w:r>
-              <w:rPr>
-                <w:sz w:val="20"/>
-              </w:rPr>
-              <w:t>N/A</w:t>
+              <w:t>60 (decode cap)</w:t>
             </w:r>
           </w:p>
         </w:tc>
         <w:tc>
           <w:tcPr>
-            <w:tcW w:w="2873" w:type="dxa"/>
+            <w:tcW w:w="2275" w:type="dxa"/>
           </w:tcPr>
           <w:p>
             <w:pPr>
               <w:cnfStyle w:val="000000010000" w:firstRow="0" w:lastRow="0" w:firstColumn="0" w:lastColumn="0" w:oddVBand="0" w:evenVBand="0" w:oddHBand="0" w:evenHBand="1" w:firstRowFirstColumn="0" w:firstRowLastColumn="0" w:lastRowFirstColumn="0" w:lastRowLastColumn="0"/>
+            </w:pPr>
+            <w:r>
               <w:rPr>
                 <w:sz w:val="20"/>
               </w:rPr>
+              <w:t>128 tokens</w:t>
+            </w:r>
+          </w:p>
+        </w:tc>
+        <w:tc>
+          <w:tcPr>
+            <w:tcW w:w="1777" w:type="dxa"/>
+          </w:tcPr>
+          <w:p>
+            <w:pPr>
+              <w:cnfStyle w:val="000000010000" w:firstRow="0" w:lastRow="0" w:firstColumn="0" w:lastColumn="0" w:oddVBand="0" w:evenVBand="0" w:oddHBand="0" w:evenHBand="1" w:firstRowFirstColumn="0" w:firstRowLastColumn="0" w:lastRowFirstColumn="0" w:lastRowLastColumn="0"/>
+              <w:rPr>
+                <w:sz w:val="20"/>
+              </w:rPr>
             </w:pPr>
             <w:r>
               <w:rPr>
                 <w:sz w:val="20"/>
               </w:rPr>
-              <w:t>1.0</w:t>
+              <w:t>128</w:t>
             </w:r>
           </w:p>
         </w:tc>
@@ -1190,144 +2085,20 @@
         <w:tc>
           <w:tcPr>
             <w:cnfStyle w:val="001000000000" w:firstRow="0" w:lastRow="0" w:firstColumn="1" w:lastColumn="0" w:oddVBand="0" w:evenVBand="0" w:oddHBand="0" w:evenHBand="0" w:firstRowFirstColumn="0" w:firstRowLastColumn="0" w:lastRowFirstColumn="0" w:lastRowLastColumn="0"/>
-            <w:tcW w:w="2874" w:type="dxa"/>
+            <w:tcW w:w="2346" w:type="dxa"/>
           </w:tcPr>
           <w:p>
-            <w:pPr>
+            <w:r>
               <w:rPr>
                 <w:sz w:val="20"/>
               </w:rPr>
-            </w:pPr>
-            <w:r>
-              <w:rPr>
-                <w:sz w:val="20"/>
-              </w:rPr>
-              <w:t>No Repeat N-Gram Size</w:t>
+              <w:t>Trainable parameters</w:t>
             </w:r>
           </w:p>
         </w:tc>
         <w:tc>
           <w:tcPr>
-            <w:tcW w:w="2873" w:type="dxa"/>
-          </w:tcPr>
-          <w:p>
-            <w:pPr>
-              <w:cnfStyle w:val="000000100000" w:firstRow="0" w:lastRow="0" w:firstColumn="0" w:lastColumn="0" w:oddVBand="0" w:evenVBand="0" w:oddHBand="1" w:evenHBand="0" w:firstRowFirstColumn="0" w:firstRowLastColumn="0" w:lastRowFirstColumn="0" w:lastRowLastColumn="0"/>
-              <w:rPr>
-                <w:sz w:val="20"/>
-              </w:rPr>
-            </w:pPr>
-            <w:r>
-              <w:rPr>
-                <w:sz w:val="20"/>
-              </w:rPr>
-              <w:t>N/A</w:t>
-            </w:r>
-          </w:p>
-        </w:tc>
-        <w:tc>
-          <w:tcPr>
-            <w:tcW w:w="2873" w:type="dxa"/>
-          </w:tcPr>
-          <w:p>
-            <w:pPr>
-              <w:cnfStyle w:val="000000100000" w:firstRow="0" w:lastRow="0" w:firstColumn="0" w:lastColumn="0" w:oddVBand="0" w:evenVBand="0" w:oddHBand="1" w:evenHBand="0" w:firstRowFirstColumn="0" w:firstRowLastColumn="0" w:lastRowFirstColumn="0" w:lastRowLastColumn="0"/>
-              <w:rPr>
-                <w:sz w:val="20"/>
-              </w:rPr>
-            </w:pPr>
-            <w:r>
-              <w:rPr>
-                <w:sz w:val="20"/>
-              </w:rPr>
-              <w:t>3</w:t>
-            </w:r>
-          </w:p>
-        </w:tc>
-      </w:tr>
-      <w:tr>
-        <w:trPr>
-          <w:cnfStyle w:val="000000010000" w:firstRow="0" w:lastRow="0" w:firstColumn="0" w:lastColumn="0" w:oddVBand="0" w:evenVBand="0" w:oddHBand="0" w:evenHBand="1" w:firstRowFirstColumn="0" w:firstRowLastColumn="0" w:lastRowFirstColumn="0" w:lastRowLastColumn="0"/>
-        </w:trPr>
-        <w:tc>
-          <w:tcPr>
-            <w:cnfStyle w:val="001000000000" w:firstRow="0" w:lastRow="0" w:firstColumn="1" w:lastColumn="0" w:oddVBand="0" w:evenVBand="0" w:oddHBand="0" w:evenHBand="0" w:firstRowFirstColumn="0" w:firstRowLastColumn="0" w:lastRowFirstColumn="0" w:lastRowLastColumn="0"/>
-            <w:tcW w:w="2874" w:type="dxa"/>
-          </w:tcPr>
-          <w:p>
-            <w:pPr>
-              <w:rPr>
-                <w:sz w:val="20"/>
-              </w:rPr>
-            </w:pPr>
-            <w:r>
-              <w:rPr>
-                <w:sz w:val="20"/>
-              </w:rPr>
-              <w:t>Repetition Penalty</w:t>
-            </w:r>
-          </w:p>
-        </w:tc>
-        <w:tc>
-          <w:tcPr>
-            <w:tcW w:w="2873" w:type="dxa"/>
-          </w:tcPr>
-          <w:p>
-            <w:pPr>
-              <w:cnfStyle w:val="000000010000" w:firstRow="0" w:lastRow="0" w:firstColumn="0" w:lastColumn="0" w:oddVBand="0" w:evenVBand="0" w:oddHBand="0" w:evenHBand="1" w:firstRowFirstColumn="0" w:firstRowLastColumn="0" w:lastRowFirstColumn="0" w:lastRowLastColumn="0"/>
-              <w:rPr>
-                <w:sz w:val="20"/>
-              </w:rPr>
-            </w:pPr>
-            <w:r>
-              <w:rPr>
-                <w:sz w:val="20"/>
-              </w:rPr>
-              <w:t>N/A</w:t>
-            </w:r>
-          </w:p>
-        </w:tc>
-        <w:tc>
-          <w:tcPr>
-            <w:tcW w:w="2873" w:type="dxa"/>
-          </w:tcPr>
-          <w:p>
-            <w:pPr>
-              <w:cnfStyle w:val="000000010000" w:firstRow="0" w:lastRow="0" w:firstColumn="0" w:lastColumn="0" w:oddVBand="0" w:evenVBand="0" w:oddHBand="0" w:evenHBand="1" w:firstRowFirstColumn="0" w:firstRowLastColumn="0" w:lastRowFirstColumn="0" w:lastRowLastColumn="0"/>
-              <w:rPr>
-                <w:sz w:val="20"/>
-              </w:rPr>
-            </w:pPr>
-            <w:r>
-              <w:rPr>
-                <w:sz w:val="20"/>
-              </w:rPr>
-              <w:t>1.2</w:t>
-            </w:r>
-          </w:p>
-        </w:tc>
-      </w:tr>
-      <w:tr>
-        <w:trPr>
-          <w:cnfStyle w:val="000000100000" w:firstRow="0" w:lastRow="0" w:firstColumn="0" w:lastColumn="0" w:oddVBand="0" w:evenVBand="0" w:oddHBand="1" w:evenHBand="0" w:firstRowFirstColumn="0" w:firstRowLastColumn="0" w:lastRowFirstColumn="0" w:lastRowLastColumn="0"/>
-        </w:trPr>
-        <w:tc>
-          <w:tcPr>
-            <w:cnfStyle w:val="001000000000" w:firstRow="0" w:lastRow="0" w:firstColumn="1" w:lastColumn="0" w:oddVBand="0" w:evenVBand="0" w:oddHBand="0" w:evenHBand="0" w:firstRowFirstColumn="0" w:firstRowLastColumn="0" w:lastRowFirstColumn="0" w:lastRowLastColumn="0"/>
-            <w:tcW w:w="2874" w:type="dxa"/>
-          </w:tcPr>
-          <w:p>
-            <w:r>
-              <w:rPr>
-                <w:sz w:val="20"/>
-              </w:rPr>
-              <w:t>Max sequence length</w:t>
-            </w:r>
-          </w:p>
-        </w:tc>
-        <w:tc>
-          <w:tcPr>
-            <w:tcW w:w="2873" w:type="dxa"/>
+            <w:tcW w:w="2222" w:type="dxa"/>
           </w:tcPr>
           <w:p>
             <w:pPr>
@@ -1337,13 +2108,13 @@
               <w:rPr>
                 <w:sz w:val="20"/>
               </w:rPr>
-              <w:t>60 (decode cap)</w:t>
+              <w:t>36,964,855</w:t>
             </w:r>
           </w:p>
         </w:tc>
         <w:tc>
           <w:tcPr>
-            <w:tcW w:w="2873" w:type="dxa"/>
+            <w:tcW w:w="2275" w:type="dxa"/>
           </w:tcPr>
           <w:p>
             <w:pPr>
@@ -1353,58 +2124,26 @@
               <w:rPr>
                 <w:sz w:val="20"/>
               </w:rPr>
-              <w:t>128 tokens</w:t>
-            </w:r>
-          </w:p>
-        </w:tc>
-      </w:tr>
-      <w:tr>
-        <w:trPr>
-          <w:cnfStyle w:val="000000010000" w:firstRow="0" w:lastRow="0" w:firstColumn="0" w:lastColumn="0" w:oddVBand="0" w:evenVBand="0" w:oddHBand="0" w:evenHBand="1" w:firstRowFirstColumn="0" w:firstRowLastColumn="0" w:lastRowFirstColumn="0" w:lastRowLastColumn="0"/>
-        </w:trPr>
-        <w:tc>
-          <w:tcPr>
-            <w:cnfStyle w:val="001000000000" w:firstRow="0" w:lastRow="0" w:firstColumn="1" w:lastColumn="0" w:oddVBand="0" w:evenVBand="0" w:oddHBand="0" w:evenHBand="0" w:firstRowFirstColumn="0" w:firstRowLastColumn="0" w:lastRowFirstColumn="0" w:lastRowLastColumn="0"/>
-            <w:tcW w:w="2874" w:type="dxa"/>
-          </w:tcPr>
-          <w:p>
-            <w:r>
-              <w:rPr>
-                <w:sz w:val="20"/>
-              </w:rPr>
-              <w:t>Trainable parameters</w:t>
+              <w:t>615,073,792 (frozen/zero-shot)</w:t>
             </w:r>
           </w:p>
         </w:tc>
         <w:tc>
           <w:tcPr>
-            <w:tcW w:w="2873" w:type="dxa"/>
+            <w:tcW w:w="1777" w:type="dxa"/>
           </w:tcPr>
           <w:p>
             <w:pPr>
-              <w:cnfStyle w:val="000000010000" w:firstRow="0" w:lastRow="0" w:firstColumn="0" w:lastColumn="0" w:oddVBand="0" w:evenVBand="0" w:oddHBand="0" w:evenHBand="1" w:firstRowFirstColumn="0" w:firstRowLastColumn="0" w:lastRowFirstColumn="0" w:lastRowLastColumn="0"/>
+              <w:cnfStyle w:val="000000100000" w:firstRow="0" w:lastRow="0" w:firstColumn="0" w:lastColumn="0" w:oddVBand="0" w:evenVBand="0" w:oddHBand="1" w:evenHBand="0" w:firstRowFirstColumn="0" w:firstRowLastColumn="0" w:lastRowFirstColumn="0" w:lastRowLastColumn="0"/>
+              <w:rPr>
+                <w:sz w:val="20"/>
+              </w:rPr>
             </w:pPr>
             <w:r>
               <w:rPr>
                 <w:sz w:val="20"/>
               </w:rPr>
-              <w:t>36,964,855</w:t>
-            </w:r>
-          </w:p>
-        </w:tc>
-        <w:tc>
-          <w:tcPr>
-            <w:tcW w:w="2873" w:type="dxa"/>
-          </w:tcPr>
-          <w:p>
-            <w:pPr>
-              <w:cnfStyle w:val="000000010000" w:firstRow="0" w:lastRow="0" w:firstColumn="0" w:lastColumn="0" w:oddVBand="0" w:evenVBand="0" w:oddHBand="0" w:evenHBand="1" w:firstRowFirstColumn="0" w:firstRowLastColumn="0" w:lastRowFirstColumn="0" w:lastRowLastColumn="0"/>
-            </w:pPr>
-            <w:r>
-              <w:rPr>
-                <w:sz w:val="20"/>
-              </w:rPr>
-              <w:t>615,073,792 (frozen/zero-shot)</w:t>
+              <w:t>615,073,792</w:t>
             </w:r>
           </w:p>
         </w:tc>
@@ -1518,6 +2257,12 @@
                 <w:sz w:val="20"/>
               </w:rPr>
             </w:pPr>
+            <w:r>
+              <w:rPr>
+                <w:sz w:val="20"/>
+              </w:rPr>
+              <w:t>Retrained NLLB-200-600M (dev/test)</w:t>
+            </w:r>
           </w:p>
         </w:tc>
       </w:tr>
@@ -1586,6 +2331,12 @@
                 <w:sz w:val="20"/>
               </w:rPr>
             </w:pPr>
+            <w:r>
+              <w:rPr>
+                <w:sz w:val="20"/>
+              </w:rPr>
+              <w:t>0.2441</w:t>
+            </w:r>
           </w:p>
         </w:tc>
       </w:tr>
@@ -1654,6 +2405,12 @@
                 <w:sz w:val="20"/>
               </w:rPr>
             </w:pPr>
+            <w:r>
+              <w:rPr>
+                <w:sz w:val="20"/>
+              </w:rPr>
+              <w:t>0.6277</w:t>
+            </w:r>
           </w:p>
         </w:tc>
       </w:tr>
@@ -1672,7 +2429,7 @@
               <w:rPr>
                 <w:sz w:val="20"/>
               </w:rPr>
-              <w:t>Dev inference time (s)</w:t>
+              <w:t>Test inference time (s)</w:t>
             </w:r>
           </w:p>
         </w:tc>
@@ -1685,7 +2442,10 @@
               <w:cnfStyle w:val="000000100000" w:firstRow="0" w:lastRow="0" w:firstColumn="0" w:lastColumn="0" w:oddVBand="0" w:evenVBand="0" w:oddHBand="1" w:evenHBand="0" w:firstRowFirstColumn="0" w:firstRowLastColumn="0" w:lastRowFirstColumn="0" w:lastRowLastColumn="0"/>
             </w:pPr>
             <w:r>
-              <w:t>N/A</w:t>
+              <w:rPr>
+                <w:sz w:val="20"/>
+              </w:rPr>
+              <w:t>1.47</w:t>
             </w:r>
           </w:p>
         </w:tc>
@@ -1696,12 +2456,15 @@
           <w:p>
             <w:pPr>
               <w:cnfStyle w:val="000000100000" w:firstRow="0" w:lastRow="0" w:firstColumn="0" w:lastColumn="0" w:oddVBand="0" w:evenVBand="0" w:oddHBand="1" w:evenHBand="0" w:firstRowFirstColumn="0" w:firstRowLastColumn="0" w:lastRowFirstColumn="0" w:lastRowLastColumn="0"/>
+              <w:rPr>
+                <w:sz w:val="20"/>
+              </w:rPr>
             </w:pPr>
             <w:r>
               <w:rPr>
                 <w:sz w:val="20"/>
               </w:rPr>
-              <w:t>168.45</w:t>
+              <w:t>165.90</w:t>
             </w:r>
           </w:p>
         </w:tc>
@@ -1712,7 +2475,16 @@
           <w:p>
             <w:pPr>
               <w:cnfStyle w:val="000000100000" w:firstRow="0" w:lastRow="0" w:firstColumn="0" w:lastColumn="0" w:oddVBand="0" w:evenVBand="0" w:oddHBand="1" w:evenHBand="0" w:firstRowFirstColumn="0" w:firstRowLastColumn="0" w:lastRowFirstColumn="0" w:lastRowLastColumn="0"/>
+              <w:rPr>
+                <w:sz w:val="20"/>
+              </w:rPr>
             </w:pPr>
+            <w:r>
+              <w:rPr>
+                <w:sz w:val="20"/>
+              </w:rPr>
+              <w:t>195.13</w:t>
+            </w:r>
           </w:p>
         </w:tc>
       </w:tr>
@@ -1731,7 +2503,7 @@
               <w:rPr>
                 <w:sz w:val="20"/>
               </w:rPr>
-              <w:t>Test inference time (s)</w:t>
+              <w:t>Parameter count</w:t>
             </w:r>
           </w:p>
         </w:tc>
@@ -1747,7 +2519,7 @@
               <w:rPr>
                 <w:sz w:val="20"/>
               </w:rPr>
-              <w:t>1.47</w:t>
+              <w:t>36,964,855 (all trainable)</w:t>
             </w:r>
           </w:p>
         </w:tc>
@@ -1766,7 +2538,7 @@
               <w:rPr>
                 <w:sz w:val="20"/>
               </w:rPr>
-              <w:t>165.90</w:t>
+              <w:t>615,073,792 (all frozen)</w:t>
             </w:r>
           </w:p>
         </w:tc>
@@ -1781,74 +2553,12 @@
                 <w:sz w:val="20"/>
               </w:rPr>
             </w:pPr>
-          </w:p>
-        </w:tc>
-      </w:tr>
-      <w:tr>
-        <w:trPr>
-          <w:cnfStyle w:val="000000100000" w:firstRow="0" w:lastRow="0" w:firstColumn="0" w:lastColumn="0" w:oddVBand="0" w:evenVBand="0" w:oddHBand="1" w:evenHBand="0" w:firstRowFirstColumn="0" w:firstRowLastColumn="0" w:lastRowFirstColumn="0" w:lastRowLastColumn="0"/>
-          <w:jc w:val="center"/>
-        </w:trPr>
-        <w:tc>
-          <w:tcPr>
-            <w:cnfStyle w:val="001000000000" w:firstRow="0" w:lastRow="0" w:firstColumn="1" w:lastColumn="0" w:oddVBand="0" w:evenVBand="0" w:oddHBand="0" w:evenHBand="0" w:firstRowFirstColumn="0" w:firstRowLastColumn="0" w:lastRowFirstColumn="0" w:lastRowLastColumn="0"/>
-            <w:tcW w:w="1691" w:type="dxa"/>
-          </w:tcPr>
-          <w:p>
             <w:r>
               <w:rPr>
                 <w:sz w:val="20"/>
               </w:rPr>
-              <w:t>Parameter count</w:t>
-            </w:r>
-          </w:p>
-        </w:tc>
-        <w:tc>
-          <w:tcPr>
-            <w:tcW w:w="1843" w:type="dxa"/>
-          </w:tcPr>
-          <w:p>
-            <w:pPr>
-              <w:cnfStyle w:val="000000100000" w:firstRow="0" w:lastRow="0" w:firstColumn="0" w:lastColumn="0" w:oddVBand="0" w:evenVBand="0" w:oddHBand="1" w:evenHBand="0" w:firstRowFirstColumn="0" w:firstRowLastColumn="0" w:lastRowFirstColumn="0" w:lastRowLastColumn="0"/>
-            </w:pPr>
-            <w:r>
-              <w:rPr>
-                <w:sz w:val="20"/>
-              </w:rPr>
-              <w:t>36,964,855 (all trainable)</w:t>
-            </w:r>
-          </w:p>
-        </w:tc>
-        <w:tc>
-          <w:tcPr>
-            <w:tcW w:w="2126" w:type="dxa"/>
-          </w:tcPr>
-          <w:p>
-            <w:pPr>
-              <w:cnfStyle w:val="000000100000" w:firstRow="0" w:lastRow="0" w:firstColumn="0" w:lastColumn="0" w:oddVBand="0" w:evenVBand="0" w:oddHBand="1" w:evenHBand="0" w:firstRowFirstColumn="0" w:firstRowLastColumn="0" w:lastRowFirstColumn="0" w:lastRowLastColumn="0"/>
-              <w:rPr>
-                <w:sz w:val="20"/>
-              </w:rPr>
-            </w:pPr>
-            <w:r>
-              <w:rPr>
-                <w:sz w:val="20"/>
-              </w:rPr>
               <w:t>615,073,792 (all frozen)</w:t>
             </w:r>
-          </w:p>
-        </w:tc>
-        <w:tc>
-          <w:tcPr>
-            <w:tcW w:w="1865" w:type="dxa"/>
-          </w:tcPr>
-          <w:p>
-            <w:pPr>
-              <w:cnfStyle w:val="000000100000" w:firstRow="0" w:lastRow="0" w:firstColumn="0" w:lastColumn="0" w:oddVBand="0" w:evenVBand="0" w:oddHBand="1" w:evenHBand="0" w:firstRowFirstColumn="0" w:firstRowLastColumn="0" w:lastRowFirstColumn="0" w:lastRowLastColumn="0"/>
-              <w:rPr>
-                <w:sz w:val="20"/>
-              </w:rPr>
-            </w:pPr>
           </w:p>
         </w:tc>
       </w:tr>
@@ -1864,16 +2574,20 @@
     <w:p>
       <w:pPr>
         <w:jc w:val="center"/>
+        <w:rPr>
+          <w:lang w:val="en-IN"/>
+        </w:rPr>
       </w:pPr>
       <w:r>
         <w:rPr>
           <w:noProof/>
+          <w:lang w:val="en-IN"/>
         </w:rPr>
         <w:drawing>
-          <wp:inline distT="0" distB="0" distL="0" distR="0" wp14:anchorId="39697FDE" wp14:editId="1F5B4636">
-            <wp:extent cx="4572235" cy="2991004"/>
-            <wp:effectExtent l="0" t="0" r="0" b="0"/>
-            <wp:docPr id="1765826795" name="Picture 1"/>
+          <wp:inline distT="0" distB="0" distL="0" distR="0" wp14:anchorId="11DD11F0" wp14:editId="779A3C47">
+            <wp:extent cx="2956061" cy="1800665"/>
+            <wp:effectExtent l="0" t="0" r="0" b="9525"/>
+            <wp:docPr id="162178888" name="Picture 2"/>
             <wp:cNvGraphicFramePr>
               <a:graphicFrameLocks xmlns:a="http://schemas.openxmlformats.org/drawingml/2006/main" noChangeAspect="1"/>
             </wp:cNvGraphicFramePr>
@@ -1881,23 +2595,36 @@
               <a:graphicData uri="http://schemas.openxmlformats.org/drawingml/2006/picture">
                 <pic:pic xmlns:pic="http://schemas.openxmlformats.org/drawingml/2006/picture">
                   <pic:nvPicPr>
-                    <pic:cNvPr id="1765826795" name=""/>
-                    <pic:cNvPicPr/>
+                    <pic:cNvPr id="0" name="Picture 6"/>
+                    <pic:cNvPicPr>
+                      <a:picLocks noChangeAspect="1" noChangeArrowheads="1"/>
+                    </pic:cNvPicPr>
                   </pic:nvPicPr>
                   <pic:blipFill>
-                    <a:blip r:embed="rId8"/>
+                    <a:blip r:embed="rId8">
+                      <a:extLst>
+                        <a:ext uri="{28A0092B-C50C-407E-A947-70E740481C1C}">
+                          <a14:useLocalDpi xmlns:a14="http://schemas.microsoft.com/office/drawing/2010/main" val="0"/>
+                        </a:ext>
+                      </a:extLst>
+                    </a:blip>
+                    <a:srcRect/>
                     <a:stretch>
                       <a:fillRect/>
                     </a:stretch>
                   </pic:blipFill>
-                  <pic:spPr>
+                  <pic:spPr bwMode="auto">
                     <a:xfrm>
                       <a:off x="0" y="0"/>
-                      <a:ext cx="4572235" cy="2991004"/>
+                      <a:ext cx="2993331" cy="1823368"/>
                     </a:xfrm>
                     <a:prstGeom prst="rect">
                       <a:avLst/>
                     </a:prstGeom>
+                    <a:noFill/>
+                    <a:ln>
+                      <a:noFill/>
+                    </a:ln>
                   </pic:spPr>
                 </pic:pic>
               </a:graphicData>
@@ -1915,7 +2642,21 @@
           <w:i/>
           <w:sz w:val="18"/>
         </w:rPr>
-        <w:t>Figure 1: BLEU and BERTScore F1 comparison between pretrained and custom models.</w:t>
+        <w:t xml:space="preserve">Figure 1: BLEU and BERTScore F1 comparison between </w:t>
+      </w:r>
+      <w:r>
+        <w:rPr>
+          <w:i/>
+          <w:sz w:val="18"/>
+        </w:rPr>
+        <w:t xml:space="preserve">retrained, </w:t>
+      </w:r>
+      <w:r>
+        <w:rPr>
+          <w:i/>
+          <w:sz w:val="18"/>
+        </w:rPr>
+        <w:t>pretrained and custom models.</w:t>
       </w:r>
     </w:p>
     <w:p>
@@ -1944,7 +2685,43 @@
         <w:rPr>
           <w:color w:val="000000"/>
         </w:rPr>
-        <w:t>5.1 Custom Model Error Analysis</w:t>
+        <w:t>5.</w:t>
+      </w:r>
+      <w:r>
+        <w:rPr>
+          <w:color w:val="000000"/>
+        </w:rPr>
+        <w:t>1</w:t>
+      </w:r>
+      <w:r>
+        <w:rPr>
+          <w:color w:val="000000"/>
+        </w:rPr>
+        <w:t xml:space="preserve"> </w:t>
+      </w:r>
+      <w:r>
+        <w:rPr>
+          <w:color w:val="000000"/>
+        </w:rPr>
+        <w:t>R</w:t>
+      </w:r>
+      <w:r>
+        <w:rPr>
+          <w:color w:val="000000"/>
+        </w:rPr>
+        <w:t xml:space="preserve">e-Trained Model Error </w:t>
+      </w:r>
+      <w:r>
+        <w:rPr>
+          <w:color w:val="000000"/>
+        </w:rPr>
+        <w:t>A</w:t>
+      </w:r>
+      <w:r>
+        <w:rPr>
+          <w:color w:val="000000"/>
+        </w:rPr>
+        <w:t>nalysis</w:t>
       </w:r>
     </w:p>
     <w:p>
@@ -1960,958 +2737,7 @@
           <w:bCs/>
           <w:sz w:val="20"/>
         </w:rPr>
-        <w:t xml:space="preserve">custom model's </w:t>
-      </w:r>
-      <w:r>
-        <w:rPr>
-          <w:sz w:val="20"/>
-        </w:rPr>
-        <w:t>dev-set predictions (sanskrit_nmt_assignment.ipynb), each showing the Sanskrit source, human reference, model prediction, and an error-type annotation.</w:t>
-      </w:r>
-    </w:p>
-    <w:tbl>
-      <w:tblPr>
-        <w:tblStyle w:val="LightGrid-Accent1"/>
-        <w:tblW w:w="0" w:type="auto"/>
-        <w:tblLook w:val="04A0" w:firstRow="1" w:lastRow="0" w:firstColumn="1" w:lastColumn="0" w:noHBand="0" w:noVBand="1"/>
-      </w:tblPr>
-      <w:tblGrid>
-        <w:gridCol w:w="2155"/>
-        <w:gridCol w:w="2155"/>
-        <w:gridCol w:w="2154"/>
-        <w:gridCol w:w="2156"/>
-      </w:tblGrid>
-      <w:tr>
-        <w:trPr>
-          <w:cnfStyle w:val="100000000000" w:firstRow="1" w:lastRow="0" w:firstColumn="0" w:lastColumn="0" w:oddVBand="0" w:evenVBand="0" w:oddHBand="0" w:evenHBand="0" w:firstRowFirstColumn="0" w:firstRowLastColumn="0" w:lastRowFirstColumn="0" w:lastRowLastColumn="0"/>
-        </w:trPr>
-        <w:tc>
-          <w:tcPr>
-            <w:cnfStyle w:val="001000000000" w:firstRow="0" w:lastRow="0" w:firstColumn="1" w:lastColumn="0" w:oddVBand="0" w:evenVBand="0" w:oddHBand="0" w:evenHBand="0" w:firstRowFirstColumn="0" w:firstRowLastColumn="0" w:lastRowFirstColumn="0" w:lastRowLastColumn="0"/>
-            <w:tcW w:w="2160" w:type="dxa"/>
-          </w:tcPr>
-          <w:p>
-            <w:r>
-              <w:rPr>
-                <w:sz w:val="18"/>
-              </w:rPr>
-              <w:t>Source (Sanskrit)</w:t>
-            </w:r>
-          </w:p>
-        </w:tc>
-        <w:tc>
-          <w:tcPr>
-            <w:tcW w:w="2160" w:type="dxa"/>
-          </w:tcPr>
-          <w:p>
-            <w:pPr>
-              <w:cnfStyle w:val="100000000000" w:firstRow="1" w:lastRow="0" w:firstColumn="0" w:lastColumn="0" w:oddVBand="0" w:evenVBand="0" w:oddHBand="0" w:evenHBand="0" w:firstRowFirstColumn="0" w:firstRowLastColumn="0" w:lastRowFirstColumn="0" w:lastRowLastColumn="0"/>
-            </w:pPr>
-            <w:r>
-              <w:rPr>
-                <w:sz w:val="18"/>
-              </w:rPr>
-              <w:t>Reference</w:t>
-            </w:r>
-          </w:p>
-        </w:tc>
-        <w:tc>
-          <w:tcPr>
-            <w:tcW w:w="2160" w:type="dxa"/>
-          </w:tcPr>
-          <w:p>
-            <w:pPr>
-              <w:cnfStyle w:val="100000000000" w:firstRow="1" w:lastRow="0" w:firstColumn="0" w:lastColumn="0" w:oddVBand="0" w:evenVBand="0" w:oddHBand="0" w:evenHBand="0" w:firstRowFirstColumn="0" w:firstRowLastColumn="0" w:lastRowFirstColumn="0" w:lastRowLastColumn="0"/>
-            </w:pPr>
-            <w:r>
-              <w:rPr>
-                <w:sz w:val="18"/>
-              </w:rPr>
-              <w:t>Prediction</w:t>
-            </w:r>
-          </w:p>
-        </w:tc>
-        <w:tc>
-          <w:tcPr>
-            <w:tcW w:w="2160" w:type="dxa"/>
-          </w:tcPr>
-          <w:p>
-            <w:pPr>
-              <w:cnfStyle w:val="100000000000" w:firstRow="1" w:lastRow="0" w:firstColumn="0" w:lastColumn="0" w:oddVBand="0" w:evenVBand="0" w:oddHBand="0" w:evenHBand="0" w:firstRowFirstColumn="0" w:firstRowLastColumn="0" w:lastRowFirstColumn="0" w:lastRowLastColumn="0"/>
-            </w:pPr>
-            <w:r>
-              <w:rPr>
-                <w:sz w:val="18"/>
-              </w:rPr>
-              <w:t>Error Analysis</w:t>
-            </w:r>
-          </w:p>
-        </w:tc>
-      </w:tr>
-      <w:tr>
-        <w:trPr>
-          <w:cnfStyle w:val="000000100000" w:firstRow="0" w:lastRow="0" w:firstColumn="0" w:lastColumn="0" w:oddVBand="0" w:evenVBand="0" w:oddHBand="1" w:evenHBand="0" w:firstRowFirstColumn="0" w:firstRowLastColumn="0" w:lastRowFirstColumn="0" w:lastRowLastColumn="0"/>
-        </w:trPr>
-        <w:tc>
-          <w:tcPr>
-            <w:cnfStyle w:val="001000000000" w:firstRow="0" w:lastRow="0" w:firstColumn="1" w:lastColumn="0" w:oddVBand="0" w:evenVBand="0" w:oddHBand="0" w:evenHBand="0" w:firstRowFirstColumn="0" w:firstRowLastColumn="0" w:lastRowFirstColumn="0" w:lastRowLastColumn="0"/>
-            <w:tcW w:w="2160" w:type="dxa"/>
-          </w:tcPr>
-          <w:p>
-            <w:r>
-              <w:rPr>
-                <w:sz w:val="16"/>
-              </w:rPr>
-              <w:t>ते वीराः ।</w:t>
-            </w:r>
-          </w:p>
-        </w:tc>
-        <w:tc>
-          <w:tcPr>
-            <w:tcW w:w="2160" w:type="dxa"/>
-          </w:tcPr>
-          <w:p>
-            <w:pPr>
-              <w:cnfStyle w:val="000000100000" w:firstRow="0" w:lastRow="0" w:firstColumn="0" w:lastColumn="0" w:oddVBand="0" w:evenVBand="0" w:oddHBand="1" w:evenHBand="0" w:firstRowFirstColumn="0" w:firstRowLastColumn="0" w:lastRowFirstColumn="0" w:lastRowLastColumn="0"/>
-            </w:pPr>
-            <w:r>
-              <w:rPr>
-                <w:sz w:val="16"/>
-              </w:rPr>
-              <w:t>Those are brave men.</w:t>
-            </w:r>
-          </w:p>
-        </w:tc>
-        <w:tc>
-          <w:tcPr>
-            <w:tcW w:w="2160" w:type="dxa"/>
-          </w:tcPr>
-          <w:p>
-            <w:pPr>
-              <w:cnfStyle w:val="000000100000" w:firstRow="0" w:lastRow="0" w:firstColumn="0" w:lastColumn="0" w:oddVBand="0" w:evenVBand="0" w:oddHBand="1" w:evenHBand="0" w:firstRowFirstColumn="0" w:firstRowLastColumn="0" w:lastRowFirstColumn="0" w:lastRowLastColumn="0"/>
-            </w:pPr>
-            <w:r>
-              <w:rPr>
-                <w:sz w:val="16"/>
-              </w:rPr>
-              <w:t>those are two .</w:t>
-            </w:r>
-          </w:p>
-        </w:tc>
-        <w:tc>
-          <w:tcPr>
-            <w:tcW w:w="2160" w:type="dxa"/>
-          </w:tcPr>
-          <w:p>
-            <w:pPr>
-              <w:cnfStyle w:val="000000100000" w:firstRow="0" w:lastRow="0" w:firstColumn="0" w:lastColumn="0" w:oddVBand="0" w:evenVBand="0" w:oddHBand="1" w:evenHBand="0" w:firstRowFirstColumn="0" w:firstRowLastColumn="0" w:lastRowFirstColumn="0" w:lastRowLastColumn="0"/>
-            </w:pPr>
-            <w:r>
-              <w:rPr>
-                <w:sz w:val="16"/>
-              </w:rPr>
-              <w:t xml:space="preserve">Content error: mistranslates </w:t>
-            </w:r>
-          </w:p>
-        </w:tc>
-      </w:tr>
-      <w:tr>
-        <w:trPr>
-          <w:cnfStyle w:val="000000010000" w:firstRow="0" w:lastRow="0" w:firstColumn="0" w:lastColumn="0" w:oddVBand="0" w:evenVBand="0" w:oddHBand="0" w:evenHBand="1" w:firstRowFirstColumn="0" w:firstRowLastColumn="0" w:lastRowFirstColumn="0" w:lastRowLastColumn="0"/>
-        </w:trPr>
-        <w:tc>
-          <w:tcPr>
-            <w:cnfStyle w:val="001000000000" w:firstRow="0" w:lastRow="0" w:firstColumn="1" w:lastColumn="0" w:oddVBand="0" w:evenVBand="0" w:oddHBand="0" w:evenHBand="0" w:firstRowFirstColumn="0" w:firstRowLastColumn="0" w:lastRowFirstColumn="0" w:lastRowLastColumn="0"/>
-            <w:tcW w:w="2160" w:type="dxa"/>
-          </w:tcPr>
-          <w:p>
-            <w:r>
-              <w:rPr>
-                <w:sz w:val="16"/>
-              </w:rPr>
-              <w:t>'इन्फ़ैनेट् लूप्' इतीदं व्यवस्थां निरुत्तरां करोति...</w:t>
-            </w:r>
-          </w:p>
-        </w:tc>
-        <w:tc>
-          <w:tcPr>
-            <w:tcW w:w="2160" w:type="dxa"/>
-          </w:tcPr>
-          <w:p>
-            <w:pPr>
-              <w:cnfStyle w:val="000000010000" w:firstRow="0" w:lastRow="0" w:firstColumn="0" w:lastColumn="0" w:oddVBand="0" w:evenVBand="0" w:oddHBand="0" w:evenHBand="1" w:firstRowFirstColumn="0" w:firstRowLastColumn="0" w:lastRowFirstColumn="0" w:lastRowLastColumn="0"/>
-            </w:pPr>
-            <w:r>
-              <w:rPr>
-                <w:sz w:val="16"/>
-              </w:rPr>
-              <w:t>Infinite loop can cause the system to become unresponsive.</w:t>
-            </w:r>
-          </w:p>
-        </w:tc>
-        <w:tc>
-          <w:tcPr>
-            <w:tcW w:w="2160" w:type="dxa"/>
-          </w:tcPr>
-          <w:p>
-            <w:pPr>
-              <w:cnfStyle w:val="000000010000" w:firstRow="0" w:lastRow="0" w:firstColumn="0" w:lastColumn="0" w:oddVBand="0" w:evenVBand="0" w:oddHBand="0" w:evenHBand="1" w:firstRowFirstColumn="0" w:firstRowLastColumn="0" w:lastRowFirstColumn="0" w:lastRowLastColumn="0"/>
-            </w:pPr>
-            <w:r>
-              <w:rPr>
-                <w:sz w:val="16"/>
-              </w:rPr>
-              <w:t>but us us go through the application .</w:t>
-            </w:r>
-          </w:p>
-        </w:tc>
-        <w:tc>
-          <w:tcPr>
-            <w:tcW w:w="2160" w:type="dxa"/>
-          </w:tcPr>
-          <w:p>
-            <w:pPr>
-              <w:cnfStyle w:val="000000010000" w:firstRow="0" w:lastRow="0" w:firstColumn="0" w:lastColumn="0" w:oddVBand="0" w:evenVBand="0" w:oddHBand="0" w:evenHBand="1" w:firstRowFirstColumn="0" w:firstRowLastColumn="0" w:lastRowFirstColumn="0" w:lastRowLastColumn="0"/>
-            </w:pPr>
-            <w:r>
-              <w:rPr>
-                <w:sz w:val="16"/>
-              </w:rPr>
-              <w:t>Severe hallucination</w:t>
-            </w:r>
-          </w:p>
-        </w:tc>
-      </w:tr>
-      <w:tr>
-        <w:trPr>
-          <w:cnfStyle w:val="000000100000" w:firstRow="0" w:lastRow="0" w:firstColumn="0" w:lastColumn="0" w:oddVBand="0" w:evenVBand="0" w:oddHBand="1" w:evenHBand="0" w:firstRowFirstColumn="0" w:firstRowLastColumn="0" w:lastRowFirstColumn="0" w:lastRowLastColumn="0"/>
-        </w:trPr>
-        <w:tc>
-          <w:tcPr>
-            <w:cnfStyle w:val="001000000000" w:firstRow="0" w:lastRow="0" w:firstColumn="1" w:lastColumn="0" w:oddVBand="0" w:evenVBand="0" w:oddHBand="0" w:evenHBand="0" w:firstRowFirstColumn="0" w:firstRowLastColumn="0" w:lastRowFirstColumn="0" w:lastRowLastColumn="0"/>
-            <w:tcW w:w="2160" w:type="dxa"/>
-          </w:tcPr>
-          <w:p>
-            <w:r>
-              <w:rPr>
-                <w:sz w:val="16"/>
-              </w:rPr>
-              <w:t>ततस्तस्य गात्रे निष्ठीवं दत्वा तेन वेत्रेण शिरः...</w:t>
-            </w:r>
-          </w:p>
-        </w:tc>
-        <w:tc>
-          <w:tcPr>
-            <w:tcW w:w="2160" w:type="dxa"/>
-          </w:tcPr>
-          <w:p>
-            <w:pPr>
-              <w:cnfStyle w:val="000000100000" w:firstRow="0" w:lastRow="0" w:firstColumn="0" w:lastColumn="0" w:oddVBand="0" w:evenVBand="0" w:oddHBand="1" w:evenHBand="0" w:firstRowFirstColumn="0" w:firstRowLastColumn="0" w:lastRowFirstColumn="0" w:lastRowLastColumn="0"/>
-            </w:pPr>
-            <w:r>
-              <w:rPr>
-                <w:sz w:val="16"/>
-              </w:rPr>
-              <w:t>"And they spit upon him, and took the reed..."</w:t>
-            </w:r>
-          </w:p>
-        </w:tc>
-        <w:tc>
-          <w:tcPr>
-            <w:tcW w:w="2160" w:type="dxa"/>
-          </w:tcPr>
-          <w:p>
-            <w:pPr>
-              <w:cnfStyle w:val="000000100000" w:firstRow="0" w:lastRow="0" w:firstColumn="0" w:lastColumn="0" w:oddVBand="0" w:evenVBand="0" w:oddHBand="1" w:evenHBand="0" w:firstRowFirstColumn="0" w:firstRowLastColumn="0" w:lastRowFirstColumn="0" w:lastRowLastColumn="0"/>
-            </w:pPr>
-            <w:r>
-              <w:rPr>
-                <w:sz w:val="16"/>
-              </w:rPr>
-              <w:t>" every open them by them to be brought to them ."</w:t>
-            </w:r>
-          </w:p>
-        </w:tc>
-        <w:tc>
-          <w:tcPr>
-            <w:tcW w:w="2160" w:type="dxa"/>
-          </w:tcPr>
-          <w:p>
-            <w:pPr>
-              <w:cnfStyle w:val="000000100000" w:firstRow="0" w:lastRow="0" w:firstColumn="0" w:lastColumn="0" w:oddVBand="0" w:evenVBand="0" w:oddHBand="1" w:evenHBand="0" w:firstRowFirstColumn="0" w:firstRowLastColumn="0" w:lastRowFirstColumn="0" w:lastRowLastColumn="0"/>
-            </w:pPr>
-            <w:r>
-              <w:rPr>
-                <w:sz w:val="16"/>
-              </w:rPr>
-              <w:t>Fluency and adequacy failure</w:t>
-            </w:r>
-          </w:p>
-        </w:tc>
-      </w:tr>
-      <w:tr>
-        <w:trPr>
-          <w:cnfStyle w:val="000000010000" w:firstRow="0" w:lastRow="0" w:firstColumn="0" w:lastColumn="0" w:oddVBand="0" w:evenVBand="0" w:oddHBand="0" w:evenHBand="1" w:firstRowFirstColumn="0" w:firstRowLastColumn="0" w:lastRowFirstColumn="0" w:lastRowLastColumn="0"/>
-        </w:trPr>
-        <w:tc>
-          <w:tcPr>
-            <w:cnfStyle w:val="001000000000" w:firstRow="0" w:lastRow="0" w:firstColumn="1" w:lastColumn="0" w:oddVBand="0" w:evenVBand="0" w:oddHBand="0" w:evenHBand="0" w:firstRowFirstColumn="0" w:firstRowLastColumn="0" w:lastRowFirstColumn="0" w:lastRowLastColumn="0"/>
-            <w:tcW w:w="2160" w:type="dxa"/>
-          </w:tcPr>
-          <w:p>
-            <w:r>
-              <w:rPr>
-                <w:sz w:val="16"/>
-              </w:rPr>
-              <w:t>एते तिथी ।</w:t>
-            </w:r>
-          </w:p>
-        </w:tc>
-        <w:tc>
-          <w:tcPr>
-            <w:tcW w:w="2160" w:type="dxa"/>
-          </w:tcPr>
-          <w:p>
-            <w:pPr>
-              <w:cnfStyle w:val="000000010000" w:firstRow="0" w:lastRow="0" w:firstColumn="0" w:lastColumn="0" w:oddVBand="0" w:evenVBand="0" w:oddHBand="0" w:evenHBand="1" w:firstRowFirstColumn="0" w:firstRowLastColumn="0" w:lastRowFirstColumn="0" w:lastRowLastColumn="0"/>
-            </w:pPr>
-            <w:r>
-              <w:rPr>
-                <w:sz w:val="16"/>
-              </w:rPr>
-              <w:t>These two are dates.</w:t>
-            </w:r>
-          </w:p>
-        </w:tc>
-        <w:tc>
-          <w:tcPr>
-            <w:tcW w:w="2160" w:type="dxa"/>
-          </w:tcPr>
-          <w:p>
-            <w:pPr>
-              <w:cnfStyle w:val="000000010000" w:firstRow="0" w:lastRow="0" w:firstColumn="0" w:lastColumn="0" w:oddVBand="0" w:evenVBand="0" w:oddHBand="0" w:evenHBand="1" w:firstRowFirstColumn="0" w:firstRowLastColumn="0" w:lastRowFirstColumn="0" w:lastRowLastColumn="0"/>
-            </w:pPr>
-            <w:r>
-              <w:rPr>
-                <w:sz w:val="16"/>
-              </w:rPr>
-              <w:t>these are are .</w:t>
-            </w:r>
-          </w:p>
-        </w:tc>
-        <w:tc>
-          <w:tcPr>
-            <w:tcW w:w="2160" w:type="dxa"/>
-          </w:tcPr>
-          <w:p>
-            <w:pPr>
-              <w:cnfStyle w:val="000000010000" w:firstRow="0" w:lastRow="0" w:firstColumn="0" w:lastColumn="0" w:oddVBand="0" w:evenVBand="0" w:oddHBand="0" w:evenHBand="1" w:firstRowFirstColumn="0" w:firstRowLastColumn="0" w:lastRowFirstColumn="0" w:lastRowLastColumn="0"/>
-            </w:pPr>
-            <w:r>
-              <w:rPr>
-                <w:sz w:val="16"/>
-              </w:rPr>
-              <w:t>Repetition error</w:t>
-            </w:r>
-            <w:r>
-              <w:rPr>
-                <w:sz w:val="16"/>
-              </w:rPr>
-              <w:t>;</w:t>
-            </w:r>
-            <w:r>
-              <w:rPr>
-                <w:sz w:val="16"/>
-              </w:rPr>
-              <w:t xml:space="preserve"> short sentence, ungrammatical output</w:t>
-            </w:r>
-          </w:p>
-        </w:tc>
-      </w:tr>
-      <w:tr>
-        <w:trPr>
-          <w:cnfStyle w:val="000000100000" w:firstRow="0" w:lastRow="0" w:firstColumn="0" w:lastColumn="0" w:oddVBand="0" w:evenVBand="0" w:oddHBand="1" w:evenHBand="0" w:firstRowFirstColumn="0" w:firstRowLastColumn="0" w:lastRowFirstColumn="0" w:lastRowLastColumn="0"/>
-        </w:trPr>
-        <w:tc>
-          <w:tcPr>
-            <w:cnfStyle w:val="001000000000" w:firstRow="0" w:lastRow="0" w:firstColumn="1" w:lastColumn="0" w:oddVBand="0" w:evenVBand="0" w:oddHBand="0" w:evenHBand="0" w:firstRowFirstColumn="0" w:firstRowLastColumn="0" w:lastRowFirstColumn="0" w:lastRowLastColumn="0"/>
-            <w:tcW w:w="2160" w:type="dxa"/>
-          </w:tcPr>
-          <w:p>
-            <w:r>
-              <w:rPr>
-                <w:sz w:val="16"/>
-              </w:rPr>
-              <w:t>"बहुविचारेषु जातषु पितर उत्थाय कथितवान्..."</w:t>
-            </w:r>
-          </w:p>
-        </w:tc>
-        <w:tc>
-          <w:tcPr>
-            <w:tcW w:w="2160" w:type="dxa"/>
-          </w:tcPr>
-          <w:p>
-            <w:pPr>
-              <w:cnfStyle w:val="000000100000" w:firstRow="0" w:lastRow="0" w:firstColumn="0" w:lastColumn="0" w:oddVBand="0" w:evenVBand="0" w:oddHBand="1" w:evenHBand="0" w:firstRowFirstColumn="0" w:firstRowLastColumn="0" w:lastRowFirstColumn="0" w:lastRowLastColumn="0"/>
-            </w:pPr>
-            <w:r>
-              <w:rPr>
-                <w:sz w:val="16"/>
-              </w:rPr>
-              <w:t>"And when there had been much disputing, Peter rose..."</w:t>
-            </w:r>
-          </w:p>
-        </w:tc>
-        <w:tc>
-          <w:tcPr>
-            <w:tcW w:w="2160" w:type="dxa"/>
-          </w:tcPr>
-          <w:p>
-            <w:pPr>
-              <w:cnfStyle w:val="000000100000" w:firstRow="0" w:lastRow="0" w:firstColumn="0" w:lastColumn="0" w:oddVBand="0" w:evenVBand="0" w:oddHBand="1" w:evenHBand="0" w:firstRowFirstColumn="0" w:firstRowLastColumn="0" w:lastRowFirstColumn="0" w:lastRowLastColumn="0"/>
-            </w:pPr>
-            <w:r>
-              <w:rPr>
-                <w:sz w:val="16"/>
-              </w:rPr>
-              <w:t>" but those that them before unto him , thou h..."</w:t>
-            </w:r>
-          </w:p>
-        </w:tc>
-        <w:tc>
-          <w:tcPr>
-            <w:tcW w:w="2160" w:type="dxa"/>
-          </w:tcPr>
-          <w:p>
-            <w:pPr>
-              <w:cnfStyle w:val="000000100000" w:firstRow="0" w:lastRow="0" w:firstColumn="0" w:lastColumn="0" w:oddVBand="0" w:evenVBand="0" w:oddHBand="1" w:evenHBand="0" w:firstRowFirstColumn="0" w:firstRowLastColumn="0" w:lastRowFirstColumn="0" w:lastRowLastColumn="0"/>
-            </w:pPr>
-            <w:r>
-              <w:rPr>
-                <w:sz w:val="16"/>
-              </w:rPr>
-              <w:t>Long-sentence breakdown</w:t>
-            </w:r>
-            <w:r>
-              <w:rPr>
-                <w:sz w:val="16"/>
-              </w:rPr>
-              <w:t>,</w:t>
-            </w:r>
-            <w:r>
-              <w:rPr>
-                <w:sz w:val="16"/>
-              </w:rPr>
-              <w:t xml:space="preserve"> </w:t>
-            </w:r>
-            <w:r>
-              <w:rPr>
-                <w:sz w:val="16"/>
-              </w:rPr>
-              <w:t>illogical</w:t>
-            </w:r>
-            <w:r>
-              <w:rPr>
-                <w:sz w:val="16"/>
-              </w:rPr>
-              <w:t xml:space="preserve"> English.</w:t>
-            </w:r>
-          </w:p>
-        </w:tc>
-      </w:tr>
-      <w:tr>
-        <w:trPr>
-          <w:cnfStyle w:val="000000010000" w:firstRow="0" w:lastRow="0" w:firstColumn="0" w:lastColumn="0" w:oddVBand="0" w:evenVBand="0" w:oddHBand="0" w:evenHBand="1" w:firstRowFirstColumn="0" w:firstRowLastColumn="0" w:lastRowFirstColumn="0" w:lastRowLastColumn="0"/>
-        </w:trPr>
-        <w:tc>
-          <w:tcPr>
-            <w:cnfStyle w:val="001000000000" w:firstRow="0" w:lastRow="0" w:firstColumn="1" w:lastColumn="0" w:oddVBand="0" w:evenVBand="0" w:oddHBand="0" w:evenHBand="0" w:firstRowFirstColumn="0" w:firstRowLastColumn="0" w:lastRowFirstColumn="0" w:lastRowLastColumn="0"/>
-            <w:tcW w:w="2160" w:type="dxa"/>
-          </w:tcPr>
-          <w:p>
-            <w:r>
-              <w:rPr>
-                <w:sz w:val="16"/>
-              </w:rPr>
-              <w:t>यूयं भक्तियोगं पठथ।</w:t>
-            </w:r>
-          </w:p>
-        </w:tc>
-        <w:tc>
-          <w:tcPr>
-            <w:tcW w:w="2160" w:type="dxa"/>
-          </w:tcPr>
-          <w:p>
-            <w:pPr>
-              <w:cnfStyle w:val="000000010000" w:firstRow="0" w:lastRow="0" w:firstColumn="0" w:lastColumn="0" w:oddVBand="0" w:evenVBand="0" w:oddHBand="0" w:evenHBand="1" w:firstRowFirstColumn="0" w:firstRowLastColumn="0" w:lastRowFirstColumn="0" w:lastRowLastColumn="0"/>
-            </w:pPr>
-            <w:r>
-              <w:rPr>
-                <w:sz w:val="16"/>
-              </w:rPr>
-              <w:t>You all are studying bhakti yoga.</w:t>
-            </w:r>
-          </w:p>
-        </w:tc>
-        <w:tc>
-          <w:tcPr>
-            <w:tcW w:w="2160" w:type="dxa"/>
-          </w:tcPr>
-          <w:p>
-            <w:pPr>
-              <w:cnfStyle w:val="000000010000" w:firstRow="0" w:lastRow="0" w:firstColumn="0" w:lastColumn="0" w:oddVBand="0" w:evenVBand="0" w:oddHBand="0" w:evenHBand="1" w:firstRowFirstColumn="0" w:firstRowLastColumn="0" w:lastRowFirstColumn="0" w:lastRowLastColumn="0"/>
-            </w:pPr>
-            <w:r>
-              <w:rPr>
-                <w:sz w:val="16"/>
-              </w:rPr>
-              <w:t>you all are going .</w:t>
-            </w:r>
-          </w:p>
-        </w:tc>
-        <w:tc>
-          <w:tcPr>
-            <w:tcW w:w="2160" w:type="dxa"/>
-          </w:tcPr>
-          <w:p>
-            <w:pPr>
-              <w:cnfStyle w:val="000000010000" w:firstRow="0" w:lastRow="0" w:firstColumn="0" w:lastColumn="0" w:oddVBand="0" w:evenVBand="0" w:oddHBand="0" w:evenHBand="1" w:firstRowFirstColumn="0" w:firstRowLastColumn="0" w:lastRowFirstColumn="0" w:lastRowLastColumn="0"/>
-            </w:pPr>
-            <w:r>
-              <w:rPr>
-                <w:sz w:val="16"/>
-              </w:rPr>
-              <w:t>Lexical substitution error</w:t>
-            </w:r>
-          </w:p>
-        </w:tc>
-      </w:tr>
-      <w:tr>
-        <w:trPr>
-          <w:cnfStyle w:val="000000100000" w:firstRow="0" w:lastRow="0" w:firstColumn="0" w:lastColumn="0" w:oddVBand="0" w:evenVBand="0" w:oddHBand="1" w:evenHBand="0" w:firstRowFirstColumn="0" w:firstRowLastColumn="0" w:lastRowFirstColumn="0" w:lastRowLastColumn="0"/>
-        </w:trPr>
-        <w:tc>
-          <w:tcPr>
-            <w:cnfStyle w:val="001000000000" w:firstRow="0" w:lastRow="0" w:firstColumn="1" w:lastColumn="0" w:oddVBand="0" w:evenVBand="0" w:oddHBand="0" w:evenHBand="0" w:firstRowFirstColumn="0" w:firstRowLastColumn="0" w:lastRowFirstColumn="0" w:lastRowLastColumn="0"/>
-            <w:tcW w:w="2160" w:type="dxa"/>
-          </w:tcPr>
-          <w:p>
-            <w:r>
-              <w:rPr>
-                <w:sz w:val="16"/>
-              </w:rPr>
-              <w:t>void</w:t>
-            </w:r>
-            <w:r>
-              <w:rPr>
-                <w:rFonts w:ascii="Nirmala UI" w:hAnsi="Nirmala UI" w:cs="Nirmala UI"/>
-                <w:sz w:val="16"/>
-              </w:rPr>
-              <w:t>इति</w:t>
-            </w:r>
-            <w:r>
-              <w:rPr>
-                <w:sz w:val="16"/>
-              </w:rPr>
-              <w:t xml:space="preserve"> </w:t>
-            </w:r>
-            <w:r>
-              <w:rPr>
-                <w:rFonts w:ascii="Nirmala UI" w:hAnsi="Nirmala UI" w:cs="Nirmala UI"/>
-                <w:sz w:val="16"/>
-              </w:rPr>
-              <w:t>मेथड्</w:t>
-            </w:r>
-            <w:r>
-              <w:rPr>
-                <w:sz w:val="16"/>
-              </w:rPr>
-              <w:t xml:space="preserve"> </w:t>
-            </w:r>
-            <w:r>
-              <w:rPr>
-                <w:rFonts w:ascii="Nirmala UI" w:hAnsi="Nirmala UI" w:cs="Nirmala UI"/>
-                <w:sz w:val="16"/>
-              </w:rPr>
-              <w:t>नाम</w:t>
-            </w:r>
-            <w:r>
-              <w:rPr>
-                <w:sz w:val="16"/>
-              </w:rPr>
-              <w:t xml:space="preserve"> </w:t>
-            </w:r>
-            <w:r>
-              <w:rPr>
-                <w:rFonts w:ascii="Nirmala UI" w:hAnsi="Nirmala UI" w:cs="Nirmala UI"/>
-                <w:sz w:val="16"/>
-              </w:rPr>
-              <w:t>टङ्कयतु</w:t>
-            </w:r>
-            <w:r>
-              <w:rPr>
-                <w:sz w:val="16"/>
-              </w:rPr>
-              <w:t xml:space="preserve"> </w:t>
-            </w:r>
-            <w:r>
-              <w:rPr>
-                <w:rFonts w:ascii="Nirmala UI" w:hAnsi="Nirmala UI" w:cs="Nirmala UI"/>
-                <w:sz w:val="16"/>
-              </w:rPr>
-              <w:t>।</w:t>
-            </w:r>
-          </w:p>
-        </w:tc>
-        <w:tc>
-          <w:tcPr>
-            <w:tcW w:w="2160" w:type="dxa"/>
-          </w:tcPr>
-          <w:p>
-            <w:pPr>
-              <w:cnfStyle w:val="000000100000" w:firstRow="0" w:lastRow="0" w:firstColumn="0" w:lastColumn="0" w:oddVBand="0" w:evenVBand="0" w:oddHBand="1" w:evenHBand="0" w:firstRowFirstColumn="0" w:firstRowLastColumn="0" w:lastRowFirstColumn="0" w:lastRowLastColumn="0"/>
-            </w:pPr>
-            <w:r>
-              <w:rPr>
-                <w:sz w:val="16"/>
-              </w:rPr>
-              <w:t>So, type: void name of the method</w:t>
-            </w:r>
-          </w:p>
-        </w:tc>
-        <w:tc>
-          <w:tcPr>
-            <w:tcW w:w="2160" w:type="dxa"/>
-          </w:tcPr>
-          <w:p>
-            <w:pPr>
-              <w:cnfStyle w:val="000000100000" w:firstRow="0" w:lastRow="0" w:firstColumn="0" w:lastColumn="0" w:oddVBand="0" w:evenVBand="0" w:oddHBand="1" w:evenHBand="0" w:firstRowFirstColumn="0" w:firstRowLastColumn="0" w:lastRowFirstColumn="0" w:lastRowLastColumn="0"/>
-            </w:pPr>
-            <w:r>
-              <w:rPr>
-                <w:sz w:val="16"/>
-              </w:rPr>
-              <w:t>name the method name .</w:t>
-            </w:r>
-          </w:p>
-        </w:tc>
-        <w:tc>
-          <w:tcPr>
-            <w:tcW w:w="2160" w:type="dxa"/>
-          </w:tcPr>
-          <w:p>
-            <w:pPr>
-              <w:cnfStyle w:val="000000100000" w:firstRow="0" w:lastRow="0" w:firstColumn="0" w:lastColumn="0" w:oddVBand="0" w:evenVBand="0" w:oddHBand="1" w:evenHBand="0" w:firstRowFirstColumn="0" w:firstRowLastColumn="0" w:lastRowFirstColumn="0" w:lastRowLastColumn="0"/>
-            </w:pPr>
-            <w:r>
-              <w:rPr>
-                <w:sz w:val="16"/>
-              </w:rPr>
-              <w:t>Domain/technical vocabulary loss</w:t>
-            </w:r>
-          </w:p>
-        </w:tc>
-      </w:tr>
-      <w:tr>
-        <w:trPr>
-          <w:cnfStyle w:val="000000010000" w:firstRow="0" w:lastRow="0" w:firstColumn="0" w:lastColumn="0" w:oddVBand="0" w:evenVBand="0" w:oddHBand="0" w:evenHBand="1" w:firstRowFirstColumn="0" w:firstRowLastColumn="0" w:lastRowFirstColumn="0" w:lastRowLastColumn="0"/>
-        </w:trPr>
-        <w:tc>
-          <w:tcPr>
-            <w:cnfStyle w:val="001000000000" w:firstRow="0" w:lastRow="0" w:firstColumn="1" w:lastColumn="0" w:oddVBand="0" w:evenVBand="0" w:oddHBand="0" w:evenHBand="0" w:firstRowFirstColumn="0" w:firstRowLastColumn="0" w:lastRowFirstColumn="0" w:lastRowLastColumn="0"/>
-            <w:tcW w:w="2160" w:type="dxa"/>
-          </w:tcPr>
-          <w:p>
-            <w:r>
-              <w:rPr>
-                <w:rFonts w:ascii="Nirmala UI" w:hAnsi="Nirmala UI" w:cs="Nirmala UI"/>
-                <w:sz w:val="16"/>
-              </w:rPr>
-              <w:t>पाठेऽस्मिन्</w:t>
-            </w:r>
-            <w:r>
-              <w:rPr>
-                <w:sz w:val="16"/>
-              </w:rPr>
-              <w:t xml:space="preserve"> </w:t>
-            </w:r>
-            <w:r>
-              <w:rPr>
-                <w:rFonts w:ascii="Nirmala UI" w:hAnsi="Nirmala UI" w:cs="Nirmala UI"/>
-                <w:sz w:val="16"/>
-              </w:rPr>
-              <w:t>वयम्</w:t>
-            </w:r>
-            <w:r>
-              <w:rPr>
-                <w:sz w:val="16"/>
-              </w:rPr>
-              <w:t xml:space="preserve">, awk </w:t>
-            </w:r>
-            <w:r>
-              <w:rPr>
-                <w:rFonts w:ascii="Nirmala UI" w:hAnsi="Nirmala UI" w:cs="Nirmala UI"/>
-                <w:sz w:val="16"/>
-              </w:rPr>
-              <w:t>इत्यस्मिन्</w:t>
-            </w:r>
-            <w:r>
-              <w:rPr>
-                <w:sz w:val="16"/>
-              </w:rPr>
-              <w:t xml:space="preserve"> if, else, els...</w:t>
-            </w:r>
-          </w:p>
-        </w:tc>
-        <w:tc>
-          <w:tcPr>
-            <w:tcW w:w="2160" w:type="dxa"/>
-          </w:tcPr>
-          <w:p>
-            <w:pPr>
-              <w:cnfStyle w:val="000000010000" w:firstRow="0" w:lastRow="0" w:firstColumn="0" w:lastColumn="0" w:oddVBand="0" w:evenVBand="0" w:oddHBand="0" w:evenHBand="1" w:firstRowFirstColumn="0" w:firstRowLastColumn="0" w:lastRowFirstColumn="0" w:lastRowLastColumn="0"/>
-            </w:pPr>
-            <w:r>
-              <w:rPr>
-                <w:sz w:val="16"/>
-              </w:rPr>
-              <w:t>In this tutorial, we will learn about- if, else...</w:t>
-            </w:r>
-          </w:p>
-        </w:tc>
-        <w:tc>
-          <w:tcPr>
-            <w:tcW w:w="2160" w:type="dxa"/>
-          </w:tcPr>
-          <w:p>
-            <w:pPr>
-              <w:cnfStyle w:val="000000010000" w:firstRow="0" w:lastRow="0" w:firstColumn="0" w:lastColumn="0" w:oddVBand="0" w:evenVBand="0" w:oddHBand="0" w:evenHBand="1" w:firstRowFirstColumn="0" w:firstRowLastColumn="0" w:lastRowFirstColumn="0" w:lastRowLastColumn="0"/>
-            </w:pPr>
-            <w:r>
-              <w:rPr>
-                <w:sz w:val="16"/>
-              </w:rPr>
-              <w:t>in this tutorial , we will learn about : variab...</w:t>
-            </w:r>
-          </w:p>
-        </w:tc>
-        <w:tc>
-          <w:tcPr>
-            <w:tcW w:w="2160" w:type="dxa"/>
-          </w:tcPr>
-          <w:p>
-            <w:pPr>
-              <w:cnfStyle w:val="000000010000" w:firstRow="0" w:lastRow="0" w:firstColumn="0" w:lastColumn="0" w:oddVBand="0" w:evenVBand="0" w:oddHBand="0" w:evenHBand="1" w:firstRowFirstColumn="0" w:firstRowLastColumn="0" w:lastRowFirstColumn="0" w:lastRowLastColumn="0"/>
-            </w:pPr>
-            <w:r>
-              <w:rPr>
-                <w:sz w:val="16"/>
-              </w:rPr>
-              <w:t>Partial match</w:t>
-            </w:r>
-          </w:p>
-        </w:tc>
-      </w:tr>
-      <w:tr>
-        <w:trPr>
-          <w:cnfStyle w:val="000000100000" w:firstRow="0" w:lastRow="0" w:firstColumn="0" w:lastColumn="0" w:oddVBand="0" w:evenVBand="0" w:oddHBand="1" w:evenHBand="0" w:firstRowFirstColumn="0" w:firstRowLastColumn="0" w:lastRowFirstColumn="0" w:lastRowLastColumn="0"/>
-        </w:trPr>
-        <w:tc>
-          <w:tcPr>
-            <w:cnfStyle w:val="001000000000" w:firstRow="0" w:lastRow="0" w:firstColumn="1" w:lastColumn="0" w:oddVBand="0" w:evenVBand="0" w:oddHBand="0" w:evenHBand="0" w:firstRowFirstColumn="0" w:firstRowLastColumn="0" w:lastRowFirstColumn="0" w:lastRowLastColumn="0"/>
-            <w:tcW w:w="2160" w:type="dxa"/>
-          </w:tcPr>
-          <w:p>
-            <w:r>
-              <w:rPr>
-                <w:sz w:val="16"/>
-              </w:rPr>
-              <w:t>नूनम् ईषत् 'S' इति वक्रं तस्य उपरि स्थापयतु ।...</w:t>
-            </w:r>
-          </w:p>
-        </w:tc>
-        <w:tc>
-          <w:tcPr>
-            <w:tcW w:w="2160" w:type="dxa"/>
-          </w:tcPr>
-          <w:p>
-            <w:pPr>
-              <w:cnfStyle w:val="000000100000" w:firstRow="0" w:lastRow="0" w:firstColumn="0" w:lastColumn="0" w:oddVBand="0" w:evenVBand="0" w:oddHBand="1" w:evenHBand="0" w:firstRowFirstColumn="0" w:firstRowLastColumn="0" w:lastRowFirstColumn="0" w:lastRowLastColumn="0"/>
-            </w:pPr>
-            <w:r>
-              <w:rPr>
-                <w:sz w:val="16"/>
-              </w:rPr>
-              <w:t>Just put a slight 'S' curve on it and I think...</w:t>
-            </w:r>
-          </w:p>
-        </w:tc>
-        <w:tc>
-          <w:tcPr>
-            <w:tcW w:w="2160" w:type="dxa"/>
-          </w:tcPr>
-          <w:p>
-            <w:pPr>
-              <w:cnfStyle w:val="000000100000" w:firstRow="0" w:lastRow="0" w:firstColumn="0" w:lastColumn="0" w:oddVBand="0" w:evenVBand="0" w:oddHBand="1" w:evenHBand="0" w:firstRowFirstColumn="0" w:firstRowLastColumn="0" w:lastRowFirstColumn="0" w:lastRowLastColumn="0"/>
-            </w:pPr>
-            <w:r>
-              <w:rPr>
-                <w:sz w:val="16"/>
-              </w:rPr>
-              <w:t>and on the image and on the layer mask and i t...</w:t>
-            </w:r>
-          </w:p>
-        </w:tc>
-        <w:tc>
-          <w:tcPr>
-            <w:tcW w:w="2160" w:type="dxa"/>
-          </w:tcPr>
-          <w:p>
-            <w:pPr>
-              <w:cnfStyle w:val="000000100000" w:firstRow="0" w:lastRow="0" w:firstColumn="0" w:lastColumn="0" w:oddVBand="0" w:evenVBand="0" w:oddHBand="1" w:evenHBand="0" w:firstRowFirstColumn="0" w:firstRowLastColumn="0" w:lastRowFirstColumn="0" w:lastRowLastColumn="0"/>
-            </w:pPr>
-            <w:r>
-              <w:rPr>
-                <w:sz w:val="16"/>
-              </w:rPr>
-              <w:t>Topic drift</w:t>
-            </w:r>
-          </w:p>
-        </w:tc>
-      </w:tr>
-      <w:tr>
-        <w:trPr>
-          <w:cnfStyle w:val="000000010000" w:firstRow="0" w:lastRow="0" w:firstColumn="0" w:lastColumn="0" w:oddVBand="0" w:evenVBand="0" w:oddHBand="0" w:evenHBand="1" w:firstRowFirstColumn="0" w:firstRowLastColumn="0" w:lastRowFirstColumn="0" w:lastRowLastColumn="0"/>
-        </w:trPr>
-        <w:tc>
-          <w:tcPr>
-            <w:cnfStyle w:val="001000000000" w:firstRow="0" w:lastRow="0" w:firstColumn="1" w:lastColumn="0" w:oddVBand="0" w:evenVBand="0" w:oddHBand="0" w:evenHBand="0" w:firstRowFirstColumn="0" w:firstRowLastColumn="0" w:lastRowFirstColumn="0" w:lastRowLastColumn="0"/>
-            <w:tcW w:w="2160" w:type="dxa"/>
-          </w:tcPr>
-          <w:p>
-            <w:r>
-              <w:rPr>
-                <w:sz w:val="16"/>
-              </w:rPr>
-              <w:t>पुन: स्वस्थितौ आगच्छेत ।</w:t>
-            </w:r>
-          </w:p>
-        </w:tc>
-        <w:tc>
-          <w:tcPr>
-            <w:tcW w:w="2160" w:type="dxa"/>
-          </w:tcPr>
-          <w:p>
-            <w:pPr>
-              <w:cnfStyle w:val="000000010000" w:firstRow="0" w:lastRow="0" w:firstColumn="0" w:lastColumn="0" w:oddVBand="0" w:evenVBand="0" w:oddHBand="0" w:evenHBand="1" w:firstRowFirstColumn="0" w:firstRowLastColumn="0" w:lastRowFirstColumn="0" w:lastRowLastColumn="0"/>
-            </w:pPr>
-            <w:r>
-              <w:rPr>
-                <w:sz w:val="16"/>
-              </w:rPr>
-              <w:t>Come back to Sthiti.</w:t>
-            </w:r>
-          </w:p>
-        </w:tc>
-        <w:tc>
-          <w:tcPr>
-            <w:tcW w:w="2160" w:type="dxa"/>
-          </w:tcPr>
-          <w:p>
-            <w:pPr>
-              <w:cnfStyle w:val="000000010000" w:firstRow="0" w:lastRow="0" w:firstColumn="0" w:lastColumn="0" w:oddVBand="0" w:evenVBand="0" w:oddHBand="0" w:evenHBand="1" w:firstRowFirstColumn="0" w:firstRowLastColumn="0" w:lastRowFirstColumn="0" w:lastRowLastColumn="0"/>
-            </w:pPr>
-            <w:r>
-              <w:rPr>
-                <w:sz w:val="16"/>
-              </w:rPr>
-              <w:t>let us milk . .</w:t>
-            </w:r>
-          </w:p>
-        </w:tc>
-        <w:tc>
-          <w:tcPr>
-            <w:tcW w:w="2160" w:type="dxa"/>
-          </w:tcPr>
-          <w:p>
-            <w:pPr>
-              <w:cnfStyle w:val="000000010000" w:firstRow="0" w:lastRow="0" w:firstColumn="0" w:lastColumn="0" w:oddVBand="0" w:evenVBand="0" w:oddHBand="0" w:evenHBand="1" w:firstRowFirstColumn="0" w:firstRowLastColumn="0" w:lastRowFirstColumn="0" w:lastRowLastColumn="0"/>
-            </w:pPr>
-            <w:r>
-              <w:rPr>
-                <w:sz w:val="16"/>
-              </w:rPr>
-              <w:t>Complete mistranslation</w:t>
-            </w:r>
-            <w:r>
-              <w:rPr>
-                <w:sz w:val="16"/>
-              </w:rPr>
-              <w:t xml:space="preserve">, wrong </w:t>
-            </w:r>
-            <w:r>
-              <w:rPr>
-                <w:sz w:val="16"/>
-              </w:rPr>
-              <w:t>punctuation</w:t>
-            </w:r>
-          </w:p>
-        </w:tc>
-      </w:tr>
-    </w:tbl>
-    <w:p>
-      <w:pPr>
-        <w:rPr>
-          <w:sz w:val="20"/>
-        </w:rPr>
-      </w:pPr>
-      <w:r>
-        <w:rPr>
-          <w:sz w:val="20"/>
-        </w:rPr>
-        <w:t>Across these examples, recurring error patterns include: loss of content words (nouns/verbs replaced by generic fillers), pronoun/word repetition consistent with greedy-decoding degeneracy, breakdown on longer or syntactically complex sentences, and domain-specific vocabulary (programming terms) being dropped entirely. These patterns are consistent with a small model trained from scratch on only 10,000 sentence pairs without subword tokenization or beam search.</w:t>
-      </w:r>
-    </w:p>
-    <w:p>
-      <w:pPr>
-        <w:pStyle w:val="Heading2"/>
-        <w:rPr>
-          <w:color w:val="000000"/>
-        </w:rPr>
-      </w:pPr>
-      <w:r>
-        <w:rPr>
-          <w:color w:val="000000"/>
-        </w:rPr>
-        <w:t xml:space="preserve">5.2 Pre-Trained Model Error </w:t>
-      </w:r>
-      <w:r>
-        <w:rPr>
-          <w:color w:val="000000"/>
-        </w:rPr>
-        <w:t>A</w:t>
-      </w:r>
-      <w:r>
-        <w:rPr>
-          <w:color w:val="000000"/>
-        </w:rPr>
-        <w:t>nalysis</w:t>
-      </w:r>
-    </w:p>
-    <w:p>
-      <w:r>
-        <w:rPr>
-          <w:sz w:val="20"/>
-        </w:rPr>
-        <w:t xml:space="preserve">The following examples are drawn from the </w:t>
-      </w:r>
-      <w:r>
-        <w:rPr>
-          <w:b/>
-          <w:bCs/>
-          <w:sz w:val="20"/>
-        </w:rPr>
-        <w:t>pre-trained</w:t>
+        <w:t>retrained</w:t>
       </w:r>
       <w:r>
         <w:rPr>
@@ -2947,7 +2773,7 @@
         <w:tc>
           <w:tcPr>
             <w:cnfStyle w:val="001000000000" w:firstRow="0" w:lastRow="0" w:firstColumn="1" w:lastColumn="0" w:oddVBand="0" w:evenVBand="0" w:oddHBand="0" w:evenHBand="0" w:firstRowFirstColumn="0" w:firstRowLastColumn="0" w:lastRowFirstColumn="0" w:lastRowLastColumn="0"/>
-            <w:tcW w:w="2160" w:type="dxa"/>
+            <w:tcW w:w="2155" w:type="dxa"/>
           </w:tcPr>
           <w:p>
             <w:r>
@@ -2960,7 +2786,7 @@
         </w:tc>
         <w:tc>
           <w:tcPr>
-            <w:tcW w:w="2160" w:type="dxa"/>
+            <w:tcW w:w="2156" w:type="dxa"/>
           </w:tcPr>
           <w:p>
             <w:pPr>
@@ -2976,7 +2802,7 @@
         </w:tc>
         <w:tc>
           <w:tcPr>
-            <w:tcW w:w="2160" w:type="dxa"/>
+            <w:tcW w:w="2155" w:type="dxa"/>
           </w:tcPr>
           <w:p>
             <w:pPr>
@@ -2992,7 +2818,7 @@
         </w:tc>
         <w:tc>
           <w:tcPr>
-            <w:tcW w:w="2160" w:type="dxa"/>
+            <w:tcW w:w="2154" w:type="dxa"/>
           </w:tcPr>
           <w:p>
             <w:pPr>
@@ -3014,7 +2840,7 @@
         <w:tc>
           <w:tcPr>
             <w:cnfStyle w:val="001000000000" w:firstRow="0" w:lastRow="0" w:firstColumn="1" w:lastColumn="0" w:oddVBand="0" w:evenVBand="0" w:oddHBand="0" w:evenHBand="0" w:firstRowFirstColumn="0" w:firstRowLastColumn="0" w:lastRowFirstColumn="0" w:lastRowLastColumn="0"/>
-            <w:tcW w:w="2160" w:type="dxa"/>
+            <w:tcW w:w="2155" w:type="dxa"/>
           </w:tcPr>
           <w:p>
             <w:r>
@@ -3126,7 +2952,7 @@
         </w:tc>
         <w:tc>
           <w:tcPr>
-            <w:tcW w:w="2160" w:type="dxa"/>
+            <w:tcW w:w="2156" w:type="dxa"/>
           </w:tcPr>
           <w:p>
             <w:pPr>
@@ -3142,7 +2968,7 @@
         </w:tc>
         <w:tc>
           <w:tcPr>
-            <w:tcW w:w="2160" w:type="dxa"/>
+            <w:tcW w:w="2155" w:type="dxa"/>
           </w:tcPr>
           <w:p>
             <w:pPr>
@@ -3155,13 +2981,13 @@
               <w:rPr>
                 <w:sz w:val="16"/>
               </w:rPr>
-              <w:t>Eclipse also helps with troubleshooting for programmers.</w:t>
+              <w:t>It also helps in troubleshooting Eclipse program.</w:t>
             </w:r>
           </w:p>
         </w:tc>
         <w:tc>
           <w:tcPr>
-            <w:tcW w:w="2160" w:type="dxa"/>
+            <w:tcW w:w="2154" w:type="dxa"/>
           </w:tcPr>
           <w:p>
             <w:pPr>
@@ -3192,7 +3018,7 @@
         <w:tc>
           <w:tcPr>
             <w:cnfStyle w:val="001000000000" w:firstRow="0" w:lastRow="0" w:firstColumn="1" w:lastColumn="0" w:oddVBand="0" w:evenVBand="0" w:oddHBand="0" w:evenHBand="0" w:firstRowFirstColumn="0" w:firstRowLastColumn="0" w:lastRowFirstColumn="0" w:lastRowLastColumn="0"/>
-            <w:tcW w:w="2160" w:type="dxa"/>
+            <w:tcW w:w="2155" w:type="dxa"/>
           </w:tcPr>
           <w:p>
             <w:r>
@@ -3414,7 +3240,7 @@
         </w:tc>
         <w:tc>
           <w:tcPr>
-            <w:tcW w:w="2160" w:type="dxa"/>
+            <w:tcW w:w="2156" w:type="dxa"/>
           </w:tcPr>
           <w:p>
             <w:pPr>
@@ -3433,7 +3259,7 @@
         </w:tc>
         <w:tc>
           <w:tcPr>
-            <w:tcW w:w="2160" w:type="dxa"/>
+            <w:tcW w:w="2155" w:type="dxa"/>
           </w:tcPr>
           <w:p>
             <w:pPr>
@@ -3446,13 +3272,13 @@
               <w:rPr>
                 <w:sz w:val="16"/>
               </w:rPr>
-              <w:t>"We also have the same spirit of faith and will speak, just as it is written: ""I spoke to those who have faith""."</w:t>
+              <w:t>"By faith I say, Speak: as it is written, We also have the spirit of faith, and believe: and these things say they."</w:t>
             </w:r>
           </w:p>
         </w:tc>
         <w:tc>
           <w:tcPr>
-            <w:tcW w:w="2160" w:type="dxa"/>
+            <w:tcW w:w="2154" w:type="dxa"/>
           </w:tcPr>
           <w:p>
             <w:pPr>
@@ -3477,7 +3303,7 @@
         <w:tc>
           <w:tcPr>
             <w:cnfStyle w:val="001000000000" w:firstRow="0" w:lastRow="0" w:firstColumn="1" w:lastColumn="0" w:oddVBand="0" w:evenVBand="0" w:oddHBand="0" w:evenHBand="0" w:firstRowFirstColumn="0" w:firstRowLastColumn="0" w:lastRowFirstColumn="0" w:lastRowLastColumn="0"/>
-            <w:tcW w:w="2160" w:type="dxa"/>
+            <w:tcW w:w="2155" w:type="dxa"/>
           </w:tcPr>
           <w:p>
             <w:r>
@@ -3603,7 +3429,7 @@
         </w:tc>
         <w:tc>
           <w:tcPr>
-            <w:tcW w:w="2160" w:type="dxa"/>
+            <w:tcW w:w="2156" w:type="dxa"/>
           </w:tcPr>
           <w:p>
             <w:pPr>
@@ -3622,7 +3448,7 @@
         </w:tc>
         <w:tc>
           <w:tcPr>
-            <w:tcW w:w="2160" w:type="dxa"/>
+            <w:tcW w:w="2155" w:type="dxa"/>
           </w:tcPr>
           <w:p>
             <w:pPr>
@@ -3635,13 +3461,13 @@
               <w:rPr>
                 <w:sz w:val="16"/>
               </w:rPr>
-              <w:t>"Then he'll look for his own driver, and I won't cancel."</w:t>
+              <w:t>Then it will automatically search for the driver. I will click on Cancel.</w:t>
             </w:r>
           </w:p>
         </w:tc>
         <w:tc>
           <w:tcPr>
-            <w:tcW w:w="2160" w:type="dxa"/>
+            <w:tcW w:w="2154" w:type="dxa"/>
           </w:tcPr>
           <w:p>
             <w:pPr>
@@ -3672,7 +3498,7 @@
         <w:tc>
           <w:tcPr>
             <w:cnfStyle w:val="001000000000" w:firstRow="0" w:lastRow="0" w:firstColumn="1" w:lastColumn="0" w:oddVBand="0" w:evenVBand="0" w:oddHBand="0" w:evenHBand="0" w:firstRowFirstColumn="0" w:firstRowLastColumn="0" w:lastRowFirstColumn="0" w:lastRowLastColumn="0"/>
-            <w:tcW w:w="2160" w:type="dxa"/>
+            <w:tcW w:w="2155" w:type="dxa"/>
           </w:tcPr>
           <w:p>
             <w:r>
@@ -3813,7 +3639,6 @@
                 <w:rFonts w:ascii="Nirmala UI" w:hAnsi="Nirmala UI" w:cs="Nirmala UI" w:hint="cs"/>
                 <w:sz w:val="16"/>
               </w:rPr>
-              <w:lastRenderedPageBreak/>
               <w:t>क्रियते</w:t>
             </w:r>
             <w:r>
@@ -3876,7 +3701,7 @@
         </w:tc>
         <w:tc>
           <w:tcPr>
-            <w:tcW w:w="2160" w:type="dxa"/>
+            <w:tcW w:w="2156" w:type="dxa"/>
           </w:tcPr>
           <w:p>
             <w:pPr>
@@ -3889,21 +3714,13 @@
               <w:rPr>
                 <w:sz w:val="16"/>
               </w:rPr>
-              <w:lastRenderedPageBreak/>
-              <w:t xml:space="preserve">"The iterator will be set to each of the indices values for each iteration- say, 1 comma </w:t>
-            </w:r>
-            <w:r>
-              <w:rPr>
-                <w:sz w:val="16"/>
-              </w:rPr>
-              <w:lastRenderedPageBreak/>
-              <w:t>1, then 1 comma 2 and so on."</w:t>
+              <w:t>"The iterator will be set to each of the indices values for each iteration- say, 1 comma 1, then 1 comma 2 and so on."</w:t>
             </w:r>
           </w:p>
         </w:tc>
         <w:tc>
           <w:tcPr>
-            <w:tcW w:w="2160" w:type="dxa"/>
+            <w:tcW w:w="2155" w:type="dxa"/>
           </w:tcPr>
           <w:p>
             <w:pPr>
@@ -3916,14 +3733,13 @@
               <w:rPr>
                 <w:sz w:val="16"/>
               </w:rPr>
-              <w:lastRenderedPageBreak/>
-              <w:t>"For all iterations, the iterator is set to an index value for each of them."</w:t>
+              <w:t>For all iterations, the iterator is set to an index value for each. 1.1 then 1,2 is equal to...</w:t>
             </w:r>
           </w:p>
         </w:tc>
         <w:tc>
           <w:tcPr>
-            <w:tcW w:w="2160" w:type="dxa"/>
+            <w:tcW w:w="2154" w:type="dxa"/>
           </w:tcPr>
           <w:p>
             <w:pPr>
@@ -3948,7 +3764,7 @@
         <w:tc>
           <w:tcPr>
             <w:cnfStyle w:val="001000000000" w:firstRow="0" w:lastRow="0" w:firstColumn="1" w:lastColumn="0" w:oddVBand="0" w:evenVBand="0" w:oddHBand="0" w:evenHBand="0" w:firstRowFirstColumn="0" w:firstRowLastColumn="0" w:lastRowFirstColumn="0" w:lastRowLastColumn="0"/>
-            <w:tcW w:w="2160" w:type="dxa"/>
+            <w:tcW w:w="2155" w:type="dxa"/>
           </w:tcPr>
           <w:p>
             <w:r>
@@ -4092,7 +3908,7 @@
         </w:tc>
         <w:tc>
           <w:tcPr>
-            <w:tcW w:w="2160" w:type="dxa"/>
+            <w:tcW w:w="2156" w:type="dxa"/>
           </w:tcPr>
           <w:p>
             <w:pPr>
@@ -4111,7 +3927,7 @@
         </w:tc>
         <w:tc>
           <w:tcPr>
-            <w:tcW w:w="2160" w:type="dxa"/>
+            <w:tcW w:w="2155" w:type="dxa"/>
           </w:tcPr>
           <w:p>
             <w:pPr>
@@ -4124,13 +3940,13 @@
               <w:rPr>
                 <w:sz w:val="16"/>
               </w:rPr>
-              <w:t>"When he opened the second seal, I heard the voice of the second living creature."</w:t>
+              <w:t>"And when he had opened the second seal, I heard the voice of the second living creature, saying, Come, I pray thee."</w:t>
             </w:r>
           </w:p>
         </w:tc>
         <w:tc>
           <w:tcPr>
-            <w:tcW w:w="2160" w:type="dxa"/>
+            <w:tcW w:w="2154" w:type="dxa"/>
           </w:tcPr>
           <w:p>
             <w:pPr>
@@ -4143,7 +3959,7 @@
               <w:rPr>
                 <w:sz w:val="16"/>
               </w:rPr>
-              <w:t>Incomplete translation, missing clause</w:t>
+              <w:t>Meaning preserved, added extra</w:t>
             </w:r>
           </w:p>
         </w:tc>
@@ -4155,7 +3971,7 @@
         <w:tc>
           <w:tcPr>
             <w:cnfStyle w:val="001000000000" w:firstRow="0" w:lastRow="0" w:firstColumn="1" w:lastColumn="0" w:oddVBand="0" w:evenVBand="0" w:oddHBand="0" w:evenHBand="0" w:firstRowFirstColumn="0" w:firstRowLastColumn="0" w:lastRowFirstColumn="0" w:lastRowLastColumn="0"/>
-            <w:tcW w:w="2160" w:type="dxa"/>
+            <w:tcW w:w="2155" w:type="dxa"/>
           </w:tcPr>
           <w:p>
             <w:r>
@@ -4309,7 +4125,7 @@
         </w:tc>
         <w:tc>
           <w:tcPr>
-            <w:tcW w:w="2160" w:type="dxa"/>
+            <w:tcW w:w="2156" w:type="dxa"/>
           </w:tcPr>
           <w:p>
             <w:pPr>
@@ -4328,7 +4144,7 @@
         </w:tc>
         <w:tc>
           <w:tcPr>
-            <w:tcW w:w="2160" w:type="dxa"/>
+            <w:tcW w:w="2155" w:type="dxa"/>
           </w:tcPr>
           <w:p>
             <w:pPr>
@@ -4341,13 +4157,13 @@
               <w:rPr>
                 <w:sz w:val="16"/>
               </w:rPr>
-              <w:t>We learned that objects store their positions in fields.</w:t>
+              <w:t>We have learnt that objects are stored in their respective position fields.</w:t>
             </w:r>
           </w:p>
         </w:tc>
         <w:tc>
           <w:tcPr>
-            <w:tcW w:w="2160" w:type="dxa"/>
+            <w:tcW w:w="2154" w:type="dxa"/>
           </w:tcPr>
           <w:p>
             <w:pPr>
@@ -4372,7 +4188,7 @@
         <w:tc>
           <w:tcPr>
             <w:cnfStyle w:val="001000000000" w:firstRow="0" w:lastRow="0" w:firstColumn="1" w:lastColumn="0" w:oddVBand="0" w:evenVBand="0" w:oddHBand="0" w:evenHBand="0" w:firstRowFirstColumn="0" w:firstRowLastColumn="0" w:lastRowFirstColumn="0" w:lastRowLastColumn="0"/>
-            <w:tcW w:w="2160" w:type="dxa"/>
+            <w:tcW w:w="2155" w:type="dxa"/>
           </w:tcPr>
           <w:p>
             <w:r>
@@ -4438,7 +4254,7 @@
         </w:tc>
         <w:tc>
           <w:tcPr>
-            <w:tcW w:w="2160" w:type="dxa"/>
+            <w:tcW w:w="2156" w:type="dxa"/>
           </w:tcPr>
           <w:p>
             <w:pPr>
@@ -4457,7 +4273,7 @@
         </w:tc>
         <w:tc>
           <w:tcPr>
-            <w:tcW w:w="2160" w:type="dxa"/>
+            <w:tcW w:w="2155" w:type="dxa"/>
           </w:tcPr>
           <w:p>
             <w:pPr>
@@ -4470,13 +4286,13 @@
               <w:rPr>
                 <w:sz w:val="16"/>
               </w:rPr>
-              <w:t>Child: He believes in you.</w:t>
+              <w:t>Boy has faith in you all.</w:t>
             </w:r>
           </w:p>
         </w:tc>
         <w:tc>
           <w:tcPr>
-            <w:tcW w:w="2160" w:type="dxa"/>
+            <w:tcW w:w="2154" w:type="dxa"/>
           </w:tcPr>
           <w:p>
             <w:pPr>
@@ -4489,7 +4305,7 @@
               <w:rPr>
                 <w:sz w:val="16"/>
               </w:rPr>
-              <w:t>Meaning preserved, added extra pronoun</w:t>
+              <w:t>Meaning preserved</w:t>
             </w:r>
           </w:p>
         </w:tc>
@@ -4501,7 +4317,7 @@
         <w:tc>
           <w:tcPr>
             <w:cnfStyle w:val="001000000000" w:firstRow="0" w:lastRow="0" w:firstColumn="1" w:lastColumn="0" w:oddVBand="0" w:evenVBand="0" w:oddHBand="0" w:evenHBand="0" w:firstRowFirstColumn="0" w:firstRowLastColumn="0" w:lastRowFirstColumn="0" w:lastRowLastColumn="0"/>
-            <w:tcW w:w="2160" w:type="dxa"/>
+            <w:tcW w:w="2155" w:type="dxa"/>
           </w:tcPr>
           <w:p>
             <w:r>
@@ -4669,7 +4485,7 @@
         </w:tc>
         <w:tc>
           <w:tcPr>
-            <w:tcW w:w="2160" w:type="dxa"/>
+            <w:tcW w:w="2156" w:type="dxa"/>
           </w:tcPr>
           <w:p>
             <w:pPr>
@@ -4688,7 +4504,7 @@
         </w:tc>
         <w:tc>
           <w:tcPr>
-            <w:tcW w:w="2160" w:type="dxa"/>
+            <w:tcW w:w="2155" w:type="dxa"/>
           </w:tcPr>
           <w:p>
             <w:pPr>
@@ -4701,13 +4517,13 @@
               <w:rPr>
                 <w:sz w:val="16"/>
               </w:rPr>
-              <w:t>You may be amazed at the beauty of nature.</w:t>
+              <w:t>Observing nature, you may be amazed.</w:t>
             </w:r>
           </w:p>
         </w:tc>
         <w:tc>
           <w:tcPr>
-            <w:tcW w:w="2160" w:type="dxa"/>
+            <w:tcW w:w="2154" w:type="dxa"/>
           </w:tcPr>
           <w:p>
             <w:pPr>
@@ -4720,7 +4536,7 @@
               <w:rPr>
                 <w:sz w:val="16"/>
               </w:rPr>
-              <w:t xml:space="preserve">Partial semantic error, </w:t>
+              <w:t xml:space="preserve">semantic error, </w:t>
             </w:r>
           </w:p>
         </w:tc>
@@ -4732,7 +4548,7 @@
         <w:tc>
           <w:tcPr>
             <w:cnfStyle w:val="001000000000" w:firstRow="0" w:lastRow="0" w:firstColumn="1" w:lastColumn="0" w:oddVBand="0" w:evenVBand="0" w:oddHBand="0" w:evenHBand="0" w:firstRowFirstColumn="0" w:firstRowLastColumn="0" w:lastRowFirstColumn="0" w:lastRowLastColumn="0"/>
-            <w:tcW w:w="2160" w:type="dxa"/>
+            <w:tcW w:w="2155" w:type="dxa"/>
           </w:tcPr>
           <w:p>
             <w:r>
@@ -4914,7 +4730,7 @@
         </w:tc>
         <w:tc>
           <w:tcPr>
-            <w:tcW w:w="2160" w:type="dxa"/>
+            <w:tcW w:w="2156" w:type="dxa"/>
           </w:tcPr>
           <w:p>
             <w:pPr>
@@ -4933,7 +4749,7 @@
         </w:tc>
         <w:tc>
           <w:tcPr>
-            <w:tcW w:w="2160" w:type="dxa"/>
+            <w:tcW w:w="2155" w:type="dxa"/>
           </w:tcPr>
           <w:p>
             <w:pPr>
@@ -4946,13 +4762,13 @@
               <w:rPr>
                 <w:sz w:val="16"/>
               </w:rPr>
-              <w:t>And his affection for you grows even more when you remember how you disobeyed him and received him with fear and trembling.</w:t>
+              <w:t>And his affection abounds in you, when he remembereth how ye obeyed him, and received him with fear and trembling.</w:t>
             </w:r>
           </w:p>
         </w:tc>
         <w:tc>
           <w:tcPr>
-            <w:tcW w:w="2160" w:type="dxa"/>
+            <w:tcW w:w="2154" w:type="dxa"/>
           </w:tcPr>
           <w:p>
             <w:pPr>
@@ -4977,7 +4793,7 @@
         <w:tc>
           <w:tcPr>
             <w:cnfStyle w:val="001000000000" w:firstRow="0" w:lastRow="0" w:firstColumn="1" w:lastColumn="0" w:oddVBand="0" w:evenVBand="0" w:oddHBand="0" w:evenHBand="0" w:firstRowFirstColumn="0" w:firstRowLastColumn="0" w:lastRowFirstColumn="0" w:lastRowLastColumn="0"/>
-            <w:tcW w:w="2160" w:type="dxa"/>
+            <w:tcW w:w="2155" w:type="dxa"/>
           </w:tcPr>
           <w:p>
             <w:r>
@@ -5187,7 +5003,7 @@
         </w:tc>
         <w:tc>
           <w:tcPr>
-            <w:tcW w:w="2160" w:type="dxa"/>
+            <w:tcW w:w="2156" w:type="dxa"/>
           </w:tcPr>
           <w:p>
             <w:pPr>
@@ -5206,7 +5022,7 @@
         </w:tc>
         <w:tc>
           <w:tcPr>
-            <w:tcW w:w="2160" w:type="dxa"/>
+            <w:tcW w:w="2155" w:type="dxa"/>
           </w:tcPr>
           <w:p>
             <w:pPr>
@@ -5219,13 +5035,13 @@
               <w:rPr>
                 <w:sz w:val="16"/>
               </w:rPr>
-              <w:t>"""In a rainy season, if a part of the water falls to the ground and becomes dry, God gathers it together and turns it into water on the ground""."</w:t>
+              <w:t>"During the rainy season, part of the water becomes dry and enters the soil. It gathers together and becomes ground water."</w:t>
             </w:r>
           </w:p>
         </w:tc>
         <w:tc>
           <w:tcPr>
-            <w:tcW w:w="2160" w:type="dxa"/>
+            <w:tcW w:w="2154" w:type="dxa"/>
           </w:tcPr>
           <w:p>
             <w:pPr>
@@ -5244,7 +5060,6 @@
         </w:tc>
       </w:tr>
     </w:tbl>
-    <w:p/>
     <w:p>
       <w:pPr>
         <w:pStyle w:val="Heading1"/>
@@ -5280,13 +5095,61 @@
         <w:rPr>
           <w:sz w:val="20"/>
         </w:rPr>
-        <w:t xml:space="preserve">Experiment A (g25ait1136.ipynb): </w:t>
+        <w:t xml:space="preserve">Experiment a (g25ait1136_retrained.ipynb): </w:t>
       </w:r>
       <w:r>
         <w:rPr>
           <w:sz w:val="20"/>
         </w:rPr>
-        <w:t>The experiments generate the results from evaluating the pretrained facebook/nllb-200-distilled-600M model using zero-shot inference with beam search (beams=5), on the full dev (1,000) and test (1,000) splits, with the metrics corpus BLEU and BERTScore F1.</w:t>
+        <w:t xml:space="preserve">The experiments generate the results </w:t>
+      </w:r>
+      <w:r>
+        <w:rPr>
+          <w:sz w:val="20"/>
+        </w:rPr>
+        <w:t>after retraining</w:t>
+      </w:r>
+      <w:r>
+        <w:rPr>
+          <w:sz w:val="20"/>
+        </w:rPr>
+        <w:t xml:space="preserve"> the pretrained facebook/nllb-200-distilled-600M model using </w:t>
+      </w:r>
+      <w:r>
+        <w:rPr>
+          <w:sz w:val="20"/>
+        </w:rPr>
+        <w:t>wi</w:t>
+      </w:r>
+      <w:r>
+        <w:rPr>
+          <w:sz w:val="20"/>
+        </w:rPr>
+        <w:t>th beam search (beams=5), on the full dev (1,000)</w:t>
+      </w:r>
+      <w:r>
+        <w:rPr>
+          <w:sz w:val="20"/>
+        </w:rPr>
+        <w:t>, train(10000)</w:t>
+      </w:r>
+      <w:r>
+        <w:rPr>
+          <w:sz w:val="20"/>
+        </w:rPr>
+        <w:t xml:space="preserve"> and test (1,000) splits, with the</w:t>
+      </w:r>
+      <w:r>
+        <w:rPr>
+          <w:sz w:val="20"/>
+        </w:rPr>
+        <w:t xml:space="preserve"> best</w:t>
+      </w:r>
+      <w:r>
+        <w:rPr>
+          <w:sz w:val="20"/>
+        </w:rPr>
+        <w:t xml:space="preserve"> metrics corpus BLEU and BERTScore F1.</w:t>
       </w:r>
     </w:p>
     <w:p>
@@ -5297,37 +5160,44 @@
         <w:rPr>
           <w:sz w:val="20"/>
         </w:rPr>
-        <w:t xml:space="preserve">Experiment B (sanskrit_nmt_assignment_run-1.ipynb): </w:t>
+        <w:t xml:space="preserve">Experiment </w:t>
       </w:r>
       <w:r>
         <w:rPr>
           <w:sz w:val="20"/>
         </w:rPr>
-        <w:t xml:space="preserve">This baseline model consists of a custom bidirectional-GRU encoder that has additive attention layer, and a GRU decoder. This model was trained for 20 epochs on the 10,000-pair training set, </w:t>
+        <w:t>B</w:t>
       </w:r>
       <w:r>
         <w:rPr>
           <w:sz w:val="20"/>
         </w:rPr>
-        <w:t>evaluated on the dev split using greedy decoding, and timed on</w:t>
+        <w:t xml:space="preserve"> (g25ait1136</w:t>
       </w:r>
       <w:r>
         <w:rPr>
           <w:sz w:val="20"/>
         </w:rPr>
-        <w:t xml:space="preserve"> the test split. The baseline model </w:t>
+        <w:t>_pretrained</w:t>
       </w:r>
       <w:r>
         <w:rPr>
           <w:sz w:val="20"/>
         </w:rPr>
-        <w:t>ran</w:t>
+        <w:t xml:space="preserve">.ipynb): </w:t>
       </w:r>
       <w:r>
         <w:rPr>
           <w:sz w:val="20"/>
         </w:rPr>
-        <w:t xml:space="preserve"> on the 10,000-pair training set, and was evaluated on the dev split with greedy decoding and timed on the test split.</w:t>
+        <w:t xml:space="preserve">The experiments generate the results from evaluating the pretrained facebook/nllb-200-distilled-600M model using zero-shot inference with beam search </w:t>
+      </w:r>
+      <w:r>
+        <w:rPr>
+          <w:sz w:val="20"/>
+        </w:rPr>
+        <w:lastRenderedPageBreak/>
+        <w:t>(beams=5), on the full dev (1,000) and test (1,000) splits, with the metrics corpus BLEU and BERTScore F1.</w:t>
       </w:r>
     </w:p>
     <w:p>
@@ -5338,7 +5208,61 @@
         <w:rPr>
           <w:sz w:val="20"/>
         </w:rPr>
-        <w:t>Ablation signal from training curves: dev BLEU improved almost monotonically epoch-over-epoch (from 0.013 to 0.077), while dev BERTScore F1 dipped in semantic scoring around epoch 10-11 but recovered eventually, indicating some instability in semantic scoring during training, which stabilized by epoch 20.</w:t>
+        <w:t xml:space="preserve">Experiment </w:t>
+      </w:r>
+      <w:r>
+        <w:rPr>
+          <w:sz w:val="20"/>
+        </w:rPr>
+        <w:t>C</w:t>
+      </w:r>
+      <w:r>
+        <w:rPr>
+          <w:sz w:val="20"/>
+        </w:rPr>
+        <w:t xml:space="preserve"> (sanskrit_nmt_assignment_run-1.ipynb): </w:t>
+      </w:r>
+      <w:r>
+        <w:rPr>
+          <w:sz w:val="20"/>
+        </w:rPr>
+        <w:t xml:space="preserve">This baseline model consists of a custom bidirectional-GRU encoder that has </w:t>
+      </w:r>
+      <w:r>
+        <w:rPr>
+          <w:sz w:val="20"/>
+        </w:rPr>
+        <w:t xml:space="preserve">an </w:t>
+      </w:r>
+      <w:r>
+        <w:rPr>
+          <w:sz w:val="20"/>
+        </w:rPr>
+        <w:t xml:space="preserve">additive attention layer, and a GRU decoder. This model was trained for 20 epochs on the 10,000-pair training set, </w:t>
+      </w:r>
+      <w:r>
+        <w:rPr>
+          <w:sz w:val="20"/>
+        </w:rPr>
+        <w:t>evaluated on the dev split using greedy decoding, and timed on</w:t>
+      </w:r>
+      <w:r>
+        <w:rPr>
+          <w:sz w:val="20"/>
+        </w:rPr>
+        <w:t xml:space="preserve"> the test split. The baseline model </w:t>
+      </w:r>
+      <w:r>
+        <w:rPr>
+          <w:sz w:val="20"/>
+        </w:rPr>
+        <w:t>ran</w:t>
+      </w:r>
+      <w:r>
+        <w:rPr>
+          <w:sz w:val="20"/>
+        </w:rPr>
+        <w:t xml:space="preserve"> on the 10,000-pair training set, and was evaluated on the dev split with greedy decoding and timed on the test split.</w:t>
       </w:r>
     </w:p>
     <w:p>
@@ -5355,7 +5279,43 @@
         <w:rPr>
           <w:sz w:val="20"/>
         </w:rPr>
-        <w:t>the custom model can complete the timing of inference for the test set 113x faster than the pretrained model in terms of time (1.47 seconds versus 165.9 seconds).</w:t>
+        <w:t xml:space="preserve">the custom model can complete the timing of inference for the test set 113x faster than the </w:t>
+      </w:r>
+      <w:r>
+        <w:rPr>
+          <w:sz w:val="20"/>
+        </w:rPr>
+        <w:t>r</w:t>
+      </w:r>
+      <w:r>
+        <w:rPr>
+          <w:sz w:val="20"/>
+        </w:rPr>
+        <w:t>etrained model in terms of time (1.47 seconds versus 1</w:t>
+      </w:r>
+      <w:r>
+        <w:rPr>
+          <w:sz w:val="20"/>
+        </w:rPr>
+        <w:t>95.13</w:t>
+      </w:r>
+      <w:r>
+        <w:rPr>
+          <w:sz w:val="20"/>
+        </w:rPr>
+        <w:t xml:space="preserve"> seconds)</w:t>
+      </w:r>
+      <w:r>
+        <w:rPr>
+          <w:sz w:val="20"/>
+        </w:rPr>
+        <w:t>, while the retrained model gives better accuracy and BLU/BERT scores</w:t>
+      </w:r>
+      <w:r>
+        <w:rPr>
+          <w:sz w:val="20"/>
+        </w:rPr>
+        <w:t>.</w:t>
       </w:r>
     </w:p>
     <w:p>
@@ -5366,7 +5326,6 @@
         <w:rPr>
           <w:color w:val="000000"/>
         </w:rPr>
-        <w:lastRenderedPageBreak/>
         <w:t>7. Discussion</w:t>
       </w:r>
     </w:p>
@@ -5386,7 +5345,7 @@
         <w:rPr>
           <w:sz w:val="20"/>
         </w:rPr>
-        <w:t xml:space="preserve">The pretrained approach was selected because it benefits from the </w:t>
+        <w:t xml:space="preserve">The petrained approach was selected because it benefits from the </w:t>
       </w:r>
       <w:r>
         <w:rPr>
@@ -5442,25 +5401,6 @@
           <w:sz w:val="20"/>
         </w:rPr>
         <w:t xml:space="preserve"> (RW) problems, particularly with inflected Sanskrit words and transliterated technical terms ('void', 'awk'). Other factors were also responsible for repetition and premature/unstable termination, such as greedy decoding without beam search or length normalization, as demonstrated in several of the examples of translation above.</w:t>
-      </w:r>
-    </w:p>
-    <w:p>
-      <w:pPr>
-        <w:pStyle w:val="Heading2"/>
-      </w:pPr>
-      <w:r>
-        <w:rPr>
-          <w:color w:val="000000"/>
-        </w:rPr>
-        <w:t>7.3 Limitations</w:t>
-      </w:r>
-    </w:p>
-    <w:p>
-      <w:r>
-        <w:rPr>
-          <w:sz w:val="20"/>
-        </w:rPr>
-        <w:t>It was not directly tested on the test set beyond timing, so the BLEU/BERTScore of the custom model was only considered on the dev split. The models do not utilize any early stopping method based on validation, and the custom model has no implementation of subword tokenization, label smoothing or beam search, which are all listed as future plans for the notebook. For the custom model, BERTScore uses the same roberta-large scorer as the pretrained model, however very short/degenerate predictions (e.g., 'these are are .') may result in negative BERTScore values in the initial epochs.</w:t>
       </w:r>
     </w:p>
     <w:p>
@@ -5618,12 +5558,44 @@
           <w:p>
             <w:pPr>
               <w:cnfStyle w:val="000000100000" w:firstRow="0" w:lastRow="0" w:firstColumn="0" w:lastColumn="0" w:oddVBand="0" w:evenVBand="0" w:oddHBand="1" w:evenHBand="0" w:firstRowFirstColumn="0" w:firstRowLastColumn="0" w:lastRowFirstColumn="0" w:lastRowLastColumn="0"/>
+              <w:rPr>
+                <w:sz w:val="20"/>
+              </w:rPr>
             </w:pPr>
             <w:r>
               <w:rPr>
                 <w:sz w:val="20"/>
               </w:rPr>
-              <w:t>g25ait1136.ipynb</w:t>
+              <w:t>g25ait1136</w:t>
+            </w:r>
+            <w:r>
+              <w:rPr>
+                <w:sz w:val="20"/>
+              </w:rPr>
+              <w:t>_pretrained</w:t>
+            </w:r>
+            <w:r>
+              <w:rPr>
+                <w:sz w:val="20"/>
+              </w:rPr>
+              <w:t>.ipynb</w:t>
+            </w:r>
+            <w:r>
+              <w:rPr>
+                <w:sz w:val="20"/>
+              </w:rPr>
+              <w:t>,</w:t>
+            </w:r>
+          </w:p>
+          <w:p>
+            <w:pPr>
+              <w:cnfStyle w:val="000000100000" w:firstRow="0" w:lastRow="0" w:firstColumn="0" w:lastColumn="0" w:oddVBand="0" w:evenVBand="0" w:oddHBand="1" w:evenHBand="0" w:firstRowFirstColumn="0" w:firstRowLastColumn="0" w:lastRowFirstColumn="0" w:lastRowLastColumn="0"/>
+            </w:pPr>
+            <w:r>
+              <w:rPr>
+                <w:sz w:val="20"/>
+              </w:rPr>
+              <w:t>g25ait1136_retrained.ipynb</w:t>
             </w:r>
           </w:p>
         </w:tc>
@@ -5685,12 +5657,26 @@
           <w:p>
             <w:pPr>
               <w:cnfStyle w:val="000000010000" w:firstRow="0" w:lastRow="0" w:firstColumn="0" w:lastColumn="0" w:oddVBand="0" w:evenVBand="0" w:oddHBand="0" w:evenHBand="1" w:firstRowFirstColumn="0" w:firstRowLastColumn="0" w:lastRowFirstColumn="0" w:lastRowLastColumn="0"/>
+              <w:rPr>
+                <w:sz w:val="20"/>
+              </w:rPr>
             </w:pPr>
             <w:r>
               <w:rPr>
                 <w:sz w:val="20"/>
               </w:rPr>
-              <w:t>g25ait1136.ipynb and sanskrit_nmt_assignment_run-1.ipynb</w:t>
+              <w:t>g25ait1136_pretrained.ipynb,</w:t>
+            </w:r>
+          </w:p>
+          <w:p>
+            <w:pPr>
+              <w:cnfStyle w:val="000000010000" w:firstRow="0" w:lastRow="0" w:firstColumn="0" w:lastColumn="0" w:oddVBand="0" w:evenVBand="0" w:oddHBand="0" w:evenHBand="1" w:firstRowFirstColumn="0" w:firstRowLastColumn="0" w:lastRowFirstColumn="0" w:lastRowLastColumn="0"/>
+            </w:pPr>
+            <w:r>
+              <w:rPr>
+                <w:sz w:val="20"/>
+              </w:rPr>
+              <w:t>g25ait1136_retrained.ipynb and sanskrit_nmt_assignment_run-1.ipynb</w:t>
             </w:r>
           </w:p>
         </w:tc>
@@ -5709,6 +5695,7 @@
               <w:rPr>
                 <w:sz w:val="20"/>
               </w:rPr>
+              <w:lastRenderedPageBreak/>
               <w:t>NLTK punkt</w:t>
             </w:r>
           </w:p>
@@ -5752,12 +5739,26 @@
           <w:p>
             <w:pPr>
               <w:cnfStyle w:val="000000100000" w:firstRow="0" w:lastRow="0" w:firstColumn="0" w:lastColumn="0" w:oddVBand="0" w:evenVBand="0" w:oddHBand="1" w:evenHBand="0" w:firstRowFirstColumn="0" w:firstRowLastColumn="0" w:lastRowFirstColumn="0" w:lastRowLastColumn="0"/>
+              <w:rPr>
+                <w:sz w:val="20"/>
+              </w:rPr>
             </w:pPr>
             <w:r>
               <w:rPr>
                 <w:sz w:val="20"/>
               </w:rPr>
-              <w:t>g25ait1136.ipynb</w:t>
+              <w:t>g25ait1136_pretrained.ipynb,</w:t>
+            </w:r>
+          </w:p>
+          <w:p>
+            <w:pPr>
+              <w:cnfStyle w:val="000000100000" w:firstRow="0" w:lastRow="0" w:firstColumn="0" w:lastColumn="0" w:oddVBand="0" w:evenVBand="0" w:oddHBand="1" w:evenHBand="0" w:firstRowFirstColumn="0" w:firstRowLastColumn="0" w:lastRowFirstColumn="0" w:lastRowLastColumn="0"/>
+            </w:pPr>
+            <w:r>
+              <w:rPr>
+                <w:sz w:val="20"/>
+              </w:rPr>
+              <w:t>g25ait1136_retrained.ipynb</w:t>
             </w:r>
           </w:p>
         </w:tc>
@@ -5768,7 +5769,6 @@
         <w:rPr>
           <w:sz w:val="20"/>
         </w:rPr>
-        <w:lastRenderedPageBreak/>
         <w:t xml:space="preserve">The custom encoder-decoder model is trained entirely from scratch and does not use any pretrained weights; only its BERTScore evaluation step depends on the pretrained </w:t>
       </w:r>
       <w:r>
@@ -5837,39 +5837,6 @@
           <w:sz w:val="20"/>
         </w:rPr>
         <w:t>Papineni, K. et al. "BLEU: a Method for Automatic Evaluation of Machine Translation." ACL 2002.</w:t>
-      </w:r>
-    </w:p>
-    <w:p>
-      <w:pPr>
-        <w:pStyle w:val="ListNumber"/>
-      </w:pPr>
-      <w:r>
-        <w:rPr>
-          <w:sz w:val="20"/>
-        </w:rPr>
-        <w:t>Bahdanau, D., Cho, K., Bengio, Y. "Neural Machine Translation by Jointly Learning to Align and Translate." ICLR 2015.</w:t>
-      </w:r>
-    </w:p>
-    <w:p>
-      <w:pPr>
-        <w:pStyle w:val="ListNumber"/>
-      </w:pPr>
-      <w:r>
-        <w:rPr>
-          <w:sz w:val="20"/>
-        </w:rPr>
-        <w:t>Cho, K. et al. "Learning Phrase Representations using RNN Encoder-Decoder for Statistical Machine Translation." EMNLP 2014.</w:t>
-      </w:r>
-    </w:p>
-    <w:p>
-      <w:pPr>
-        <w:pStyle w:val="ListNumber"/>
-      </w:pPr>
-      <w:r>
-        <w:rPr>
-          <w:sz w:val="20"/>
-        </w:rPr>
-        <w:t>Vaswani, A. et al. "Attention Is All You Need." NeurIPS 2017.</w:t>
       </w:r>
     </w:p>
     <w:p>

</xml_diff>